<commit_message>
somehow last push my components had lost their values, and only displayed their Kicad value, but I fixed that now
</commit_message>
<xml_diff>
--- a/PIM_V01/PIM_V01_BRINGUP.docx
+++ b/PIM_V01/PIM_V01_BRINGUP.docx
@@ -17445,27 +17445,1504 @@
         <w:rPr>
           <w:lang w:eastAsia="en-NZ"/>
         </w:rPr>
-        <w:t>PSU 4V5/1mA: C78</w:t>
-      </w:r>
+        <w:t xml:space="preserve">PSU 4V5/1mA: C78: </w:t>
+      </w:r>
+      <w:r>
+        <w:rPr>
+          <w:lang w:eastAsia="en-NZ"/>
+        </w:rPr>
+        <w:t>4.495V</w:t>
+      </w:r>
+      <w:r>
+        <w:rPr>
+          <w:lang w:eastAsia="en-NZ"/>
+        </w:rPr>
+        <w:t>, C79: 3.304</w:t>
+      </w:r>
+      <w:r>
+        <w:rPr>
+          <w:lang w:eastAsia="en-NZ"/>
+        </w:rPr>
+        <w:t>V</w:t>
+      </w:r>
+    </w:p>
+    <w:p>
+      <w:pPr>
+        <w:rPr>
+          <w:lang w:eastAsia="en-NZ"/>
+        </w:rPr>
+      </w:pPr>
+    </w:p>
+    <w:p>
+      <w:pPr>
+        <w:rPr>
+          <w:lang w:eastAsia="en-NZ"/>
+        </w:rPr>
+      </w:pPr>
+    </w:p>
+    <w:p>
+      <w:pPr>
+        <w:rPr>
+          <w:b/>
+          <w:bCs/>
+          <w:lang w:eastAsia="en-NZ"/>
+        </w:rPr>
+      </w:pPr>
+      <w:r>
+        <w:rPr>
+          <w:b/>
+          <w:bCs/>
+          <w:lang w:eastAsia="en-NZ"/>
+        </w:rPr>
+        <w:t>09-SEP-26. KP. RL</w:t>
+      </w:r>
+    </w:p>
+    <w:p>
+      <w:pPr>
+        <w:rPr>
+          <w:lang w:eastAsia="en-NZ"/>
+        </w:rPr>
+      </w:pPr>
+      <w:r>
+        <w:rPr>
+          <w:lang w:eastAsia="en-NZ"/>
+        </w:rPr>
+        <w:t xml:space="preserve">Populated all MCU region. </w:t>
+      </w:r>
+    </w:p>
+    <w:p>
+      <w:pPr>
+        <w:rPr>
+          <w:lang w:eastAsia="en-NZ"/>
+        </w:rPr>
+      </w:pPr>
+      <w:r>
+        <w:rPr>
+          <w:lang w:eastAsia="en-NZ"/>
+        </w:rPr>
+        <w:t>Results:</w:t>
+      </w:r>
+    </w:p>
+    <w:p>
+      <w:pPr>
+        <w:pStyle w:val="ListParagraph"/>
+        <w:numPr>
+          <w:ilvl w:val="0"/>
+          <w:numId w:val="3"/>
+        </w:numPr>
+        <w:rPr>
+          <w:lang w:eastAsia="en-NZ"/>
+        </w:rPr>
+      </w:pPr>
+      <w:r>
+        <w:rPr>
+          <w:lang w:eastAsia="en-NZ"/>
+        </w:rPr>
+        <w:t xml:space="preserve">Powered w PSU into power-only USB-C 5V//16mA draw. </w:t>
+      </w:r>
+    </w:p>
+    <w:p>
+      <w:pPr>
+        <w:pStyle w:val="ListParagraph"/>
+        <w:numPr>
+          <w:ilvl w:val="0"/>
+          <w:numId w:val="3"/>
+        </w:numPr>
+        <w:rPr>
+          <w:lang w:eastAsia="en-NZ"/>
+        </w:rPr>
+      </w:pPr>
+      <w:r>
+        <w:rPr>
+          <w:lang w:eastAsia="en-NZ"/>
+        </w:rPr>
+        <w:t>C96 (1V2): 1.009V</w:t>
+      </w:r>
+    </w:p>
+    <w:p>
+      <w:pPr>
+        <w:pStyle w:val="ListParagraph"/>
+        <w:numPr>
+          <w:ilvl w:val="0"/>
+          <w:numId w:val="3"/>
+        </w:numPr>
+        <w:rPr>
+          <w:lang w:eastAsia="en-NZ"/>
+        </w:rPr>
+      </w:pPr>
+      <w:r>
+        <w:rPr>
+          <w:lang w:eastAsia="en-NZ"/>
+        </w:rPr>
+        <w:t>3V3_MCU: 3.301V</w:t>
+      </w:r>
+    </w:p>
+    <w:p>
+      <w:pPr>
+        <w:pStyle w:val="ListParagraph"/>
+        <w:numPr>
+          <w:ilvl w:val="0"/>
+          <w:numId w:val="3"/>
+        </w:numPr>
+        <w:rPr>
+          <w:lang w:eastAsia="en-NZ"/>
+        </w:rPr>
+      </w:pPr>
+      <w:r>
+        <w:rPr>
+          <w:lang w:eastAsia="en-NZ"/>
+        </w:rPr>
+        <w:t>C98 (VREF+): 3.305V</w:t>
+      </w:r>
+    </w:p>
+    <w:p>
+      <w:pPr>
+        <w:rPr>
+          <w:lang w:eastAsia="en-NZ"/>
+        </w:rPr>
+      </w:pPr>
+    </w:p>
+    <w:p>
+      <w:pPr>
+        <w:rPr>
+          <w:lang w:eastAsia="en-NZ"/>
+        </w:rPr>
+      </w:pPr>
+      <w:proofErr w:type="spellStart"/>
+      <w:r>
+        <w:rPr>
+          <w:lang w:eastAsia="en-NZ"/>
+        </w:rPr>
+        <w:t>Obv</w:t>
+      </w:r>
+      <w:proofErr w:type="spellEnd"/>
+      <w:r>
+        <w:rPr>
+          <w:lang w:eastAsia="en-NZ"/>
+        </w:rPr>
+        <w:t xml:space="preserve"> </w:t>
+      </w:r>
+      <w:proofErr w:type="spellStart"/>
+      <w:r>
+        <w:rPr>
+          <w:lang w:eastAsia="en-NZ"/>
+        </w:rPr>
+        <w:t>usb</w:t>
+      </w:r>
+      <w:proofErr w:type="spellEnd"/>
+      <w:r>
+        <w:rPr>
+          <w:lang w:eastAsia="en-NZ"/>
+        </w:rPr>
+        <w:t xml:space="preserve"> device not showing up on laptop </w:t>
+      </w:r>
+      <w:proofErr w:type="spellStart"/>
+      <w:r>
+        <w:rPr>
+          <w:lang w:eastAsia="en-NZ"/>
+        </w:rPr>
+        <w:t>bc</w:t>
+      </w:r>
+      <w:proofErr w:type="spellEnd"/>
+      <w:r>
+        <w:rPr>
+          <w:lang w:eastAsia="en-NZ"/>
+        </w:rPr>
+        <w:t xml:space="preserve"> </w:t>
+      </w:r>
+      <w:proofErr w:type="spellStart"/>
+      <w:r>
+        <w:rPr>
+          <w:lang w:eastAsia="en-NZ"/>
+        </w:rPr>
+        <w:t>dfu</w:t>
+      </w:r>
+      <w:proofErr w:type="spellEnd"/>
+      <w:r>
+        <w:rPr>
+          <w:lang w:eastAsia="en-NZ"/>
+        </w:rPr>
+        <w:t xml:space="preserve"> </w:t>
+      </w:r>
+      <w:proofErr w:type="spellStart"/>
       <w:proofErr w:type="gramStart"/>
       <w:r>
         <w:rPr>
           <w:lang w:eastAsia="en-NZ"/>
         </w:rPr>
-        <w:t>: ,</w:t>
-      </w:r>
+        <w:t>cant</w:t>
+      </w:r>
+      <w:proofErr w:type="spellEnd"/>
       <w:proofErr w:type="gramEnd"/>
       <w:r>
         <w:rPr>
           <w:lang w:eastAsia="en-NZ"/>
         </w:rPr>
-        <w:t xml:space="preserve"> C79: 4.495V, 3.304</w:t>
-      </w:r>
-      <w:r>
-        <w:rPr>
-          <w:lang w:eastAsia="en-NZ"/>
-        </w:rPr>
-        <w:t>V</w:t>
+        <w:t xml:space="preserve"> start w external </w:t>
+      </w:r>
+      <w:proofErr w:type="spellStart"/>
+      <w:r>
+        <w:rPr>
+          <w:lang w:eastAsia="en-NZ"/>
+        </w:rPr>
+        <w:t>xtal</w:t>
+      </w:r>
+      <w:proofErr w:type="spellEnd"/>
+    </w:p>
+    <w:p>
+      <w:pPr>
+        <w:rPr>
+          <w:lang w:eastAsia="en-NZ"/>
+        </w:rPr>
+      </w:pPr>
+    </w:p>
+    <w:p>
+      <w:pPr>
+        <w:rPr>
+          <w:b/>
+          <w:bCs/>
+          <w:lang w:eastAsia="en-NZ"/>
+        </w:rPr>
+      </w:pPr>
+      <w:r>
+        <w:rPr>
+          <w:b/>
+          <w:bCs/>
+          <w:lang w:eastAsia="en-NZ"/>
+        </w:rPr>
+        <w:t>10-SEP-26. KP. UNI</w:t>
+      </w:r>
+    </w:p>
+    <w:p>
+      <w:pPr>
+        <w:rPr>
+          <w:lang w:eastAsia="en-NZ"/>
+        </w:rPr>
+      </w:pPr>
+      <w:r>
+        <w:rPr>
+          <w:lang w:eastAsia="en-NZ"/>
+        </w:rPr>
+        <w:t>Swapping short to have 3v3_mcu just from 12v input. Then try flashing w SWD…</w:t>
+      </w:r>
+      <w:r>
+        <w:rPr>
+          <w:lang w:eastAsia="en-NZ"/>
+        </w:rPr>
+        <w:t xml:space="preserve"> still didn’t work.</w:t>
+      </w:r>
+    </w:p>
+    <w:p>
+      <w:pPr>
+        <w:rPr>
+          <w:lang w:eastAsia="en-NZ"/>
+        </w:rPr>
+      </w:pPr>
+    </w:p>
+    <w:p>
+      <w:pPr>
+        <w:rPr>
+          <w:b/>
+          <w:bCs/>
+          <w:lang w:eastAsia="en-NZ"/>
+        </w:rPr>
+      </w:pPr>
+      <w:r>
+        <w:rPr>
+          <w:b/>
+          <w:bCs/>
+          <w:lang w:eastAsia="en-NZ"/>
+        </w:rPr>
+        <w:t>11-SEP-26. KP. UNI</w:t>
+      </w:r>
+    </w:p>
+    <w:p>
+      <w:pPr>
+        <w:rPr>
+          <w:lang w:eastAsia="en-NZ"/>
+        </w:rPr>
+      </w:pPr>
+      <w:r>
+        <w:rPr>
+          <w:lang w:eastAsia="en-NZ"/>
+        </w:rPr>
+        <w:t xml:space="preserve">Only progress was updating </w:t>
+      </w:r>
+      <w:proofErr w:type="spellStart"/>
+      <w:r>
+        <w:rPr>
+          <w:lang w:eastAsia="en-NZ"/>
+        </w:rPr>
+        <w:t>stmcubeprog</w:t>
+      </w:r>
+      <w:proofErr w:type="spellEnd"/>
+      <w:r>
+        <w:rPr>
+          <w:lang w:eastAsia="en-NZ"/>
+        </w:rPr>
+        <w:t xml:space="preserve"> and then </w:t>
+      </w:r>
+      <w:proofErr w:type="spellStart"/>
+      <w:proofErr w:type="gramStart"/>
+      <w:r>
+        <w:rPr>
+          <w:lang w:eastAsia="en-NZ"/>
+        </w:rPr>
+        <w:t>its</w:t>
+      </w:r>
+      <w:proofErr w:type="spellEnd"/>
+      <w:proofErr w:type="gramEnd"/>
+      <w:r>
+        <w:rPr>
+          <w:lang w:eastAsia="en-NZ"/>
+        </w:rPr>
+        <w:t xml:space="preserve"> now able to see a target voltage of 3v3. Other note, the ‘missing’ components arrived so now I have all components I need for a fully populated board theoretically. </w:t>
+      </w:r>
+    </w:p>
+    <w:p>
+      <w:pPr>
+        <w:rPr>
+          <w:lang w:eastAsia="en-NZ"/>
+        </w:rPr>
+      </w:pPr>
+      <w:proofErr w:type="spellStart"/>
+      <w:r>
+        <w:rPr>
+          <w:lang w:eastAsia="en-NZ"/>
+        </w:rPr>
+        <w:lastRenderedPageBreak/>
+        <w:t>Usbc</w:t>
+      </w:r>
+      <w:proofErr w:type="spellEnd"/>
+      <w:r>
+        <w:rPr>
+          <w:lang w:eastAsia="en-NZ"/>
+        </w:rPr>
+        <w:t xml:space="preserve">: still not working. Tested the D+ and D- continuity, all is fine. My manual shorts are behaving exactly as they should. Tried pulling PA9 (68) high to 5v to see if that allowed it to enter a mode, that didn’t help. </w:t>
+      </w:r>
+    </w:p>
+    <w:p>
+      <w:pPr>
+        <w:rPr>
+          <w:lang w:eastAsia="en-NZ"/>
+        </w:rPr>
+      </w:pPr>
+      <w:r>
+        <w:rPr>
+          <w:lang w:eastAsia="en-NZ"/>
+        </w:rPr>
+        <w:t xml:space="preserve">SWD: Tried fixed, added 10k between SWDIO and 3v3, tried putting it in boot0 and not, tried playing w </w:t>
+      </w:r>
+      <w:proofErr w:type="spellStart"/>
+      <w:r>
+        <w:rPr>
+          <w:lang w:eastAsia="en-NZ"/>
+        </w:rPr>
+        <w:t>nrst</w:t>
+      </w:r>
+      <w:proofErr w:type="spellEnd"/>
+      <w:r>
+        <w:rPr>
+          <w:lang w:eastAsia="en-NZ"/>
+        </w:rPr>
+        <w:t xml:space="preserve"> as I pressed connect. </w:t>
+      </w:r>
+    </w:p>
+    <w:p>
+      <w:pPr>
+        <w:rPr>
+          <w:lang w:eastAsia="en-NZ"/>
+        </w:rPr>
+      </w:pPr>
+      <w:r>
+        <w:rPr>
+          <w:lang w:eastAsia="en-NZ"/>
+        </w:rPr>
+        <w:t xml:space="preserve">I scoped the IO and CLK pins while they were connected to the </w:t>
+      </w:r>
+      <w:proofErr w:type="spellStart"/>
+      <w:proofErr w:type="gramStart"/>
+      <w:r>
+        <w:rPr>
+          <w:lang w:eastAsia="en-NZ"/>
+        </w:rPr>
+        <w:t>pcb</w:t>
+      </w:r>
+      <w:proofErr w:type="spellEnd"/>
+      <w:r>
+        <w:rPr>
+          <w:lang w:eastAsia="en-NZ"/>
+        </w:rPr>
+        <w:t>, and</w:t>
+      </w:r>
+      <w:proofErr w:type="gramEnd"/>
+      <w:r>
+        <w:rPr>
+          <w:lang w:eastAsia="en-NZ"/>
+        </w:rPr>
+        <w:t xml:space="preserve"> saw perfect signals as I would expect. The clk was a normal looking square wave that was just one section of it. The IO was a normal 3v3 then a few sections of multiple pulses dragging the signal to 0. </w:t>
+      </w:r>
+    </w:p>
+    <w:p>
+      <w:pPr>
+        <w:rPr>
+          <w:lang w:eastAsia="en-NZ"/>
+        </w:rPr>
+      </w:pPr>
+    </w:p>
+    <w:p>
+      <w:pPr>
+        <w:rPr>
+          <w:lang w:eastAsia="en-NZ"/>
+        </w:rPr>
+      </w:pPr>
+      <w:r>
+        <w:rPr>
+          <w:lang w:eastAsia="en-NZ"/>
+        </w:rPr>
+        <w:t xml:space="preserve">Next step: something is wrong. I am going to make </w:t>
+      </w:r>
+      <w:proofErr w:type="gramStart"/>
+      <w:r>
+        <w:rPr>
+          <w:lang w:eastAsia="en-NZ"/>
+        </w:rPr>
+        <w:t>a</w:t>
+      </w:r>
+      <w:proofErr w:type="gramEnd"/>
+      <w:r>
+        <w:rPr>
+          <w:lang w:eastAsia="en-NZ"/>
+        </w:rPr>
+        <w:t xml:space="preserve"> MVP just to see if my boards </w:t>
+      </w:r>
+      <w:proofErr w:type="spellStart"/>
+      <w:r>
+        <w:rPr>
+          <w:lang w:eastAsia="en-NZ"/>
+        </w:rPr>
+        <w:t>mcu</w:t>
+      </w:r>
+      <w:proofErr w:type="spellEnd"/>
+      <w:r>
+        <w:rPr>
+          <w:lang w:eastAsia="en-NZ"/>
+        </w:rPr>
+        <w:t xml:space="preserve"> is ever able to enter boot mode or be flashed in any way. </w:t>
+      </w:r>
+    </w:p>
+    <w:p>
+      <w:pPr>
+        <w:rPr>
+          <w:b/>
+          <w:bCs/>
+          <w:lang w:eastAsia="en-NZ"/>
+        </w:rPr>
+      </w:pPr>
+      <w:r>
+        <w:rPr>
+          <w:b/>
+          <w:bCs/>
+          <w:lang w:eastAsia="en-NZ"/>
+        </w:rPr>
+        <w:t>MVP:</w:t>
+      </w:r>
+    </w:p>
+    <w:p>
+      <w:pPr>
+        <w:rPr>
+          <w:lang w:eastAsia="en-NZ"/>
+        </w:rPr>
+      </w:pPr>
+      <w:r>
+        <w:rPr>
+          <w:b/>
+          <w:bCs/>
+          <w:lang w:eastAsia="en-NZ"/>
+        </w:rPr>
+        <w:t>Populate:</w:t>
+      </w:r>
+    </w:p>
+    <w:p>
+      <w:pPr>
+        <w:numPr>
+          <w:ilvl w:val="0"/>
+          <w:numId w:val="8"/>
+        </w:numPr>
+        <w:rPr>
+          <w:lang w:eastAsia="en-NZ"/>
+        </w:rPr>
+      </w:pPr>
+      <w:r>
+        <w:rPr>
+          <w:b/>
+          <w:bCs/>
+          <w:lang w:eastAsia="en-NZ"/>
+        </w:rPr>
+        <w:t>U3</w:t>
+      </w:r>
+      <w:r>
+        <w:rPr>
+          <w:lang w:eastAsia="en-NZ"/>
+        </w:rPr>
+        <w:t xml:space="preserve"> and its decoupling: C89–C95 (the VDD 100 </w:t>
+      </w:r>
+      <w:proofErr w:type="spellStart"/>
+      <w:r>
+        <w:rPr>
+          <w:lang w:eastAsia="en-NZ"/>
+        </w:rPr>
+        <w:t>nF's</w:t>
+      </w:r>
+      <w:proofErr w:type="spellEnd"/>
+      <w:r>
+        <w:rPr>
+          <w:lang w:eastAsia="en-NZ"/>
+        </w:rPr>
+        <w:t xml:space="preserve"> + bulk), plus C99/C98 on VDDA/VREF+.</w:t>
+      </w:r>
+    </w:p>
+    <w:p>
+      <w:pPr>
+        <w:numPr>
+          <w:ilvl w:val="0"/>
+          <w:numId w:val="8"/>
+        </w:numPr>
+        <w:rPr>
+          <w:lang w:eastAsia="en-NZ"/>
+        </w:rPr>
+      </w:pPr>
+      <w:r>
+        <w:rPr>
+          <w:b/>
+          <w:bCs/>
+          <w:lang w:eastAsia="en-NZ"/>
+        </w:rPr>
+        <w:t>Both VCAP caps</w:t>
+      </w:r>
+      <w:r>
+        <w:rPr>
+          <w:lang w:eastAsia="en-NZ"/>
+        </w:rPr>
+        <w:t xml:space="preserve"> — C96 and C97 (2.2 µF). Non-negotiable; the internal core LDO won't be stable without them and that's likely your current problem.</w:t>
+      </w:r>
+    </w:p>
+    <w:p>
+      <w:pPr>
+        <w:numPr>
+          <w:ilvl w:val="0"/>
+          <w:numId w:val="8"/>
+        </w:numPr>
+        <w:rPr>
+          <w:lang w:eastAsia="en-NZ"/>
+        </w:rPr>
+      </w:pPr>
+      <w:proofErr w:type="spellStart"/>
+      <w:r>
+        <w:rPr>
+          <w:b/>
+          <w:bCs/>
+          <w:lang w:eastAsia="en-NZ"/>
+        </w:rPr>
+        <w:t>nRST</w:t>
+      </w:r>
+      <w:proofErr w:type="spellEnd"/>
+      <w:r>
+        <w:rPr>
+          <w:lang w:eastAsia="en-NZ"/>
+        </w:rPr>
+        <w:t xml:space="preserve">: C63, and SW1 or just a pull-up — </w:t>
+      </w:r>
+      <w:proofErr w:type="spellStart"/>
+      <w:r>
+        <w:rPr>
+          <w:lang w:eastAsia="en-NZ"/>
+        </w:rPr>
+        <w:t>nRST</w:t>
+      </w:r>
+      <w:proofErr w:type="spellEnd"/>
+      <w:r>
+        <w:rPr>
+          <w:lang w:eastAsia="en-NZ"/>
+        </w:rPr>
+        <w:t xml:space="preserve"> must idle at 3.3 V.</w:t>
+      </w:r>
+    </w:p>
+    <w:p>
+      <w:pPr>
+        <w:numPr>
+          <w:ilvl w:val="0"/>
+          <w:numId w:val="8"/>
+        </w:numPr>
+        <w:rPr>
+          <w:lang w:eastAsia="en-NZ"/>
+        </w:rPr>
+      </w:pPr>
+      <w:r>
+        <w:rPr>
+          <w:b/>
+          <w:bCs/>
+          <w:lang w:eastAsia="en-NZ"/>
+        </w:rPr>
+        <w:t>BOOT0</w:t>
+      </w:r>
+      <w:r>
+        <w:rPr>
+          <w:lang w:eastAsia="en-NZ"/>
+        </w:rPr>
+        <w:t>: R13 (pull-down) so it sits low.</w:t>
+      </w:r>
+    </w:p>
+    <w:p>
+      <w:pPr>
+        <w:numPr>
+          <w:ilvl w:val="0"/>
+          <w:numId w:val="8"/>
+        </w:numPr>
+        <w:rPr>
+          <w:lang w:eastAsia="en-NZ"/>
+        </w:rPr>
+      </w:pPr>
+      <w:r>
+        <w:rPr>
+          <w:b/>
+          <w:bCs/>
+          <w:lang w:eastAsia="en-NZ"/>
+        </w:rPr>
+        <w:t>J7</w:t>
+      </w:r>
+      <w:r>
+        <w:rPr>
+          <w:lang w:eastAsia="en-NZ"/>
+        </w:rPr>
+        <w:t xml:space="preserve"> (SWD) — SWDIO, SWCLK, GND, 3V3.</w:t>
+      </w:r>
+    </w:p>
+    <w:p>
+      <w:pPr>
+        <w:numPr>
+          <w:ilvl w:val="0"/>
+          <w:numId w:val="8"/>
+        </w:numPr>
+        <w:rPr>
+          <w:lang w:eastAsia="en-NZ"/>
+        </w:rPr>
+      </w:pPr>
+      <w:r>
+        <w:rPr>
+          <w:lang w:eastAsia="en-NZ"/>
+        </w:rPr>
+        <w:t xml:space="preserve">A clean </w:t>
+      </w:r>
+      <w:r>
+        <w:rPr>
+          <w:b/>
+          <w:bCs/>
+          <w:lang w:eastAsia="en-NZ"/>
+        </w:rPr>
+        <w:t>3.3 V into VDD/VDDA</w:t>
+      </w:r>
+      <w:r>
+        <w:rPr>
+          <w:lang w:eastAsia="en-NZ"/>
+        </w:rPr>
+        <w:t xml:space="preserve"> and solid </w:t>
+      </w:r>
+      <w:r>
+        <w:rPr>
+          <w:b/>
+          <w:bCs/>
+          <w:lang w:eastAsia="en-NZ"/>
+        </w:rPr>
+        <w:t>GND</w:t>
+      </w:r>
+      <w:r>
+        <w:rPr>
+          <w:lang w:eastAsia="en-NZ"/>
+        </w:rPr>
+        <w:t xml:space="preserve">. You can feed 3.3 V straight from a bench supply onto the VDD rail — you do </w:t>
+      </w:r>
+      <w:r>
+        <w:rPr>
+          <w:b/>
+          <w:bCs/>
+          <w:lang w:eastAsia="en-NZ"/>
+        </w:rPr>
+        <w:t>not</w:t>
+      </w:r>
+      <w:r>
+        <w:rPr>
+          <w:lang w:eastAsia="en-NZ"/>
+        </w:rPr>
+        <w:t xml:space="preserve"> need the USB-C path, the LDO, the mux, or any of the power tree. SWD flashing needs nothing but VDD, GND, VCAP caps, </w:t>
+      </w:r>
+      <w:proofErr w:type="spellStart"/>
+      <w:r>
+        <w:rPr>
+          <w:lang w:eastAsia="en-NZ"/>
+        </w:rPr>
+        <w:t>nRST</w:t>
+      </w:r>
+      <w:proofErr w:type="spellEnd"/>
+      <w:r>
+        <w:rPr>
+          <w:lang w:eastAsia="en-NZ"/>
+        </w:rPr>
+        <w:t xml:space="preserve"> high, BOOT0 low, and the four SWD wires.</w:t>
+      </w:r>
+    </w:p>
+    <w:p>
+      <w:pPr>
+        <w:rPr>
+          <w:lang w:eastAsia="en-NZ"/>
+        </w:rPr>
+      </w:pPr>
+    </w:p>
+    <w:p>
+      <w:pPr>
+        <w:rPr>
+          <w:lang w:eastAsia="en-NZ"/>
+        </w:rPr>
+      </w:pPr>
+    </w:p>
+    <w:p>
+      <w:pPr>
+        <w:rPr>
+          <w:lang w:eastAsia="en-NZ"/>
+        </w:rPr>
+      </w:pPr>
+    </w:p>
+    <w:p>
+      <w:pPr>
+        <w:rPr>
+          <w:lang w:eastAsia="en-NZ"/>
+        </w:rPr>
+      </w:pPr>
+    </w:p>
+    <w:p>
+      <w:pPr>
+        <w:rPr>
+          <w:lang w:eastAsia="en-NZ"/>
+        </w:rPr>
+      </w:pPr>
+    </w:p>
+    <w:p>
+      <w:pPr>
+        <w:rPr>
+          <w:lang w:eastAsia="en-NZ"/>
+        </w:rPr>
+      </w:pPr>
+    </w:p>
+    <w:p>
+      <w:pPr>
+        <w:rPr>
+          <w:lang w:eastAsia="en-NZ"/>
+        </w:rPr>
+      </w:pPr>
+    </w:p>
+    <w:p>
+      <w:pPr>
+        <w:rPr>
+          <w:b/>
+          <w:bCs/>
+          <w:lang w:eastAsia="en-NZ"/>
+        </w:rPr>
+      </w:pPr>
+      <w:r>
+        <w:rPr>
+          <w:b/>
+          <w:bCs/>
+          <w:lang w:eastAsia="en-NZ"/>
+        </w:rPr>
+        <w:lastRenderedPageBreak/>
+        <w:t>15-SEP-26. KP. UNI</w:t>
+      </w:r>
+    </w:p>
+    <w:p>
+      <w:pPr>
+        <w:rPr>
+          <w:lang w:eastAsia="en-NZ"/>
+        </w:rPr>
+      </w:pPr>
+      <w:r>
+        <w:rPr>
+          <w:lang w:eastAsia="en-NZ"/>
+        </w:rPr>
+        <w:t xml:space="preserve">Louis checked w known good </w:t>
+      </w:r>
+      <w:proofErr w:type="spellStart"/>
+      <w:r>
+        <w:rPr>
+          <w:lang w:eastAsia="en-NZ"/>
+        </w:rPr>
+        <w:t>mcu</w:t>
+      </w:r>
+      <w:proofErr w:type="spellEnd"/>
+      <w:r>
+        <w:rPr>
+          <w:lang w:eastAsia="en-NZ"/>
+        </w:rPr>
+        <w:t xml:space="preserve"> and the </w:t>
+      </w:r>
+      <w:proofErr w:type="spellStart"/>
+      <w:r>
+        <w:rPr>
+          <w:lang w:eastAsia="en-NZ"/>
+        </w:rPr>
+        <w:t>STLink</w:t>
+      </w:r>
+      <w:proofErr w:type="spellEnd"/>
+      <w:r>
+        <w:rPr>
+          <w:lang w:eastAsia="en-NZ"/>
+        </w:rPr>
+        <w:t xml:space="preserve"> we bought from </w:t>
+      </w:r>
+      <w:proofErr w:type="spellStart"/>
+      <w:r>
+        <w:rPr>
+          <w:lang w:eastAsia="en-NZ"/>
+        </w:rPr>
+        <w:t>digikey</w:t>
+      </w:r>
+      <w:proofErr w:type="spellEnd"/>
+      <w:r>
+        <w:rPr>
+          <w:lang w:eastAsia="en-NZ"/>
+        </w:rPr>
+        <w:t xml:space="preserve"> does not work. </w:t>
+      </w:r>
+    </w:p>
+    <w:p>
+      <w:pPr>
+        <w:rPr>
+          <w:lang w:eastAsia="en-NZ"/>
+        </w:rPr>
+      </w:pPr>
+      <w:r>
+        <w:rPr>
+          <w:lang w:eastAsia="en-NZ"/>
+        </w:rPr>
+        <w:t xml:space="preserve">IMO flashing through DFU should work. My RL </w:t>
+      </w:r>
+      <w:proofErr w:type="spellStart"/>
+      <w:r>
+        <w:rPr>
+          <w:lang w:eastAsia="en-NZ"/>
+        </w:rPr>
+        <w:t>pcb</w:t>
+      </w:r>
+      <w:proofErr w:type="spellEnd"/>
+      <w:r>
+        <w:rPr>
+          <w:lang w:eastAsia="en-NZ"/>
+        </w:rPr>
+        <w:t xml:space="preserve"> I designed works perfectly ONLY through DFU. I am going to add DFU capability to the MVP board. </w:t>
+      </w:r>
+    </w:p>
+    <w:p>
+      <w:pPr>
+        <w:rPr>
+          <w:lang w:eastAsia="en-NZ"/>
+        </w:rPr>
+      </w:pPr>
+      <w:r>
+        <w:rPr>
+          <w:b/>
+          <w:bCs/>
+          <w:lang w:eastAsia="en-NZ"/>
+        </w:rPr>
+        <w:t>USB-DFU MVP populate:</w:t>
+      </w:r>
+    </w:p>
+    <w:p>
+      <w:pPr>
+        <w:numPr>
+          <w:ilvl w:val="0"/>
+          <w:numId w:val="9"/>
+        </w:numPr>
+        <w:rPr>
+          <w:strike/>
+          <w:lang w:eastAsia="en-NZ"/>
+        </w:rPr>
+      </w:pPr>
+      <w:r>
+        <w:rPr>
+          <w:b/>
+          <w:bCs/>
+          <w:strike/>
+          <w:lang w:eastAsia="en-NZ"/>
+        </w:rPr>
+        <w:t>U3</w:t>
+      </w:r>
+      <w:r>
+        <w:rPr>
+          <w:strike/>
+          <w:lang w:eastAsia="en-NZ"/>
+        </w:rPr>
+        <w:t xml:space="preserve"> + all decoupling: C89–C94, C95, and C99/C98 on VDDA/VREF+.</w:t>
+      </w:r>
+    </w:p>
+    <w:p>
+      <w:pPr>
+        <w:numPr>
+          <w:ilvl w:val="0"/>
+          <w:numId w:val="9"/>
+        </w:numPr>
+        <w:rPr>
+          <w:strike/>
+          <w:lang w:eastAsia="en-NZ"/>
+        </w:rPr>
+      </w:pPr>
+      <w:proofErr w:type="gramStart"/>
+      <w:r>
+        <w:rPr>
+          <w:b/>
+          <w:bCs/>
+          <w:strike/>
+          <w:lang w:eastAsia="en-NZ"/>
+        </w:rPr>
+        <w:t>Both VCAP</w:t>
+      </w:r>
+      <w:proofErr w:type="gramEnd"/>
+      <w:r>
+        <w:rPr>
+          <w:b/>
+          <w:bCs/>
+          <w:strike/>
+          <w:lang w:eastAsia="en-NZ"/>
+        </w:rPr>
+        <w:t xml:space="preserve"> caps</w:t>
+      </w:r>
+      <w:r>
+        <w:rPr>
+          <w:strike/>
+          <w:lang w:eastAsia="en-NZ"/>
+        </w:rPr>
+        <w:t xml:space="preserve"> C96/C97 (2.2 µF).</w:t>
+      </w:r>
+    </w:p>
+    <w:p>
+      <w:pPr>
+        <w:numPr>
+          <w:ilvl w:val="0"/>
+          <w:numId w:val="9"/>
+        </w:numPr>
+        <w:rPr>
+          <w:strike/>
+          <w:lang w:eastAsia="en-NZ"/>
+        </w:rPr>
+      </w:pPr>
+      <w:proofErr w:type="spellStart"/>
+      <w:r>
+        <w:rPr>
+          <w:b/>
+          <w:bCs/>
+          <w:strike/>
+          <w:lang w:eastAsia="en-NZ"/>
+        </w:rPr>
+        <w:t>nRST</w:t>
+      </w:r>
+      <w:proofErr w:type="spellEnd"/>
+      <w:r>
+        <w:rPr>
+          <w:strike/>
+          <w:lang w:eastAsia="en-NZ"/>
+        </w:rPr>
+        <w:t xml:space="preserve">: C63 </w:t>
+      </w:r>
+      <w:r>
+        <w:rPr>
+          <w:b/>
+          <w:bCs/>
+          <w:strike/>
+          <w:lang w:eastAsia="en-NZ"/>
+        </w:rPr>
+        <w:t xml:space="preserve">plus a 10 </w:t>
+      </w:r>
+      <w:proofErr w:type="spellStart"/>
+      <w:r>
+        <w:rPr>
+          <w:b/>
+          <w:bCs/>
+          <w:strike/>
+          <w:lang w:eastAsia="en-NZ"/>
+        </w:rPr>
+        <w:t>kΩ</w:t>
+      </w:r>
+      <w:proofErr w:type="spellEnd"/>
+      <w:r>
+        <w:rPr>
+          <w:b/>
+          <w:bCs/>
+          <w:strike/>
+          <w:lang w:eastAsia="en-NZ"/>
+        </w:rPr>
+        <w:t xml:space="preserve"> pull-up to 3V3</w:t>
+      </w:r>
+      <w:r>
+        <w:rPr>
+          <w:strike/>
+          <w:lang w:eastAsia="en-NZ"/>
+        </w:rPr>
+        <w:t xml:space="preserve"> — you just proved this was missing and pulling the chip into reset. Even for DFU, if </w:t>
+      </w:r>
+      <w:proofErr w:type="spellStart"/>
+      <w:r>
+        <w:rPr>
+          <w:strike/>
+          <w:lang w:eastAsia="en-NZ"/>
+        </w:rPr>
+        <w:t>nRST</w:t>
+      </w:r>
+      <w:proofErr w:type="spellEnd"/>
+      <w:r>
+        <w:rPr>
+          <w:strike/>
+          <w:lang w:eastAsia="en-NZ"/>
+        </w:rPr>
+        <w:t xml:space="preserve"> is held low the bootloader never runs. This is mandatory now.</w:t>
+      </w:r>
+    </w:p>
+    <w:p>
+      <w:pPr>
+        <w:numPr>
+          <w:ilvl w:val="0"/>
+          <w:numId w:val="9"/>
+        </w:numPr>
+        <w:rPr>
+          <w:strike/>
+          <w:lang w:eastAsia="en-NZ"/>
+        </w:rPr>
+      </w:pPr>
+      <w:r>
+        <w:rPr>
+          <w:b/>
+          <w:bCs/>
+          <w:strike/>
+          <w:lang w:eastAsia="en-NZ"/>
+        </w:rPr>
+        <w:t>BOOT0</w:t>
+      </w:r>
+      <w:r>
+        <w:rPr>
+          <w:strike/>
+          <w:lang w:eastAsia="en-NZ"/>
+        </w:rPr>
+        <w:t>: your J8 jumper tied high (BOOT0 → 3V3). Confirm 3.3 V at pin 94.</w:t>
+      </w:r>
+    </w:p>
+    <w:p>
+      <w:pPr>
+        <w:numPr>
+          <w:ilvl w:val="0"/>
+          <w:numId w:val="9"/>
+        </w:numPr>
+        <w:rPr>
+          <w:lang w:eastAsia="en-NZ"/>
+        </w:rPr>
+      </w:pPr>
+      <w:r>
+        <w:rPr>
+          <w:b/>
+          <w:bCs/>
+          <w:lang w:eastAsia="en-NZ"/>
+        </w:rPr>
+        <w:t>VBAT (6) → 3V3, VDDA (21) → 3V3, VSSA → GND, all VSS → GND, all VDD → 3V3.</w:t>
+      </w:r>
+    </w:p>
+    <w:p>
+      <w:pPr>
+        <w:numPr>
+          <w:ilvl w:val="0"/>
+          <w:numId w:val="9"/>
+        </w:numPr>
+        <w:rPr>
+          <w:lang w:eastAsia="en-NZ"/>
+        </w:rPr>
+      </w:pPr>
+      <w:r>
+        <w:rPr>
+          <w:b/>
+          <w:bCs/>
+          <w:lang w:eastAsia="en-NZ"/>
+        </w:rPr>
+        <w:t>The USB-C data path</w:t>
+      </w:r>
+      <w:r>
+        <w:rPr>
+          <w:lang w:eastAsia="en-NZ"/>
+        </w:rPr>
+        <w:t>: the receptacle, and the D+/D− lines from it to PA12 (pin 71) / PA11 (pin 70). Since you don't have U2, bridge its footprint (1↔6, 3↔4) exactly as before — nothing touching pins 2 (GND) or 5 (VBUS).</w:t>
+      </w:r>
+    </w:p>
+    <w:p>
+      <w:pPr>
+        <w:numPr>
+          <w:ilvl w:val="0"/>
+          <w:numId w:val="9"/>
+        </w:numPr>
+        <w:rPr>
+          <w:lang w:eastAsia="en-NZ"/>
+        </w:rPr>
+      </w:pPr>
+      <w:r>
+        <w:rPr>
+          <w:b/>
+          <w:bCs/>
+          <w:lang w:eastAsia="en-NZ"/>
+        </w:rPr>
+        <w:t>CC pulldowns</w:t>
+      </w:r>
+      <w:r>
+        <w:rPr>
+          <w:lang w:eastAsia="en-NZ"/>
+        </w:rPr>
+        <w:t xml:space="preserve">: R1/R4 (5.1 </w:t>
+      </w:r>
+      <w:proofErr w:type="spellStart"/>
+      <w:r>
+        <w:rPr>
+          <w:lang w:eastAsia="en-NZ"/>
+        </w:rPr>
+        <w:t>kΩ</w:t>
+      </w:r>
+      <w:proofErr w:type="spellEnd"/>
+      <w:r>
+        <w:rPr>
+          <w:lang w:eastAsia="en-NZ"/>
+        </w:rPr>
+        <w:t>) on the USB-C CC lines — without these a Type-C host won't even apply VBUS.</w:t>
+      </w:r>
+    </w:p>
+    <w:p>
+      <w:pPr>
+        <w:numPr>
+          <w:ilvl w:val="0"/>
+          <w:numId w:val="9"/>
+        </w:numPr>
+        <w:rPr>
+          <w:lang w:eastAsia="en-NZ"/>
+        </w:rPr>
+      </w:pPr>
+      <w:r>
+        <w:rPr>
+          <w:b/>
+          <w:bCs/>
+          <w:lang w:eastAsia="en-NZ"/>
+        </w:rPr>
+        <w:t>PA9 (pin 68) wired to VBUS (5 V)</w:t>
+      </w:r>
+      <w:r>
+        <w:rPr>
+          <w:lang w:eastAsia="en-NZ"/>
+        </w:rPr>
+        <w:t xml:space="preserve"> — the fix for the no-connect. This is the part your board omits and the reason DFU never enumerated. Put it in from the start.</w:t>
+      </w:r>
+    </w:p>
+    <w:p>
+      <w:pPr>
+        <w:numPr>
+          <w:ilvl w:val="0"/>
+          <w:numId w:val="9"/>
+        </w:numPr>
+        <w:rPr>
+          <w:lang w:eastAsia="en-NZ"/>
+        </w:rPr>
+      </w:pPr>
+      <w:r>
+        <w:rPr>
+          <w:lang w:eastAsia="en-NZ"/>
+        </w:rPr>
+        <w:t xml:space="preserve">Power: you can run the whole thing off the USB-C 5 V through your AP2112 path, </w:t>
+      </w:r>
+      <w:r>
+        <w:rPr>
+          <w:b/>
+          <w:bCs/>
+          <w:lang w:eastAsia="en-NZ"/>
+        </w:rPr>
+        <w:t>or</w:t>
+      </w:r>
+      <w:r>
+        <w:rPr>
+          <w:lang w:eastAsia="en-NZ"/>
+        </w:rPr>
+        <w:t xml:space="preserve"> feed 3.3 V from a bench supply onto VDD and just use the USB cable for data + VBUS-sense. Either works; bench 3.3 V removes the LDO/mux as variables.</w:t>
+      </w:r>
+    </w:p>
+    <w:p>
+      <w:pPr>
+        <w:rPr>
+          <w:lang w:eastAsia="en-NZ"/>
+        </w:rPr>
+      </w:pPr>
+    </w:p>
+    <w:p>
+      <w:pPr>
+        <w:rPr>
+          <w:lang w:eastAsia="en-NZ"/>
+        </w:rPr>
+      </w:pPr>
+    </w:p>
+    <w:p>
+      <w:pPr>
+        <w:rPr>
+          <w:lang w:eastAsia="en-NZ"/>
+        </w:rPr>
+      </w:pPr>
+    </w:p>
+    <w:p>
+      <w:pPr>
+        <w:rPr>
+          <w:lang w:eastAsia="en-NZ"/>
+        </w:rPr>
+      </w:pPr>
+    </w:p>
+    <w:p>
+      <w:pPr>
+        <w:rPr>
+          <w:lang w:eastAsia="en-NZ"/>
+        </w:rPr>
+      </w:pPr>
+    </w:p>
+    <w:p>
+      <w:pPr>
+        <w:rPr>
+          <w:lang w:eastAsia="en-NZ"/>
+        </w:rPr>
+      </w:pPr>
+    </w:p>
+    <w:p>
+      <w:pPr>
+        <w:rPr>
+          <w:lang w:eastAsia="en-NZ"/>
+        </w:rPr>
+      </w:pPr>
+    </w:p>
+    <w:p>
+      <w:pPr>
+        <w:rPr>
+          <w:lang w:eastAsia="en-NZ"/>
+        </w:rPr>
+      </w:pPr>
+    </w:p>
+    <w:p>
+      <w:pPr>
+        <w:rPr>
+          <w:lang w:eastAsia="en-NZ"/>
+        </w:rPr>
+      </w:pPr>
+    </w:p>
+    <w:p>
+      <w:pPr>
+        <w:rPr>
+          <w:lang w:eastAsia="en-NZ"/>
+        </w:rPr>
+      </w:pPr>
+      <w:r>
+        <w:rPr>
+          <w:lang w:eastAsia="en-NZ"/>
+        </w:rPr>
+        <w:t>15</w:t>
+      </w:r>
+    </w:p>
+    <w:p>
+      <w:pPr>
+        <w:rPr>
+          <w:lang w:eastAsia="en-NZ"/>
+        </w:rPr>
+      </w:pPr>
+      <w:r>
+        <w:rPr>
+          <w:lang w:eastAsia="en-NZ"/>
+        </w:rPr>
+        <w:t xml:space="preserve">Populated another </w:t>
+      </w:r>
+      <w:proofErr w:type="spellStart"/>
+      <w:r>
+        <w:rPr>
+          <w:lang w:eastAsia="en-NZ"/>
+        </w:rPr>
+        <w:t>pcb</w:t>
+      </w:r>
+      <w:proofErr w:type="spellEnd"/>
+      <w:r>
+        <w:rPr>
+          <w:lang w:eastAsia="en-NZ"/>
+        </w:rPr>
+        <w:t xml:space="preserve"> just with ONLY the </w:t>
+      </w:r>
+      <w:proofErr w:type="spellStart"/>
+      <w:r>
+        <w:rPr>
+          <w:lang w:eastAsia="en-NZ"/>
+        </w:rPr>
+        <w:t>usb</w:t>
+      </w:r>
+      <w:proofErr w:type="spellEnd"/>
+      <w:r>
+        <w:rPr>
+          <w:lang w:eastAsia="en-NZ"/>
+        </w:rPr>
+        <w:t xml:space="preserve">-c connections. But still </w:t>
+      </w:r>
+      <w:proofErr w:type="spellStart"/>
+      <w:r>
+        <w:rPr>
+          <w:lang w:eastAsia="en-NZ"/>
+        </w:rPr>
+        <w:t>nort</w:t>
+      </w:r>
+      <w:proofErr w:type="spellEnd"/>
+      <w:r>
+        <w:rPr>
+          <w:lang w:eastAsia="en-NZ"/>
+        </w:rPr>
+        <w:t xml:space="preserve"> working. </w:t>
+      </w:r>
+      <w:proofErr w:type="spellStart"/>
+      <w:r>
+        <w:rPr>
+          <w:lang w:eastAsia="en-NZ"/>
+        </w:rPr>
+        <w:t>Im</w:t>
+      </w:r>
+      <w:proofErr w:type="spellEnd"/>
+      <w:r>
+        <w:rPr>
+          <w:lang w:eastAsia="en-NZ"/>
+        </w:rPr>
+        <w:t xml:space="preserve"> going to cut open a </w:t>
+      </w:r>
+      <w:proofErr w:type="spellStart"/>
+      <w:r>
+        <w:rPr>
+          <w:lang w:eastAsia="en-NZ"/>
+        </w:rPr>
+        <w:t>usb</w:t>
+      </w:r>
+      <w:proofErr w:type="spellEnd"/>
+      <w:r>
+        <w:rPr>
+          <w:lang w:eastAsia="en-NZ"/>
+        </w:rPr>
+        <w:t xml:space="preserve">-c cable and probe all to see if my connection is even good. Then probe EVERYTING, between all possible pins. </w:t>
+      </w:r>
+    </w:p>
+    <w:p>
+      <w:pPr>
+        <w:rPr>
+          <w:lang w:eastAsia="en-NZ"/>
+        </w:rPr>
+      </w:pPr>
+    </w:p>
+    <w:p>
+      <w:pPr>
+        <w:rPr>
+          <w:lang w:eastAsia="en-NZ"/>
+        </w:rPr>
+      </w:pPr>
+    </w:p>
+    <w:p>
+      <w:pPr>
+        <w:rPr>
+          <w:lang w:eastAsia="en-NZ"/>
+        </w:rPr>
+      </w:pPr>
+      <w:r>
+        <w:rPr>
+          <w:lang w:eastAsia="en-NZ"/>
+        </w:rPr>
+        <w:t>17-SEP-26. KP. UNI</w:t>
+      </w:r>
+    </w:p>
+    <w:p>
+      <w:pPr>
+        <w:rPr>
+          <w:lang w:eastAsia="en-NZ"/>
+        </w:rPr>
+      </w:pPr>
+      <w:r>
+        <w:rPr>
+          <w:lang w:eastAsia="en-NZ"/>
+        </w:rPr>
+        <w:t xml:space="preserve">MVP MCU resoldered as SWD </w:t>
+      </w:r>
+      <w:proofErr w:type="gramStart"/>
+      <w:r>
+        <w:rPr>
+          <w:lang w:eastAsia="en-NZ"/>
+        </w:rPr>
+        <w:t>actually didn’t</w:t>
+      </w:r>
+      <w:proofErr w:type="gramEnd"/>
+      <w:r>
+        <w:rPr>
+          <w:lang w:eastAsia="en-NZ"/>
+        </w:rPr>
+        <w:t xml:space="preserve"> have continuity. So that’s fixed now. </w:t>
+      </w:r>
+    </w:p>
+    <w:p>
+      <w:pPr>
+        <w:rPr>
+          <w:lang w:eastAsia="en-NZ"/>
+        </w:rPr>
+      </w:pPr>
+      <w:r>
+        <w:rPr>
+          <w:lang w:eastAsia="en-NZ"/>
+        </w:rPr>
+        <w:t xml:space="preserve">Testing on MVP </w:t>
+      </w:r>
+    </w:p>
+    <w:p>
+      <w:pPr>
+        <w:rPr>
+          <w:lang w:eastAsia="en-NZ"/>
+        </w:rPr>
+      </w:pPr>
+    </w:p>
+    <w:p>
+      <w:pPr>
+        <w:rPr>
+          <w:lang w:eastAsia="en-NZ"/>
+        </w:rPr>
+      </w:pPr>
+    </w:p>
+    <w:p>
+      <w:pPr>
+        <w:rPr>
+          <w:lang w:eastAsia="en-NZ"/>
+        </w:rPr>
+      </w:pPr>
+      <w:r>
+        <w:rPr>
+          <w:lang w:eastAsia="en-NZ"/>
+        </w:rPr>
+        <w:t>19-SEP-26. KP. RL</w:t>
+      </w:r>
+    </w:p>
+    <w:p>
+      <w:pPr>
+        <w:rPr>
+          <w:lang w:eastAsia="en-NZ"/>
+        </w:rPr>
+      </w:pPr>
+      <w:proofErr w:type="spellStart"/>
+      <w:r>
+        <w:rPr>
+          <w:lang w:eastAsia="en-NZ"/>
+        </w:rPr>
+        <w:t>Mcu</w:t>
+      </w:r>
+      <w:proofErr w:type="spellEnd"/>
+      <w:r>
+        <w:rPr>
+          <w:lang w:eastAsia="en-NZ"/>
+        </w:rPr>
+        <w:t xml:space="preserve"> works so continuing checklist now. Have all components </w:t>
       </w:r>
     </w:p>
     <w:p>
@@ -17995,6 +19472,304 @@
     </w:lvl>
   </w:abstractNum>
   <w:abstractNum w:abstractNumId="5" w15:restartNumberingAfterBreak="0">
+    <w:nsid w:val="60736E07"/>
+    <w:multiLevelType w:val="multilevel"/>
+    <w:tmpl w:val="86CCB91C"/>
+    <w:lvl w:ilvl="0">
+      <w:start w:val="1"/>
+      <w:numFmt w:val="bullet"/>
+      <w:lvlText w:val=""/>
+      <w:lvlJc w:val="left"/>
+      <w:pPr>
+        <w:tabs>
+          <w:tab w:val="num" w:pos="720"/>
+        </w:tabs>
+        <w:ind w:left="720" w:hanging="360"/>
+      </w:pPr>
+      <w:rPr>
+        <w:rFonts w:ascii="Symbol" w:hAnsi="Symbol" w:hint="default"/>
+        <w:sz w:val="20"/>
+      </w:rPr>
+    </w:lvl>
+    <w:lvl w:ilvl="1" w:tentative="1">
+      <w:start w:val="1"/>
+      <w:numFmt w:val="bullet"/>
+      <w:lvlText w:val="o"/>
+      <w:lvlJc w:val="left"/>
+      <w:pPr>
+        <w:tabs>
+          <w:tab w:val="num" w:pos="1440"/>
+        </w:tabs>
+        <w:ind w:left="1440" w:hanging="360"/>
+      </w:pPr>
+      <w:rPr>
+        <w:rFonts w:ascii="Courier New" w:hAnsi="Courier New" w:hint="default"/>
+        <w:sz w:val="20"/>
+      </w:rPr>
+    </w:lvl>
+    <w:lvl w:ilvl="2" w:tentative="1">
+      <w:start w:val="1"/>
+      <w:numFmt w:val="bullet"/>
+      <w:lvlText w:val=""/>
+      <w:lvlJc w:val="left"/>
+      <w:pPr>
+        <w:tabs>
+          <w:tab w:val="num" w:pos="2160"/>
+        </w:tabs>
+        <w:ind w:left="2160" w:hanging="360"/>
+      </w:pPr>
+      <w:rPr>
+        <w:rFonts w:ascii="Wingdings" w:hAnsi="Wingdings" w:hint="default"/>
+        <w:sz w:val="20"/>
+      </w:rPr>
+    </w:lvl>
+    <w:lvl w:ilvl="3" w:tentative="1">
+      <w:start w:val="1"/>
+      <w:numFmt w:val="bullet"/>
+      <w:lvlText w:val=""/>
+      <w:lvlJc w:val="left"/>
+      <w:pPr>
+        <w:tabs>
+          <w:tab w:val="num" w:pos="2880"/>
+        </w:tabs>
+        <w:ind w:left="2880" w:hanging="360"/>
+      </w:pPr>
+      <w:rPr>
+        <w:rFonts w:ascii="Wingdings" w:hAnsi="Wingdings" w:hint="default"/>
+        <w:sz w:val="20"/>
+      </w:rPr>
+    </w:lvl>
+    <w:lvl w:ilvl="4" w:tentative="1">
+      <w:start w:val="1"/>
+      <w:numFmt w:val="bullet"/>
+      <w:lvlText w:val=""/>
+      <w:lvlJc w:val="left"/>
+      <w:pPr>
+        <w:tabs>
+          <w:tab w:val="num" w:pos="3600"/>
+        </w:tabs>
+        <w:ind w:left="3600" w:hanging="360"/>
+      </w:pPr>
+      <w:rPr>
+        <w:rFonts w:ascii="Wingdings" w:hAnsi="Wingdings" w:hint="default"/>
+        <w:sz w:val="20"/>
+      </w:rPr>
+    </w:lvl>
+    <w:lvl w:ilvl="5" w:tentative="1">
+      <w:start w:val="1"/>
+      <w:numFmt w:val="bullet"/>
+      <w:lvlText w:val=""/>
+      <w:lvlJc w:val="left"/>
+      <w:pPr>
+        <w:tabs>
+          <w:tab w:val="num" w:pos="4320"/>
+        </w:tabs>
+        <w:ind w:left="4320" w:hanging="360"/>
+      </w:pPr>
+      <w:rPr>
+        <w:rFonts w:ascii="Wingdings" w:hAnsi="Wingdings" w:hint="default"/>
+        <w:sz w:val="20"/>
+      </w:rPr>
+    </w:lvl>
+    <w:lvl w:ilvl="6" w:tentative="1">
+      <w:start w:val="1"/>
+      <w:numFmt w:val="bullet"/>
+      <w:lvlText w:val=""/>
+      <w:lvlJc w:val="left"/>
+      <w:pPr>
+        <w:tabs>
+          <w:tab w:val="num" w:pos="5040"/>
+        </w:tabs>
+        <w:ind w:left="5040" w:hanging="360"/>
+      </w:pPr>
+      <w:rPr>
+        <w:rFonts w:ascii="Wingdings" w:hAnsi="Wingdings" w:hint="default"/>
+        <w:sz w:val="20"/>
+      </w:rPr>
+    </w:lvl>
+    <w:lvl w:ilvl="7" w:tentative="1">
+      <w:start w:val="1"/>
+      <w:numFmt w:val="bullet"/>
+      <w:lvlText w:val=""/>
+      <w:lvlJc w:val="left"/>
+      <w:pPr>
+        <w:tabs>
+          <w:tab w:val="num" w:pos="5760"/>
+        </w:tabs>
+        <w:ind w:left="5760" w:hanging="360"/>
+      </w:pPr>
+      <w:rPr>
+        <w:rFonts w:ascii="Wingdings" w:hAnsi="Wingdings" w:hint="default"/>
+        <w:sz w:val="20"/>
+      </w:rPr>
+    </w:lvl>
+    <w:lvl w:ilvl="8" w:tentative="1">
+      <w:start w:val="1"/>
+      <w:numFmt w:val="bullet"/>
+      <w:lvlText w:val=""/>
+      <w:lvlJc w:val="left"/>
+      <w:pPr>
+        <w:tabs>
+          <w:tab w:val="num" w:pos="6480"/>
+        </w:tabs>
+        <w:ind w:left="6480" w:hanging="360"/>
+      </w:pPr>
+      <w:rPr>
+        <w:rFonts w:ascii="Wingdings" w:hAnsi="Wingdings" w:hint="default"/>
+        <w:sz w:val="20"/>
+      </w:rPr>
+    </w:lvl>
+  </w:abstractNum>
+  <w:abstractNum w:abstractNumId="6" w15:restartNumberingAfterBreak="0">
+    <w:nsid w:val="7328090D"/>
+    <w:multiLevelType w:val="multilevel"/>
+    <w:tmpl w:val="DE5AD74C"/>
+    <w:lvl w:ilvl="0">
+      <w:start w:val="1"/>
+      <w:numFmt w:val="bullet"/>
+      <w:lvlText w:val=""/>
+      <w:lvlJc w:val="left"/>
+      <w:pPr>
+        <w:tabs>
+          <w:tab w:val="num" w:pos="720"/>
+        </w:tabs>
+        <w:ind w:left="720" w:hanging="360"/>
+      </w:pPr>
+      <w:rPr>
+        <w:rFonts w:ascii="Symbol" w:hAnsi="Symbol" w:hint="default"/>
+        <w:sz w:val="20"/>
+      </w:rPr>
+    </w:lvl>
+    <w:lvl w:ilvl="1" w:tentative="1">
+      <w:start w:val="1"/>
+      <w:numFmt w:val="bullet"/>
+      <w:lvlText w:val="o"/>
+      <w:lvlJc w:val="left"/>
+      <w:pPr>
+        <w:tabs>
+          <w:tab w:val="num" w:pos="1440"/>
+        </w:tabs>
+        <w:ind w:left="1440" w:hanging="360"/>
+      </w:pPr>
+      <w:rPr>
+        <w:rFonts w:ascii="Courier New" w:hAnsi="Courier New" w:hint="default"/>
+        <w:sz w:val="20"/>
+      </w:rPr>
+    </w:lvl>
+    <w:lvl w:ilvl="2" w:tentative="1">
+      <w:start w:val="1"/>
+      <w:numFmt w:val="bullet"/>
+      <w:lvlText w:val=""/>
+      <w:lvlJc w:val="left"/>
+      <w:pPr>
+        <w:tabs>
+          <w:tab w:val="num" w:pos="2160"/>
+        </w:tabs>
+        <w:ind w:left="2160" w:hanging="360"/>
+      </w:pPr>
+      <w:rPr>
+        <w:rFonts w:ascii="Wingdings" w:hAnsi="Wingdings" w:hint="default"/>
+        <w:sz w:val="20"/>
+      </w:rPr>
+    </w:lvl>
+    <w:lvl w:ilvl="3" w:tentative="1">
+      <w:start w:val="1"/>
+      <w:numFmt w:val="bullet"/>
+      <w:lvlText w:val=""/>
+      <w:lvlJc w:val="left"/>
+      <w:pPr>
+        <w:tabs>
+          <w:tab w:val="num" w:pos="2880"/>
+        </w:tabs>
+        <w:ind w:left="2880" w:hanging="360"/>
+      </w:pPr>
+      <w:rPr>
+        <w:rFonts w:ascii="Wingdings" w:hAnsi="Wingdings" w:hint="default"/>
+        <w:sz w:val="20"/>
+      </w:rPr>
+    </w:lvl>
+    <w:lvl w:ilvl="4" w:tentative="1">
+      <w:start w:val="1"/>
+      <w:numFmt w:val="bullet"/>
+      <w:lvlText w:val=""/>
+      <w:lvlJc w:val="left"/>
+      <w:pPr>
+        <w:tabs>
+          <w:tab w:val="num" w:pos="3600"/>
+        </w:tabs>
+        <w:ind w:left="3600" w:hanging="360"/>
+      </w:pPr>
+      <w:rPr>
+        <w:rFonts w:ascii="Wingdings" w:hAnsi="Wingdings" w:hint="default"/>
+        <w:sz w:val="20"/>
+      </w:rPr>
+    </w:lvl>
+    <w:lvl w:ilvl="5" w:tentative="1">
+      <w:start w:val="1"/>
+      <w:numFmt w:val="bullet"/>
+      <w:lvlText w:val=""/>
+      <w:lvlJc w:val="left"/>
+      <w:pPr>
+        <w:tabs>
+          <w:tab w:val="num" w:pos="4320"/>
+        </w:tabs>
+        <w:ind w:left="4320" w:hanging="360"/>
+      </w:pPr>
+      <w:rPr>
+        <w:rFonts w:ascii="Wingdings" w:hAnsi="Wingdings" w:hint="default"/>
+        <w:sz w:val="20"/>
+      </w:rPr>
+    </w:lvl>
+    <w:lvl w:ilvl="6" w:tentative="1">
+      <w:start w:val="1"/>
+      <w:numFmt w:val="bullet"/>
+      <w:lvlText w:val=""/>
+      <w:lvlJc w:val="left"/>
+      <w:pPr>
+        <w:tabs>
+          <w:tab w:val="num" w:pos="5040"/>
+        </w:tabs>
+        <w:ind w:left="5040" w:hanging="360"/>
+      </w:pPr>
+      <w:rPr>
+        <w:rFonts w:ascii="Wingdings" w:hAnsi="Wingdings" w:hint="default"/>
+        <w:sz w:val="20"/>
+      </w:rPr>
+    </w:lvl>
+    <w:lvl w:ilvl="7" w:tentative="1">
+      <w:start w:val="1"/>
+      <w:numFmt w:val="bullet"/>
+      <w:lvlText w:val=""/>
+      <w:lvlJc w:val="left"/>
+      <w:pPr>
+        <w:tabs>
+          <w:tab w:val="num" w:pos="5760"/>
+        </w:tabs>
+        <w:ind w:left="5760" w:hanging="360"/>
+      </w:pPr>
+      <w:rPr>
+        <w:rFonts w:ascii="Wingdings" w:hAnsi="Wingdings" w:hint="default"/>
+        <w:sz w:val="20"/>
+      </w:rPr>
+    </w:lvl>
+    <w:lvl w:ilvl="8" w:tentative="1">
+      <w:start w:val="1"/>
+      <w:numFmt w:val="bullet"/>
+      <w:lvlText w:val=""/>
+      <w:lvlJc w:val="left"/>
+      <w:pPr>
+        <w:tabs>
+          <w:tab w:val="num" w:pos="6480"/>
+        </w:tabs>
+        <w:ind w:left="6480" w:hanging="360"/>
+      </w:pPr>
+      <w:rPr>
+        <w:rFonts w:ascii="Wingdings" w:hAnsi="Wingdings" w:hint="default"/>
+        <w:sz w:val="20"/>
+      </w:rPr>
+    </w:lvl>
+  </w:abstractNum>
+  <w:abstractNum w:abstractNumId="7" w15:restartNumberingAfterBreak="0">
     <w:nsid w:val="7E886C42"/>
     <w:multiLevelType w:val="multilevel"/>
     <w:tmpl w:val="CDF85690"/>
@@ -18107,7 +19882,7 @@
       </w:rPr>
     </w:lvl>
   </w:abstractNum>
-  <w:abstractNum w:abstractNumId="6" w15:restartNumberingAfterBreak="0">
+  <w:abstractNum w:abstractNumId="8" w15:restartNumberingAfterBreak="0">
     <w:nsid w:val="7F5D54D9"/>
     <w:multiLevelType w:val="hybridMultilevel"/>
     <w:tmpl w:val="8A00B4D6"/>
@@ -18200,7 +19975,7 @@
     <w:abstractNumId w:val="0"/>
   </w:num>
   <w:num w:numId="2" w16cid:durableId="995185023">
-    <w:abstractNumId w:val="6"/>
+    <w:abstractNumId w:val="8"/>
   </w:num>
   <w:num w:numId="3" w16cid:durableId="190726118">
     <w:abstractNumId w:val="3"/>
@@ -18212,13 +19987,19 @@
     <w:abstractNumId w:val="2"/>
   </w:num>
   <w:num w:numId="5" w16cid:durableId="821969827">
-    <w:abstractNumId w:val="5"/>
+    <w:abstractNumId w:val="7"/>
   </w:num>
   <w:num w:numId="6" w16cid:durableId="74086557">
     <w:abstractNumId w:val="1"/>
   </w:num>
   <w:num w:numId="7" w16cid:durableId="609051963">
     <w:abstractNumId w:val="4"/>
+  </w:num>
+  <w:num w:numId="8" w16cid:durableId="369230362">
+    <w:abstractNumId w:val="6"/>
+  </w:num>
+  <w:num w:numId="9" w16cid:durableId="169836197">
+    <w:abstractNumId w:val="5"/>
   </w:num>
 </w:numbering>
 </file>

</xml_diff>

<commit_message>
updated the last few component symbols/fps, none very significant
</commit_message>
<xml_diff>
--- a/PIM_V01/PIM_V01_BRINGUP.docx
+++ b/PIM_V01/PIM_V01_BRINGUP.docx
@@ -1815,37 +1815,7 @@
                 <w:lang w:eastAsia="en-NZ"/>
                 <w14:ligatures w14:val="none"/>
               </w:rPr>
-              <w:t>Idle / quiescent (</w:t>
-            </w:r>
-            <w:proofErr w:type="spellStart"/>
-            <w:r>
-              <w:rPr>
-                <w:rFonts w:ascii="Aptos" w:eastAsia="Aptos" w:hAnsi="Aptos" w:cs="Aptos"/>
-                <w:b/>
-                <w:bCs/>
-                <w:color w:val="FFFFFF"/>
-                <w:kern w:val="0"/>
-                <w:sz w:val="17"/>
-                <w:szCs w:val="17"/>
-                <w:lang w:eastAsia="en-NZ"/>
-                <w14:ligatures w14:val="none"/>
-              </w:rPr>
-              <w:t>typ</w:t>
-            </w:r>
-            <w:proofErr w:type="spellEnd"/>
-            <w:r>
-              <w:rPr>
-                <w:rFonts w:ascii="Aptos" w:eastAsia="Aptos" w:hAnsi="Aptos" w:cs="Aptos"/>
-                <w:b/>
-                <w:bCs/>
-                <w:color w:val="FFFFFF"/>
-                <w:kern w:val="0"/>
-                <w:sz w:val="17"/>
-                <w:szCs w:val="17"/>
-                <w:lang w:eastAsia="en-NZ"/>
-                <w14:ligatures w14:val="none"/>
-              </w:rPr>
-              <w:t>)</w:t>
+              <w:t>Idle / quiescent (typ)</w:t>
             </w:r>
           </w:p>
         </w:tc>
@@ -2068,7 +2038,6 @@
                 <w14:ligatures w14:val="none"/>
               </w:rPr>
             </w:pPr>
-            <w:proofErr w:type="spellStart"/>
             <w:r>
               <w:rPr>
                 <w:rFonts w:ascii="Aptos" w:eastAsia="Aptos" w:hAnsi="Aptos" w:cs="Aptos"/>
@@ -2079,46 +2048,7 @@
                 <w:lang w:eastAsia="en-NZ"/>
                 <w14:ligatures w14:val="none"/>
               </w:rPr>
-              <w:t>Vf</w:t>
-            </w:r>
-            <w:proofErr w:type="spellEnd"/>
-            <w:r>
-              <w:rPr>
-                <w:rFonts w:ascii="Aptos" w:eastAsia="Aptos" w:hAnsi="Aptos" w:cs="Aptos"/>
-                <w:color w:val="0A0A0A"/>
-                <w:kern w:val="0"/>
-                <w:sz w:val="17"/>
-                <w:szCs w:val="17"/>
-                <w:lang w:eastAsia="en-NZ"/>
-                <w14:ligatures w14:val="none"/>
-              </w:rPr>
-              <w:t xml:space="preserve"> 3.2 V@20 mA; </w:t>
-            </w:r>
-            <w:proofErr w:type="gramStart"/>
-            <w:r>
-              <w:rPr>
-                <w:rFonts w:ascii="Aptos" w:eastAsia="Aptos" w:hAnsi="Aptos" w:cs="Aptos"/>
-                <w:color w:val="0A0A0A"/>
-                <w:kern w:val="0"/>
-                <w:sz w:val="17"/>
-                <w:szCs w:val="17"/>
-                <w:lang w:eastAsia="en-NZ"/>
-                <w14:ligatures w14:val="none"/>
-              </w:rPr>
-              <w:t>R's</w:t>
-            </w:r>
-            <w:proofErr w:type="gramEnd"/>
-            <w:r>
-              <w:rPr>
-                <w:rFonts w:ascii="Aptos" w:eastAsia="Aptos" w:hAnsi="Aptos" w:cs="Aptos"/>
-                <w:color w:val="0A0A0A"/>
-                <w:kern w:val="0"/>
-                <w:sz w:val="17"/>
-                <w:szCs w:val="17"/>
-                <w:lang w:eastAsia="en-NZ"/>
-                <w14:ligatures w14:val="none"/>
-              </w:rPr>
-              <w:t xml:space="preserve"> sized so every rail ≈3–5 mA/LED — dominant idle load</w:t>
+              <w:t>Vf 3.2 V@20 mA; R's sized so every rail ≈3–5 mA/LED — dominant idle load</w:t>
             </w:r>
           </w:p>
         </w:tc>
@@ -2262,7 +2192,6 @@
                 <w14:ligatures w14:val="none"/>
               </w:rPr>
             </w:pPr>
-            <w:proofErr w:type="spellStart"/>
             <w:r>
               <w:rPr>
                 <w:rFonts w:ascii="Aptos" w:eastAsia="Aptos" w:hAnsi="Aptos" w:cs="Aptos"/>
@@ -2273,20 +2202,7 @@
                 <w:lang w:eastAsia="en-NZ"/>
                 <w14:ligatures w14:val="none"/>
               </w:rPr>
-              <w:t>Iq</w:t>
-            </w:r>
-            <w:proofErr w:type="spellEnd"/>
-            <w:r>
-              <w:rPr>
-                <w:rFonts w:ascii="Aptos" w:eastAsia="Aptos" w:hAnsi="Aptos" w:cs="Aptos"/>
-                <w:color w:val="0A0A0A"/>
-                <w:kern w:val="0"/>
-                <w:sz w:val="17"/>
-                <w:szCs w:val="17"/>
-                <w:lang w:eastAsia="en-NZ"/>
-                <w14:ligatures w14:val="none"/>
-              </w:rPr>
-              <w:t xml:space="preserve"> 12 µA (SD 2 µA)</w:t>
+              <w:t>Iq 12 µA (SD 2 µA)</w:t>
             </w:r>
           </w:p>
         </w:tc>
@@ -2364,33 +2280,7 @@
                 <w:lang w:eastAsia="en-NZ"/>
                 <w14:ligatures w14:val="none"/>
               </w:rPr>
-              <w:t xml:space="preserve">TPS259541 </w:t>
-            </w:r>
-            <w:proofErr w:type="spellStart"/>
-            <w:r>
-              <w:rPr>
-                <w:rFonts w:ascii="Aptos" w:eastAsia="Aptos" w:hAnsi="Aptos" w:cs="Aptos"/>
-                <w:color w:val="0A0A0A"/>
-                <w:kern w:val="0"/>
-                <w:sz w:val="17"/>
-                <w:szCs w:val="17"/>
-                <w:lang w:eastAsia="en-NZ"/>
-                <w14:ligatures w14:val="none"/>
-              </w:rPr>
-              <w:t>eFuse</w:t>
-            </w:r>
-            <w:proofErr w:type="spellEnd"/>
-            <w:r>
-              <w:rPr>
-                <w:rFonts w:ascii="Aptos" w:eastAsia="Aptos" w:hAnsi="Aptos" w:cs="Aptos"/>
-                <w:color w:val="0A0A0A"/>
-                <w:kern w:val="0"/>
-                <w:sz w:val="17"/>
-                <w:szCs w:val="17"/>
-                <w:lang w:eastAsia="en-NZ"/>
-                <w14:ligatures w14:val="none"/>
-              </w:rPr>
-              <w:t xml:space="preserve"> (U1)</w:t>
+              <w:t>TPS259541 eFuse (U1)</w:t>
             </w:r>
           </w:p>
         </w:tc>
@@ -2494,7 +2384,6 @@
                 <w14:ligatures w14:val="none"/>
               </w:rPr>
             </w:pPr>
-            <w:proofErr w:type="spellStart"/>
             <w:r>
               <w:rPr>
                 <w:rFonts w:ascii="Aptos" w:eastAsia="Aptos" w:hAnsi="Aptos" w:cs="Aptos"/>
@@ -2505,20 +2394,7 @@
                 <w:lang w:eastAsia="en-NZ"/>
                 <w14:ligatures w14:val="none"/>
               </w:rPr>
-              <w:t>Iq</w:t>
-            </w:r>
-            <w:proofErr w:type="spellEnd"/>
-            <w:r>
-              <w:rPr>
-                <w:rFonts w:ascii="Aptos" w:eastAsia="Aptos" w:hAnsi="Aptos" w:cs="Aptos"/>
-                <w:color w:val="0A0A0A"/>
-                <w:kern w:val="0"/>
-                <w:sz w:val="17"/>
-                <w:szCs w:val="17"/>
-                <w:lang w:eastAsia="en-NZ"/>
-                <w14:ligatures w14:val="none"/>
-              </w:rPr>
-              <w:t xml:space="preserve"> 175 µA (250 max)</w:t>
+              <w:t>Iq 175 µA (250 max)</w:t>
             </w:r>
           </w:p>
         </w:tc>
@@ -2556,22 +2432,8 @@
                 <w:lang w:eastAsia="en-NZ"/>
                 <w14:ligatures w14:val="none"/>
               </w:rPr>
-              <w:t xml:space="preserve">+inrush during +12V_PL </w:t>
-            </w:r>
-            <w:proofErr w:type="gramStart"/>
-            <w:r>
-              <w:rPr>
-                <w:rFonts w:ascii="Aptos" w:eastAsia="Aptos" w:hAnsi="Aptos" w:cs="Aptos"/>
-                <w:color w:val="0A0A0A"/>
-                <w:kern w:val="0"/>
-                <w:sz w:val="17"/>
-                <w:szCs w:val="17"/>
-                <w:lang w:eastAsia="en-NZ"/>
-                <w14:ligatures w14:val="none"/>
-              </w:rPr>
-              <w:t>soft-start</w:t>
-            </w:r>
-            <w:proofErr w:type="gramEnd"/>
+              <w:t>+inrush during +12V_PL soft-start</w:t>
+            </w:r>
           </w:p>
         </w:tc>
       </w:tr>
@@ -2714,7 +2576,6 @@
                 <w14:ligatures w14:val="none"/>
               </w:rPr>
             </w:pPr>
-            <w:proofErr w:type="spellStart"/>
             <w:r>
               <w:rPr>
                 <w:rFonts w:ascii="Aptos" w:eastAsia="Aptos" w:hAnsi="Aptos" w:cs="Aptos"/>
@@ -2725,20 +2586,7 @@
                 <w:lang w:eastAsia="en-NZ"/>
                 <w14:ligatures w14:val="none"/>
               </w:rPr>
-              <w:t>Iq</w:t>
-            </w:r>
-            <w:proofErr w:type="spellEnd"/>
-            <w:r>
-              <w:rPr>
-                <w:rFonts w:ascii="Aptos" w:eastAsia="Aptos" w:hAnsi="Aptos" w:cs="Aptos"/>
-                <w:color w:val="0A0A0A"/>
-                <w:kern w:val="0"/>
-                <w:sz w:val="17"/>
-                <w:szCs w:val="17"/>
-                <w:lang w:eastAsia="en-NZ"/>
-                <w14:ligatures w14:val="none"/>
-              </w:rPr>
-              <w:t xml:space="preserve"> 1 mA (SD 3 µA)</w:t>
+              <w:t>Iq 1 mA (SD 3 µA)</w:t>
             </w:r>
           </w:p>
         </w:tc>
@@ -2776,33 +2624,7 @@
                 <w:lang w:eastAsia="en-NZ"/>
                 <w14:ligatures w14:val="none"/>
               </w:rPr>
-              <w:t xml:space="preserve">no-load switching a few </w:t>
-            </w:r>
-            <w:proofErr w:type="gramStart"/>
-            <w:r>
-              <w:rPr>
-                <w:rFonts w:ascii="Aptos" w:eastAsia="Aptos" w:hAnsi="Aptos" w:cs="Aptos"/>
-                <w:color w:val="0A0A0A"/>
-                <w:kern w:val="0"/>
-                <w:sz w:val="17"/>
-                <w:szCs w:val="17"/>
-                <w:lang w:eastAsia="en-NZ"/>
-                <w14:ligatures w14:val="none"/>
-              </w:rPr>
-              <w:t>mA</w:t>
-            </w:r>
-            <w:proofErr w:type="gramEnd"/>
-            <w:r>
-              <w:rPr>
-                <w:rFonts w:ascii="Aptos" w:eastAsia="Aptos" w:hAnsi="Aptos" w:cs="Aptos"/>
-                <w:color w:val="0A0A0A"/>
-                <w:kern w:val="0"/>
-                <w:sz w:val="17"/>
-                <w:szCs w:val="17"/>
-                <w:lang w:eastAsia="en-NZ"/>
-                <w14:ligatures w14:val="none"/>
-              </w:rPr>
-              <w:t>; load = payload</w:t>
+              <w:t>no-load switching a few mA; load = payload</w:t>
             </w:r>
           </w:p>
         </w:tc>
@@ -2842,33 +2664,7 @@
                 <w:lang w:eastAsia="en-NZ"/>
                 <w14:ligatures w14:val="none"/>
               </w:rPr>
-              <w:t>MCP2562FD CAN (U</w:t>
-            </w:r>
-            <w:proofErr w:type="gramStart"/>
-            <w:r>
-              <w:rPr>
-                <w:rFonts w:ascii="Aptos" w:eastAsia="Aptos" w:hAnsi="Aptos" w:cs="Aptos"/>
-                <w:color w:val="0A0A0A"/>
-                <w:kern w:val="0"/>
-                <w:sz w:val="17"/>
-                <w:szCs w:val="17"/>
-                <w:lang w:eastAsia="en-NZ"/>
-                <w14:ligatures w14:val="none"/>
-              </w:rPr>
-              <w:t>4,U</w:t>
-            </w:r>
-            <w:proofErr w:type="gramEnd"/>
-            <w:r>
-              <w:rPr>
-                <w:rFonts w:ascii="Aptos" w:eastAsia="Aptos" w:hAnsi="Aptos" w:cs="Aptos"/>
-                <w:color w:val="0A0A0A"/>
-                <w:kern w:val="0"/>
-                <w:sz w:val="17"/>
-                <w:szCs w:val="17"/>
-                <w:lang w:eastAsia="en-NZ"/>
-                <w14:ligatures w14:val="none"/>
-              </w:rPr>
-              <w:t>5)</w:t>
+              <w:t>MCP2562FD CAN (U4,U5)</w:t>
             </w:r>
           </w:p>
         </w:tc>
@@ -3164,7 +2960,6 @@
                 <w14:ligatures w14:val="none"/>
               </w:rPr>
             </w:pPr>
-            <w:proofErr w:type="spellStart"/>
             <w:r>
               <w:rPr>
                 <w:rFonts w:ascii="Aptos" w:eastAsia="Aptos" w:hAnsi="Aptos" w:cs="Aptos"/>
@@ -3175,20 +2970,7 @@
                 <w:lang w:eastAsia="en-NZ"/>
                 <w14:ligatures w14:val="none"/>
               </w:rPr>
-              <w:t>Iq</w:t>
-            </w:r>
-            <w:proofErr w:type="spellEnd"/>
-            <w:r>
-              <w:rPr>
-                <w:rFonts w:ascii="Aptos" w:eastAsia="Aptos" w:hAnsi="Aptos" w:cs="Aptos"/>
-                <w:color w:val="0A0A0A"/>
-                <w:kern w:val="0"/>
-                <w:sz w:val="17"/>
-                <w:szCs w:val="17"/>
-                <w:lang w:eastAsia="en-NZ"/>
-                <w14:ligatures w14:val="none"/>
-              </w:rPr>
-              <w:t xml:space="preserve"> ≈55 µA</w:t>
+              <w:t>Iq ≈55 µA</w:t>
             </w:r>
           </w:p>
         </w:tc>
@@ -3764,33 +3546,7 @@
                 <w:lang w:eastAsia="en-NZ"/>
                 <w14:ligatures w14:val="none"/>
               </w:rPr>
-              <w:t>leakage (</w:t>
-            </w:r>
-            <w:proofErr w:type="spellStart"/>
-            <w:r>
-              <w:rPr>
-                <w:rFonts w:ascii="Aptos" w:eastAsia="Aptos" w:hAnsi="Aptos" w:cs="Aptos"/>
-                <w:color w:val="0A0A0A"/>
-                <w:kern w:val="0"/>
-                <w:sz w:val="17"/>
-                <w:szCs w:val="17"/>
-                <w:lang w:eastAsia="en-NZ"/>
-                <w14:ligatures w14:val="none"/>
-              </w:rPr>
-              <w:t>nA</w:t>
-            </w:r>
-            <w:proofErr w:type="spellEnd"/>
-            <w:r>
-              <w:rPr>
-                <w:rFonts w:ascii="Aptos" w:eastAsia="Aptos" w:hAnsi="Aptos" w:cs="Aptos"/>
-                <w:color w:val="0A0A0A"/>
-                <w:kern w:val="0"/>
-                <w:sz w:val="17"/>
-                <w:szCs w:val="17"/>
-                <w:lang w:eastAsia="en-NZ"/>
-                <w14:ligatures w14:val="none"/>
-              </w:rPr>
-              <w:t>)</w:t>
+              <w:t>leakage (nA)</w:t>
             </w:r>
           </w:p>
         </w:tc>
@@ -4063,111 +3819,7 @@
           <w:lang w:eastAsia="en-NZ"/>
           <w14:ligatures w14:val="none"/>
         </w:rPr>
-        <w:t xml:space="preserve">a lower-rail load costs I₁₂ ≈ </w:t>
-      </w:r>
-      <w:proofErr w:type="spellStart"/>
-      <w:r>
-        <w:rPr>
-          <w:rFonts w:ascii="Aptos" w:eastAsia="Aptos" w:hAnsi="Aptos" w:cs="Aptos"/>
-          <w:color w:val="595959"/>
-          <w:kern w:val="0"/>
-          <w:sz w:val="18"/>
-          <w:szCs w:val="18"/>
-          <w:lang w:eastAsia="en-NZ"/>
-          <w14:ligatures w14:val="none"/>
-        </w:rPr>
-        <w:t>P_load</w:t>
-      </w:r>
-      <w:proofErr w:type="spellEnd"/>
-      <w:r>
-        <w:rPr>
-          <w:rFonts w:ascii="Aptos" w:eastAsia="Aptos" w:hAnsi="Aptos" w:cs="Aptos"/>
-          <w:color w:val="595959"/>
-          <w:kern w:val="0"/>
-          <w:sz w:val="18"/>
-          <w:szCs w:val="18"/>
-          <w:lang w:eastAsia="en-NZ"/>
-          <w14:ligatures w14:val="none"/>
-        </w:rPr>
-        <w:t xml:space="preserve"> </w:t>
-      </w:r>
-      <w:proofErr w:type="gramStart"/>
-      <w:r>
-        <w:rPr>
-          <w:rFonts w:ascii="Aptos" w:eastAsia="Aptos" w:hAnsi="Aptos" w:cs="Aptos"/>
-          <w:color w:val="595959"/>
-          <w:kern w:val="0"/>
-          <w:sz w:val="18"/>
-          <w:szCs w:val="18"/>
-          <w:lang w:eastAsia="en-NZ"/>
-          <w14:ligatures w14:val="none"/>
-        </w:rPr>
-        <w:t>/(</w:t>
-      </w:r>
-      <w:proofErr w:type="gramEnd"/>
-      <w:r>
-        <w:rPr>
-          <w:rFonts w:ascii="Aptos" w:eastAsia="Aptos" w:hAnsi="Aptos" w:cs="Aptos"/>
-          <w:color w:val="595959"/>
-          <w:kern w:val="0"/>
-          <w:sz w:val="18"/>
-          <w:szCs w:val="18"/>
-          <w:lang w:eastAsia="en-NZ"/>
-          <w14:ligatures w14:val="none"/>
-        </w:rPr>
-        <w:t>η·12 V); η≈0.7 at the few-mA LED level, ≈0.85 once a rail carries tens of mA. Buck/</w:t>
-      </w:r>
-      <w:proofErr w:type="spellStart"/>
-      <w:r>
-        <w:rPr>
-          <w:rFonts w:ascii="Aptos" w:eastAsia="Aptos" w:hAnsi="Aptos" w:cs="Aptos"/>
-          <w:color w:val="595959"/>
-          <w:kern w:val="0"/>
-          <w:sz w:val="18"/>
-          <w:szCs w:val="18"/>
-          <w:lang w:eastAsia="en-NZ"/>
-          <w14:ligatures w14:val="none"/>
-        </w:rPr>
-        <w:t>eFuse</w:t>
-      </w:r>
-      <w:proofErr w:type="spellEnd"/>
-      <w:r>
-        <w:rPr>
-          <w:rFonts w:ascii="Aptos" w:eastAsia="Aptos" w:hAnsi="Aptos" w:cs="Aptos"/>
-          <w:color w:val="595959"/>
-          <w:kern w:val="0"/>
-          <w:sz w:val="18"/>
-          <w:szCs w:val="18"/>
-          <w:lang w:eastAsia="en-NZ"/>
-          <w14:ligatures w14:val="none"/>
-        </w:rPr>
-        <w:t xml:space="preserve"> </w:t>
-      </w:r>
-      <w:proofErr w:type="spellStart"/>
-      <w:r>
-        <w:rPr>
-          <w:rFonts w:ascii="Aptos" w:eastAsia="Aptos" w:hAnsi="Aptos" w:cs="Aptos"/>
-          <w:color w:val="595959"/>
-          <w:kern w:val="0"/>
-          <w:sz w:val="18"/>
-          <w:szCs w:val="18"/>
-          <w:lang w:eastAsia="en-NZ"/>
-          <w14:ligatures w14:val="none"/>
-        </w:rPr>
-        <w:t>Iq</w:t>
-      </w:r>
-      <w:proofErr w:type="spellEnd"/>
-      <w:r>
-        <w:rPr>
-          <w:rFonts w:ascii="Aptos" w:eastAsia="Aptos" w:hAnsi="Aptos" w:cs="Aptos"/>
-          <w:color w:val="595959"/>
-          <w:kern w:val="0"/>
-          <w:sz w:val="18"/>
-          <w:szCs w:val="18"/>
-          <w:lang w:eastAsia="en-NZ"/>
-          <w14:ligatures w14:val="none"/>
-        </w:rPr>
-        <w:t xml:space="preserve"> (µA) is negligible.</w:t>
+        <w:t>a lower-rail load costs I₁₂ ≈ P_load /(η·12 V); η≈0.7 at the few-mA LED level, ≈0.85 once a rail carries tens of mA. Buck/eFuse Iq (µA) is negligible.</w:t>
       </w:r>
     </w:p>
     <w:p>
@@ -4207,33 +3859,7 @@
           <w:lang w:eastAsia="en-NZ"/>
           <w14:ligatures w14:val="none"/>
         </w:rPr>
-        <w:t xml:space="preserve">CAN = MCP2562FD (VDD +5V_HK, VIO +3V3_HK, STBY low = always normal). FRAM U14 = MB85RS256. HSE Y1 = 24 </w:t>
-      </w:r>
-      <w:proofErr w:type="spellStart"/>
-      <w:r>
-        <w:rPr>
-          <w:rFonts w:ascii="Aptos" w:eastAsia="Aptos" w:hAnsi="Aptos" w:cs="Aptos"/>
-          <w:color w:val="595959"/>
-          <w:kern w:val="0"/>
-          <w:sz w:val="18"/>
-          <w:szCs w:val="18"/>
-          <w:lang w:eastAsia="en-NZ"/>
-          <w14:ligatures w14:val="none"/>
-        </w:rPr>
-        <w:t>MHz.</w:t>
-      </w:r>
-      <w:proofErr w:type="spellEnd"/>
-      <w:r>
-        <w:rPr>
-          <w:rFonts w:ascii="Aptos" w:eastAsia="Aptos" w:hAnsi="Aptos" w:cs="Aptos"/>
-          <w:color w:val="595959"/>
-          <w:kern w:val="0"/>
-          <w:sz w:val="18"/>
-          <w:szCs w:val="18"/>
-          <w:lang w:eastAsia="en-NZ"/>
-          <w14:ligatures w14:val="none"/>
-        </w:rPr>
-        <w:t xml:space="preserve"> MCU (U3) is not in the supplied BOM — treated as STM32H7 LQFP-100; confirm PN.</w:t>
+        <w:t>CAN = MCP2562FD (VDD +5V_HK, VIO +3V3_HK, STBY low = always normal). FRAM U14 = MB85RS256. HSE Y1 = 24 MHz. MCU (U3) is not in the supplied BOM — treated as STM32H7 LQFP-100; confirm PN.</w:t>
       </w:r>
     </w:p>
     <w:p>
@@ -4388,7 +4014,6 @@
                 <w14:ligatures w14:val="none"/>
               </w:rPr>
             </w:pPr>
-            <w:proofErr w:type="gramStart"/>
             <w:r>
               <w:rPr>
                 <w:rFonts w:ascii="Aptos" w:eastAsia="Aptos" w:hAnsi="Aptos" w:cs="Aptos"/>
@@ -4401,22 +4026,7 @@
                 <w:lang w:eastAsia="en-NZ"/>
                 <w14:ligatures w14:val="none"/>
               </w:rPr>
-              <w:t>Newly-added</w:t>
-            </w:r>
-            <w:proofErr w:type="gramEnd"/>
-            <w:r>
-              <w:rPr>
-                <w:rFonts w:ascii="Aptos" w:eastAsia="Aptos" w:hAnsi="Aptos" w:cs="Aptos"/>
-                <w:b/>
-                <w:bCs/>
-                <w:color w:val="FFFFFF"/>
-                <w:kern w:val="0"/>
-                <w:sz w:val="17"/>
-                <w:szCs w:val="17"/>
-                <w:lang w:eastAsia="en-NZ"/>
-                <w14:ligatures w14:val="none"/>
-              </w:rPr>
-              <w:t xml:space="preserve"> draw</w:t>
+              <w:t>Newly-added draw</w:t>
             </w:r>
           </w:p>
         </w:tc>
@@ -4880,7 +4490,6 @@
                 <w14:ligatures w14:val="none"/>
               </w:rPr>
             </w:pPr>
-            <w:proofErr w:type="spellStart"/>
             <w:r>
               <w:rPr>
                 <w:rFonts w:ascii="Aptos" w:eastAsia="Aptos" w:hAnsi="Aptos" w:cs="Aptos"/>
@@ -4891,46 +4500,7 @@
                 <w:lang w:eastAsia="en-NZ"/>
                 <w14:ligatures w14:val="none"/>
               </w:rPr>
-              <w:t>eFuse</w:t>
-            </w:r>
-            <w:proofErr w:type="spellEnd"/>
-            <w:r>
-              <w:rPr>
-                <w:rFonts w:ascii="Aptos" w:eastAsia="Aptos" w:hAnsi="Aptos" w:cs="Aptos"/>
-                <w:color w:val="0A0A0A"/>
-                <w:kern w:val="0"/>
-                <w:sz w:val="17"/>
-                <w:szCs w:val="17"/>
-                <w:lang w:eastAsia="en-NZ"/>
-                <w14:ligatures w14:val="none"/>
-              </w:rPr>
-              <w:t xml:space="preserve"> </w:t>
-            </w:r>
-            <w:proofErr w:type="spellStart"/>
-            <w:r>
-              <w:rPr>
-                <w:rFonts w:ascii="Aptos" w:eastAsia="Aptos" w:hAnsi="Aptos" w:cs="Aptos"/>
-                <w:color w:val="0A0A0A"/>
-                <w:kern w:val="0"/>
-                <w:sz w:val="17"/>
-                <w:szCs w:val="17"/>
-                <w:lang w:eastAsia="en-NZ"/>
-                <w14:ligatures w14:val="none"/>
-              </w:rPr>
-              <w:t>Iq</w:t>
-            </w:r>
-            <w:proofErr w:type="spellEnd"/>
-            <w:r>
-              <w:rPr>
-                <w:rFonts w:ascii="Aptos" w:eastAsia="Aptos" w:hAnsi="Aptos" w:cs="Aptos"/>
-                <w:color w:val="0A0A0A"/>
-                <w:kern w:val="0"/>
-                <w:sz w:val="17"/>
-                <w:szCs w:val="17"/>
-                <w:lang w:eastAsia="en-NZ"/>
-                <w14:ligatures w14:val="none"/>
-              </w:rPr>
-              <w:t xml:space="preserve"> + D15 LED</w:t>
+              <w:t>eFuse Iq + D15 LED</w:t>
             </w:r>
           </w:p>
         </w:tc>
@@ -5084,22 +4654,8 @@
                 <w:lang w:eastAsia="en-NZ"/>
                 <w14:ligatures w14:val="none"/>
               </w:rPr>
-              <w:t xml:space="preserve">inrush on +12V_PL </w:t>
-            </w:r>
-            <w:proofErr w:type="gramStart"/>
-            <w:r>
-              <w:rPr>
-                <w:rFonts w:ascii="Aptos" w:eastAsia="Aptos" w:hAnsi="Aptos" w:cs="Aptos"/>
-                <w:color w:val="0A0A0A"/>
-                <w:kern w:val="0"/>
-                <w:sz w:val="17"/>
-                <w:szCs w:val="17"/>
-                <w:lang w:eastAsia="en-NZ"/>
-                <w14:ligatures w14:val="none"/>
-              </w:rPr>
-              <w:t>soft-start</w:t>
-            </w:r>
-            <w:proofErr w:type="gramEnd"/>
+              <w:t>inrush on +12V_PL soft-start</w:t>
+            </w:r>
           </w:p>
         </w:tc>
       </w:tr>
@@ -5176,33 +4732,7 @@
                 <w:lang w:eastAsia="en-NZ"/>
                 <w14:ligatures w14:val="none"/>
               </w:rPr>
-              <w:t>HK bucks + D</w:t>
-            </w:r>
-            <w:proofErr w:type="gramStart"/>
-            <w:r>
-              <w:rPr>
-                <w:rFonts w:ascii="Aptos" w:eastAsia="Aptos" w:hAnsi="Aptos" w:cs="Aptos"/>
-                <w:color w:val="0A0A0A"/>
-                <w:kern w:val="0"/>
-                <w:sz w:val="17"/>
-                <w:szCs w:val="17"/>
-                <w:lang w:eastAsia="en-NZ"/>
-                <w14:ligatures w14:val="none"/>
-              </w:rPr>
-              <w:t>9,D</w:t>
-            </w:r>
-            <w:proofErr w:type="gramEnd"/>
-            <w:r>
-              <w:rPr>
-                <w:rFonts w:ascii="Aptos" w:eastAsia="Aptos" w:hAnsi="Aptos" w:cs="Aptos"/>
-                <w:color w:val="0A0A0A"/>
-                <w:kern w:val="0"/>
-                <w:sz w:val="17"/>
-                <w:szCs w:val="17"/>
-                <w:lang w:eastAsia="en-NZ"/>
-                <w14:ligatures w14:val="none"/>
-              </w:rPr>
-              <w:t>10</w:t>
+              <w:t>HK bucks + D9,D10</w:t>
             </w:r>
           </w:p>
         </w:tc>
@@ -6130,33 +5660,7 @@
                 <w:lang w:eastAsia="en-NZ"/>
                 <w14:ligatures w14:val="none"/>
               </w:rPr>
-              <w:t>PL rails: D</w:t>
-            </w:r>
-            <w:proofErr w:type="gramStart"/>
-            <w:r>
-              <w:rPr>
-                <w:rFonts w:ascii="Aptos" w:eastAsia="Aptos" w:hAnsi="Aptos" w:cs="Aptos"/>
-                <w:color w:val="0A0A0A"/>
-                <w:kern w:val="0"/>
-                <w:sz w:val="17"/>
-                <w:szCs w:val="17"/>
-                <w:lang w:eastAsia="en-NZ"/>
-                <w14:ligatures w14:val="none"/>
-              </w:rPr>
-              <w:t>11,D</w:t>
-            </w:r>
-            <w:proofErr w:type="gramEnd"/>
-            <w:r>
-              <w:rPr>
-                <w:rFonts w:ascii="Aptos" w:eastAsia="Aptos" w:hAnsi="Aptos" w:cs="Aptos"/>
-                <w:color w:val="0A0A0A"/>
-                <w:kern w:val="0"/>
-                <w:sz w:val="17"/>
-                <w:szCs w:val="17"/>
-                <w:lang w:eastAsia="en-NZ"/>
-                <w14:ligatures w14:val="none"/>
-              </w:rPr>
-              <w:t>12 + VARI</w:t>
+              <w:t>PL rails: D11,D12 + VARI</w:t>
             </w:r>
           </w:p>
         </w:tc>
@@ -7143,33 +6647,7 @@
           <w:lang w:eastAsia="en-NZ"/>
           <w14:ligatures w14:val="none"/>
         </w:rPr>
-        <w:t xml:space="preserve"> </w:t>
-      </w:r>
-      <w:proofErr w:type="gramStart"/>
-      <w:r>
-        <w:rPr>
-          <w:rFonts w:ascii="Aptos Display" w:eastAsia="Aptos Display" w:hAnsi="Aptos Display" w:cs="Aptos Display"/>
-          <w:color w:val="0F4761"/>
-          <w:kern w:val="0"/>
-          <w:sz w:val="30"/>
-          <w:szCs w:val="30"/>
-          <w:lang w:eastAsia="en-NZ"/>
-          <w14:ligatures w14:val="none"/>
-        </w:rPr>
-        <w:t>Bare-board</w:t>
-      </w:r>
-      <w:proofErr w:type="gramEnd"/>
-      <w:r>
-        <w:rPr>
-          <w:rFonts w:ascii="Aptos Display" w:eastAsia="Aptos Display" w:hAnsi="Aptos Display" w:cs="Aptos Display"/>
-          <w:color w:val="0F4761"/>
-          <w:kern w:val="0"/>
-          <w:sz w:val="30"/>
-          <w:szCs w:val="30"/>
-          <w:lang w:eastAsia="en-NZ"/>
-          <w14:ligatures w14:val="none"/>
-        </w:rPr>
-        <w:t xml:space="preserve"> &amp; kit</w:t>
+        <w:t xml:space="preserve"> Bare-board &amp; kit</w:t>
       </w:r>
       <w:bookmarkEnd w:id="5"/>
     </w:p>
@@ -8077,33 +7555,7 @@
           <w:lang w:eastAsia="en-NZ"/>
           <w14:ligatures w14:val="none"/>
         </w:rPr>
-        <w:t xml:space="preserve"> </w:t>
-      </w:r>
-      <w:proofErr w:type="spellStart"/>
-      <w:r>
-        <w:rPr>
-          <w:rFonts w:ascii="Aptos Display" w:eastAsia="Aptos Display" w:hAnsi="Aptos Display" w:cs="Aptos Display"/>
-          <w:color w:val="0F4761"/>
-          <w:kern w:val="0"/>
-          <w:sz w:val="30"/>
-          <w:szCs w:val="30"/>
-          <w:lang w:eastAsia="en-NZ"/>
-          <w14:ligatures w14:val="none"/>
-        </w:rPr>
-        <w:t>eFuse</w:t>
-      </w:r>
-      <w:proofErr w:type="spellEnd"/>
-      <w:r>
-        <w:rPr>
-          <w:rFonts w:ascii="Aptos Display" w:eastAsia="Aptos Display" w:hAnsi="Aptos Display" w:cs="Aptos Display"/>
-          <w:color w:val="0F4761"/>
-          <w:kern w:val="0"/>
-          <w:sz w:val="30"/>
-          <w:szCs w:val="30"/>
-          <w:lang w:eastAsia="en-NZ"/>
-          <w14:ligatures w14:val="none"/>
-        </w:rPr>
-        <w:t xml:space="preserve"> → +12V_PL</w:t>
+        <w:t xml:space="preserve"> eFuse → +12V_PL</w:t>
       </w:r>
       <w:bookmarkEnd w:id="7"/>
     </w:p>
@@ -8186,33 +7638,7 @@
           <w:lang w:eastAsia="en-NZ"/>
           <w14:ligatures w14:val="none"/>
         </w:rPr>
-        <w:t xml:space="preserve">Fused payload bus with </w:t>
-      </w:r>
-      <w:proofErr w:type="gramStart"/>
-      <w:r>
-        <w:rPr>
-          <w:rFonts w:ascii="Aptos" w:eastAsia="Aptos" w:hAnsi="Aptos" w:cs="Aptos"/>
-          <w:color w:val="0D0D0D" w:themeColor="text1" w:themeTint="F2"/>
-          <w:kern w:val="0"/>
-          <w:sz w:val="19"/>
-          <w:szCs w:val="19"/>
-          <w:lang w:eastAsia="en-NZ"/>
-          <w14:ligatures w14:val="none"/>
-        </w:rPr>
-        <w:t>soft-start</w:t>
-      </w:r>
-      <w:proofErr w:type="gramEnd"/>
-      <w:r>
-        <w:rPr>
-          <w:rFonts w:ascii="Aptos" w:eastAsia="Aptos" w:hAnsi="Aptos" w:cs="Aptos"/>
-          <w:color w:val="0D0D0D" w:themeColor="text1" w:themeTint="F2"/>
-          <w:kern w:val="0"/>
-          <w:sz w:val="19"/>
-          <w:szCs w:val="19"/>
-          <w:lang w:eastAsia="en-NZ"/>
-          <w14:ligatures w14:val="none"/>
-        </w:rPr>
-        <w:t xml:space="preserve"> + UVLO.</w:t>
+        <w:t>Fused payload bus with soft-start + UVLO.</w:t>
       </w:r>
     </w:p>
     <w:p>
@@ -8444,59 +7870,7 @@
           <w:lang w:eastAsia="en-NZ"/>
           <w14:ligatures w14:val="none"/>
         </w:rPr>
-        <w:t xml:space="preserve">~10 mA cumulative (adds </w:t>
-      </w:r>
-      <w:proofErr w:type="spellStart"/>
-      <w:r>
-        <w:rPr>
-          <w:rFonts w:ascii="Aptos" w:eastAsia="Aptos" w:hAnsi="Aptos" w:cs="Aptos"/>
-          <w:color w:val="0D0D0D" w:themeColor="text1" w:themeTint="F2"/>
-          <w:kern w:val="0"/>
-          <w:sz w:val="21"/>
-          <w:szCs w:val="21"/>
-          <w:lang w:eastAsia="en-NZ"/>
-          <w14:ligatures w14:val="none"/>
-        </w:rPr>
-        <w:t>eFuse</w:t>
-      </w:r>
-      <w:proofErr w:type="spellEnd"/>
-      <w:r>
-        <w:rPr>
-          <w:rFonts w:ascii="Aptos" w:eastAsia="Aptos" w:hAnsi="Aptos" w:cs="Aptos"/>
-          <w:color w:val="0D0D0D" w:themeColor="text1" w:themeTint="F2"/>
-          <w:kern w:val="0"/>
-          <w:sz w:val="21"/>
-          <w:szCs w:val="21"/>
-          <w:lang w:eastAsia="en-NZ"/>
-          <w14:ligatures w14:val="none"/>
-        </w:rPr>
-        <w:t xml:space="preserve"> </w:t>
-      </w:r>
-      <w:proofErr w:type="spellStart"/>
-      <w:r>
-        <w:rPr>
-          <w:rFonts w:ascii="Aptos" w:eastAsia="Aptos" w:hAnsi="Aptos" w:cs="Aptos"/>
-          <w:color w:val="0D0D0D" w:themeColor="text1" w:themeTint="F2"/>
-          <w:kern w:val="0"/>
-          <w:sz w:val="21"/>
-          <w:szCs w:val="21"/>
-          <w:lang w:eastAsia="en-NZ"/>
-          <w14:ligatures w14:val="none"/>
-        </w:rPr>
-        <w:t>Iq</w:t>
-      </w:r>
-      <w:proofErr w:type="spellEnd"/>
-      <w:r>
-        <w:rPr>
-          <w:rFonts w:ascii="Aptos" w:eastAsia="Aptos" w:hAnsi="Aptos" w:cs="Aptos"/>
-          <w:color w:val="0D0D0D" w:themeColor="text1" w:themeTint="F2"/>
-          <w:kern w:val="0"/>
-          <w:sz w:val="21"/>
-          <w:szCs w:val="21"/>
-          <w:lang w:eastAsia="en-NZ"/>
-          <w14:ligatures w14:val="none"/>
-        </w:rPr>
-        <w:t xml:space="preserve"> 0.18 mA + D15 ~5 mA).</w:t>
+        <w:t>~10 mA cumulative (adds eFuse Iq 0.18 mA + D15 ~5 mA).</w:t>
       </w:r>
     </w:p>
     <w:p>
@@ -8554,33 +7928,7 @@
           <w:lang w:eastAsia="en-NZ"/>
           <w14:ligatures w14:val="none"/>
         </w:rPr>
-        <w:t xml:space="preserve">+12V_PL ~12 V, </w:t>
-      </w:r>
-      <w:proofErr w:type="gramStart"/>
-      <w:r>
-        <w:rPr>
-          <w:rFonts w:ascii="Aptos" w:eastAsia="Aptos" w:hAnsi="Aptos" w:cs="Aptos"/>
-          <w:color w:val="0D0D0D" w:themeColor="text1" w:themeTint="F2"/>
-          <w:kern w:val="0"/>
-          <w:sz w:val="21"/>
-          <w:szCs w:val="21"/>
-          <w:lang w:eastAsia="en-NZ"/>
-          <w14:ligatures w14:val="none"/>
-        </w:rPr>
-        <w:t>clean soft</w:t>
-      </w:r>
-      <w:proofErr w:type="gramEnd"/>
-      <w:r>
-        <w:rPr>
-          <w:rFonts w:ascii="Aptos" w:eastAsia="Aptos" w:hAnsi="Aptos" w:cs="Aptos"/>
-          <w:color w:val="0D0D0D" w:themeColor="text1" w:themeTint="F2"/>
-          <w:kern w:val="0"/>
-          <w:sz w:val="21"/>
-          <w:szCs w:val="21"/>
-          <w:lang w:eastAsia="en-NZ"/>
-          <w14:ligatures w14:val="none"/>
-        </w:rPr>
-        <w:t>-start, UVLO ~8.1 V, no latched fault.</w:t>
+        <w:t>+12V_PL ~12 V, clean soft-start, UVLO ~8.1 V, no latched fault.</w:t>
       </w:r>
     </w:p>
     <w:p>
@@ -8788,163 +8136,7 @@
           <w:lang w:eastAsia="en-NZ"/>
           <w14:ligatures w14:val="none"/>
         </w:rPr>
-        <w:t>Per rail: U6+L1(+</w:t>
-      </w:r>
-      <w:proofErr w:type="gramStart"/>
-      <w:r>
-        <w:rPr>
-          <w:rFonts w:ascii="Aptos" w:eastAsia="Aptos" w:hAnsi="Aptos" w:cs="Aptos"/>
-          <w:color w:val="0D0D0D" w:themeColor="text1" w:themeTint="F2"/>
-          <w:kern w:val="0"/>
-          <w:sz w:val="20"/>
-          <w:szCs w:val="20"/>
-          <w:lang w:eastAsia="en-NZ"/>
-          <w14:ligatures w14:val="none"/>
-        </w:rPr>
-        <w:t>caps,R45,C37,R</w:t>
-      </w:r>
-      <w:proofErr w:type="gramEnd"/>
-      <w:r>
-        <w:rPr>
-          <w:rFonts w:ascii="Aptos" w:eastAsia="Aptos" w:hAnsi="Aptos" w:cs="Aptos"/>
-          <w:color w:val="0D0D0D" w:themeColor="text1" w:themeTint="F2"/>
-          <w:kern w:val="0"/>
-          <w:sz w:val="20"/>
-          <w:szCs w:val="20"/>
-          <w:lang w:eastAsia="en-NZ"/>
-          <w14:ligatures w14:val="none"/>
-        </w:rPr>
-        <w:t>25/R</w:t>
-      </w:r>
-      <w:proofErr w:type="gramStart"/>
-      <w:r>
-        <w:rPr>
-          <w:rFonts w:ascii="Aptos" w:eastAsia="Aptos" w:hAnsi="Aptos" w:cs="Aptos"/>
-          <w:color w:val="0D0D0D" w:themeColor="text1" w:themeTint="F2"/>
-          <w:kern w:val="0"/>
-          <w:sz w:val="20"/>
-          <w:szCs w:val="20"/>
-          <w:lang w:eastAsia="en-NZ"/>
-          <w14:ligatures w14:val="none"/>
-        </w:rPr>
-        <w:t>26,D</w:t>
-      </w:r>
-      <w:proofErr w:type="gramEnd"/>
-      <w:r>
-        <w:rPr>
-          <w:rFonts w:ascii="Aptos" w:eastAsia="Aptos" w:hAnsi="Aptos" w:cs="Aptos"/>
-          <w:color w:val="0D0D0D" w:themeColor="text1" w:themeTint="F2"/>
-          <w:kern w:val="0"/>
-          <w:sz w:val="20"/>
-          <w:szCs w:val="20"/>
-          <w:lang w:eastAsia="en-NZ"/>
-          <w14:ligatures w14:val="none"/>
-        </w:rPr>
-        <w:t>9/R</w:t>
-      </w:r>
-      <w:proofErr w:type="gramStart"/>
-      <w:r>
-        <w:rPr>
-          <w:rFonts w:ascii="Aptos" w:eastAsia="Aptos" w:hAnsi="Aptos" w:cs="Aptos"/>
-          <w:color w:val="0D0D0D" w:themeColor="text1" w:themeTint="F2"/>
-          <w:kern w:val="0"/>
-          <w:sz w:val="20"/>
-          <w:szCs w:val="20"/>
-          <w:lang w:eastAsia="en-NZ"/>
-          <w14:ligatures w14:val="none"/>
-        </w:rPr>
-        <w:t>31)=</w:t>
-      </w:r>
-      <w:proofErr w:type="gramEnd"/>
-      <w:r>
-        <w:rPr>
-          <w:rFonts w:ascii="Aptos" w:eastAsia="Aptos" w:hAnsi="Aptos" w:cs="Aptos"/>
-          <w:color w:val="0D0D0D" w:themeColor="text1" w:themeTint="F2"/>
-          <w:kern w:val="0"/>
-          <w:sz w:val="20"/>
-          <w:szCs w:val="20"/>
-          <w:lang w:eastAsia="en-NZ"/>
-          <w14:ligatures w14:val="none"/>
-        </w:rPr>
-        <w:t>5V_HK; U7+L2(R27/R</w:t>
-      </w:r>
-      <w:proofErr w:type="gramStart"/>
-      <w:r>
-        <w:rPr>
-          <w:rFonts w:ascii="Aptos" w:eastAsia="Aptos" w:hAnsi="Aptos" w:cs="Aptos"/>
-          <w:color w:val="0D0D0D" w:themeColor="text1" w:themeTint="F2"/>
-          <w:kern w:val="0"/>
-          <w:sz w:val="20"/>
-          <w:szCs w:val="20"/>
-          <w:lang w:eastAsia="en-NZ"/>
-          <w14:ligatures w14:val="none"/>
-        </w:rPr>
-        <w:t>28,D</w:t>
-      </w:r>
-      <w:proofErr w:type="gramEnd"/>
-      <w:r>
-        <w:rPr>
-          <w:rFonts w:ascii="Aptos" w:eastAsia="Aptos" w:hAnsi="Aptos" w:cs="Aptos"/>
-          <w:color w:val="0D0D0D" w:themeColor="text1" w:themeTint="F2"/>
-          <w:kern w:val="0"/>
-          <w:sz w:val="20"/>
-          <w:szCs w:val="20"/>
-          <w:lang w:eastAsia="en-NZ"/>
-          <w14:ligatures w14:val="none"/>
-        </w:rPr>
-        <w:t>10/R</w:t>
-      </w:r>
-      <w:proofErr w:type="gramStart"/>
-      <w:r>
-        <w:rPr>
-          <w:rFonts w:ascii="Aptos" w:eastAsia="Aptos" w:hAnsi="Aptos" w:cs="Aptos"/>
-          <w:color w:val="0D0D0D" w:themeColor="text1" w:themeTint="F2"/>
-          <w:kern w:val="0"/>
-          <w:sz w:val="20"/>
-          <w:szCs w:val="20"/>
-          <w:lang w:eastAsia="en-NZ"/>
-          <w14:ligatures w14:val="none"/>
-        </w:rPr>
-        <w:t>32)=</w:t>
-      </w:r>
-      <w:proofErr w:type="gramEnd"/>
-      <w:r>
-        <w:rPr>
-          <w:rFonts w:ascii="Aptos" w:eastAsia="Aptos" w:hAnsi="Aptos" w:cs="Aptos"/>
-          <w:color w:val="0D0D0D" w:themeColor="text1" w:themeTint="F2"/>
-          <w:kern w:val="0"/>
-          <w:sz w:val="20"/>
-          <w:szCs w:val="20"/>
-          <w:lang w:eastAsia="en-NZ"/>
-          <w14:ligatures w14:val="none"/>
-        </w:rPr>
-        <w:t>3V3_HK; U8+L3(R29/R</w:t>
-      </w:r>
-      <w:proofErr w:type="gramStart"/>
-      <w:r>
-        <w:rPr>
-          <w:rFonts w:ascii="Aptos" w:eastAsia="Aptos" w:hAnsi="Aptos" w:cs="Aptos"/>
-          <w:color w:val="0D0D0D" w:themeColor="text1" w:themeTint="F2"/>
-          <w:kern w:val="0"/>
-          <w:sz w:val="20"/>
-          <w:szCs w:val="20"/>
-          <w:lang w:eastAsia="en-NZ"/>
-          <w14:ligatures w14:val="none"/>
-        </w:rPr>
-        <w:t>30)=</w:t>
-      </w:r>
-      <w:proofErr w:type="gramEnd"/>
-      <w:r>
-        <w:rPr>
-          <w:rFonts w:ascii="Aptos" w:eastAsia="Aptos" w:hAnsi="Aptos" w:cs="Aptos"/>
-          <w:color w:val="0D0D0D" w:themeColor="text1" w:themeTint="F2"/>
-          <w:kern w:val="0"/>
-          <w:sz w:val="20"/>
-          <w:szCs w:val="20"/>
-          <w:lang w:eastAsia="en-NZ"/>
-          <w14:ligatures w14:val="none"/>
-        </w:rPr>
-        <w:t>1V2_HK.</w:t>
+        <w:t>Per rail: U6+L1(+caps,R45,C37,R25/R26,D9/R31)=5V_HK; U7+L2(R27/R28,D10/R32)=3V3_HK; U8+L3(R29/R30)=1V2_HK.</w:t>
       </w:r>
     </w:p>
     <w:p>
@@ -9064,33 +8256,7 @@
           <w:lang w:eastAsia="en-NZ"/>
           <w14:ligatures w14:val="none"/>
         </w:rPr>
-        <w:t xml:space="preserve">Now +3V3_HK is up → re-check </w:t>
-      </w:r>
-      <w:proofErr w:type="spellStart"/>
-      <w:r>
-        <w:rPr>
-          <w:rFonts w:ascii="Aptos" w:eastAsia="Aptos" w:hAnsi="Aptos" w:cs="Aptos"/>
-          <w:color w:val="0D0D0D" w:themeColor="text1" w:themeTint="F2"/>
-          <w:kern w:val="0"/>
-          <w:sz w:val="21"/>
-          <w:szCs w:val="21"/>
-          <w:lang w:eastAsia="en-NZ"/>
-          <w14:ligatures w14:val="none"/>
-        </w:rPr>
-        <w:t>eFuse</w:t>
-      </w:r>
-      <w:proofErr w:type="spellEnd"/>
-      <w:r>
-        <w:rPr>
-          <w:rFonts w:ascii="Aptos" w:eastAsia="Aptos" w:hAnsi="Aptos" w:cs="Aptos"/>
-          <w:color w:val="0D0D0D" w:themeColor="text1" w:themeTint="F2"/>
-          <w:kern w:val="0"/>
-          <w:sz w:val="21"/>
-          <w:szCs w:val="21"/>
-          <w:lang w:eastAsia="en-NZ"/>
-          <w14:ligatures w14:val="none"/>
-        </w:rPr>
-        <w:t xml:space="preserve"> FLT_N = high (no fault).</w:t>
+        <w:t>Now +3V3_HK is up → re-check eFuse FLT_N = high (no fault).</w:t>
       </w:r>
     </w:p>
     <w:p>
@@ -9175,59 +8341,7 @@
           <w:lang w:eastAsia="en-NZ"/>
           <w14:ligatures w14:val="none"/>
         </w:rPr>
-        <w:t>~15 mA cumulative (D</w:t>
-      </w:r>
-      <w:proofErr w:type="gramStart"/>
-      <w:r>
-        <w:rPr>
-          <w:rFonts w:ascii="Aptos" w:eastAsia="Aptos" w:hAnsi="Aptos" w:cs="Aptos"/>
-          <w:color w:val="0D0D0D" w:themeColor="text1" w:themeTint="F2"/>
-          <w:kern w:val="0"/>
-          <w:sz w:val="21"/>
-          <w:szCs w:val="21"/>
-          <w:lang w:eastAsia="en-NZ"/>
-          <w14:ligatures w14:val="none"/>
-        </w:rPr>
-        <w:t>9,D</w:t>
-      </w:r>
-      <w:proofErr w:type="gramEnd"/>
-      <w:r>
-        <w:rPr>
-          <w:rFonts w:ascii="Aptos" w:eastAsia="Aptos" w:hAnsi="Aptos" w:cs="Aptos"/>
-          <w:color w:val="0D0D0D" w:themeColor="text1" w:themeTint="F2"/>
-          <w:kern w:val="0"/>
-          <w:sz w:val="21"/>
-          <w:szCs w:val="21"/>
-          <w:lang w:eastAsia="en-NZ"/>
-          <w14:ligatures w14:val="none"/>
-        </w:rPr>
-        <w:t xml:space="preserve">10 reflected ~5 mA; buck </w:t>
-      </w:r>
-      <w:proofErr w:type="spellStart"/>
-      <w:r>
-        <w:rPr>
-          <w:rFonts w:ascii="Aptos" w:eastAsia="Aptos" w:hAnsi="Aptos" w:cs="Aptos"/>
-          <w:color w:val="0D0D0D" w:themeColor="text1" w:themeTint="F2"/>
-          <w:kern w:val="0"/>
-          <w:sz w:val="21"/>
-          <w:szCs w:val="21"/>
-          <w:lang w:eastAsia="en-NZ"/>
-          <w14:ligatures w14:val="none"/>
-        </w:rPr>
-        <w:t>Iq</w:t>
-      </w:r>
-      <w:proofErr w:type="spellEnd"/>
-      <w:r>
-        <w:rPr>
-          <w:rFonts w:ascii="Aptos" w:eastAsia="Aptos" w:hAnsi="Aptos" w:cs="Aptos"/>
-          <w:color w:val="0D0D0D" w:themeColor="text1" w:themeTint="F2"/>
-          <w:kern w:val="0"/>
-          <w:sz w:val="21"/>
-          <w:szCs w:val="21"/>
-          <w:lang w:eastAsia="en-NZ"/>
-          <w14:ligatures w14:val="none"/>
-        </w:rPr>
-        <w:t xml:space="preserve"> negligible).</w:t>
+        <w:t>~15 mA cumulative (D9,D10 reflected ~5 mA; buck Iq negligible).</w:t>
       </w:r>
     </w:p>
     <w:p>
@@ -9285,59 +8399,7 @@
           <w:lang w:eastAsia="en-NZ"/>
           <w14:ligatures w14:val="none"/>
         </w:rPr>
-        <w:t xml:space="preserve">All three HK rails in </w:t>
-      </w:r>
-      <w:proofErr w:type="spellStart"/>
-      <w:r>
-        <w:rPr>
-          <w:rFonts w:ascii="Aptos" w:eastAsia="Aptos" w:hAnsi="Aptos" w:cs="Aptos"/>
-          <w:color w:val="0D0D0D" w:themeColor="text1" w:themeTint="F2"/>
-          <w:kern w:val="0"/>
-          <w:sz w:val="21"/>
-          <w:szCs w:val="21"/>
-          <w:lang w:eastAsia="en-NZ"/>
-          <w14:ligatures w14:val="none"/>
-        </w:rPr>
-        <w:t>tol</w:t>
-      </w:r>
-      <w:proofErr w:type="spellEnd"/>
-      <w:r>
-        <w:rPr>
-          <w:rFonts w:ascii="Aptos" w:eastAsia="Aptos" w:hAnsi="Aptos" w:cs="Aptos"/>
-          <w:color w:val="0D0D0D" w:themeColor="text1" w:themeTint="F2"/>
-          <w:kern w:val="0"/>
-          <w:sz w:val="21"/>
-          <w:szCs w:val="21"/>
-          <w:lang w:eastAsia="en-NZ"/>
-          <w14:ligatures w14:val="none"/>
-        </w:rPr>
-        <w:t xml:space="preserve">, ripple/thermals OK, </w:t>
-      </w:r>
-      <w:proofErr w:type="spellStart"/>
-      <w:r>
-        <w:rPr>
-          <w:rFonts w:ascii="Aptos" w:eastAsia="Aptos" w:hAnsi="Aptos" w:cs="Aptos"/>
-          <w:color w:val="0D0D0D" w:themeColor="text1" w:themeTint="F2"/>
-          <w:kern w:val="0"/>
-          <w:sz w:val="21"/>
-          <w:szCs w:val="21"/>
-          <w:lang w:eastAsia="en-NZ"/>
-          <w14:ligatures w14:val="none"/>
-        </w:rPr>
-        <w:t>eFuse</w:t>
-      </w:r>
-      <w:proofErr w:type="spellEnd"/>
-      <w:r>
-        <w:rPr>
-          <w:rFonts w:ascii="Aptos" w:eastAsia="Aptos" w:hAnsi="Aptos" w:cs="Aptos"/>
-          <w:color w:val="0D0D0D" w:themeColor="text1" w:themeTint="F2"/>
-          <w:kern w:val="0"/>
-          <w:sz w:val="21"/>
-          <w:szCs w:val="21"/>
-          <w:lang w:eastAsia="en-NZ"/>
-          <w14:ligatures w14:val="none"/>
-        </w:rPr>
-        <w:t xml:space="preserve"> fault healthy.</w:t>
+        <w:t>All three HK rails in tol, ripple/thermals OK, eFuse fault healthy.</w:t>
       </w:r>
     </w:p>
     <w:p>
@@ -10226,7 +9288,6 @@
           <w14:ligatures w14:val="none"/>
         </w:rPr>
       </w:pPr>
-      <w:proofErr w:type="spellStart"/>
       <w:r>
         <w:rPr>
           <w:rFonts w:ascii="Aptos" w:eastAsia="Aptos" w:hAnsi="Aptos" w:cs="Aptos"/>
@@ -10237,20 +9298,7 @@
           <w:lang w:eastAsia="en-NZ"/>
           <w14:ligatures w14:val="none"/>
         </w:rPr>
-        <w:t>nRST</w:t>
-      </w:r>
-      <w:proofErr w:type="spellEnd"/>
-      <w:r>
-        <w:rPr>
-          <w:rFonts w:ascii="Aptos" w:eastAsia="Aptos" w:hAnsi="Aptos" w:cs="Aptos"/>
-          <w:color w:val="0D0D0D" w:themeColor="text1" w:themeTint="F2"/>
-          <w:kern w:val="0"/>
-          <w:sz w:val="21"/>
-          <w:szCs w:val="21"/>
-          <w:lang w:eastAsia="en-NZ"/>
-          <w14:ligatures w14:val="none"/>
-        </w:rPr>
-        <w:t xml:space="preserve"> idle ~3.3 V, SW1 → 0 V; BOOT0 low with J8 open.</w:t>
+        <w:t>nRST idle ~3.3 V, SW1 → 0 V; BOOT0 low with J8 open.</w:t>
       </w:r>
     </w:p>
     <w:p>
@@ -10310,33 +9358,7 @@
           <w:lang w:eastAsia="en-NZ"/>
           <w14:ligatures w14:val="none"/>
         </w:rPr>
-        <w:t xml:space="preserve">J8 </w:t>
-      </w:r>
-      <w:proofErr w:type="spellStart"/>
-      <w:r>
-        <w:rPr>
-          <w:rFonts w:ascii="Aptos" w:eastAsia="Aptos" w:hAnsi="Aptos" w:cs="Aptos"/>
-          <w:color w:val="0D0D0D" w:themeColor="text1" w:themeTint="F2"/>
-          <w:kern w:val="0"/>
-          <w:sz w:val="21"/>
-          <w:szCs w:val="21"/>
-          <w:lang w:eastAsia="en-NZ"/>
-          <w14:ligatures w14:val="none"/>
-        </w:rPr>
-        <w:t>jumpered</w:t>
-      </w:r>
-      <w:proofErr w:type="spellEnd"/>
-      <w:r>
-        <w:rPr>
-          <w:rFonts w:ascii="Aptos" w:eastAsia="Aptos" w:hAnsi="Aptos" w:cs="Aptos"/>
-          <w:color w:val="0D0D0D" w:themeColor="text1" w:themeTint="F2"/>
-          <w:kern w:val="0"/>
-          <w:sz w:val="21"/>
-          <w:szCs w:val="21"/>
-          <w:lang w:eastAsia="en-NZ"/>
-          <w14:ligatures w14:val="none"/>
-        </w:rPr>
-        <w:t xml:space="preserve"> (BOOT0 high) + USB → enumerates as ‘STM32 BOOTLOADER’ (DFU).</w:t>
+        <w:t>J8 jumpered (BOOT0 high) + USB → enumerates as ‘STM32 BOOTLOADER’ (DFU).</w:t>
       </w:r>
     </w:p>
     <w:p>
@@ -10686,33 +9708,7 @@
           <w:lang w:eastAsia="en-NZ"/>
           <w14:ligatures w14:val="none"/>
         </w:rPr>
-        <w:t>Optional: D</w:t>
-      </w:r>
-      <w:proofErr w:type="gramStart"/>
-      <w:r>
-        <w:rPr>
-          <w:rFonts w:ascii="Aptos" w:eastAsia="Aptos" w:hAnsi="Aptos" w:cs="Aptos"/>
-          <w:color w:val="0D0D0D" w:themeColor="text1" w:themeTint="F2"/>
-          <w:kern w:val="0"/>
-          <w:sz w:val="20"/>
-          <w:szCs w:val="20"/>
-          <w:lang w:eastAsia="en-NZ"/>
-          <w14:ligatures w14:val="none"/>
-        </w:rPr>
-        <w:t>5,D</w:t>
-      </w:r>
-      <w:proofErr w:type="gramEnd"/>
-      <w:r>
-        <w:rPr>
-          <w:rFonts w:ascii="Aptos" w:eastAsia="Aptos" w:hAnsi="Aptos" w:cs="Aptos"/>
-          <w:color w:val="0D0D0D" w:themeColor="text1" w:themeTint="F2"/>
-          <w:kern w:val="0"/>
-          <w:sz w:val="20"/>
-          <w:szCs w:val="20"/>
-          <w:lang w:eastAsia="en-NZ"/>
-          <w14:ligatures w14:val="none"/>
-        </w:rPr>
-        <w:t>6 + R81/R82 100R (TEST LEDs on PB8/PB9).</w:t>
+        <w:t>Optional: D5,D6 + R81/R82 100R (TEST LEDs on PB8/PB9).</w:t>
       </w:r>
     </w:p>
     <w:p>
@@ -11152,33 +10148,7 @@
           <w:lang w:eastAsia="en-NZ"/>
           <w14:ligatures w14:val="none"/>
         </w:rPr>
-        <w:t>U13 (MT29F1G01) + C80/C81, R59 10k (</w:t>
-      </w:r>
-      <w:proofErr w:type="spellStart"/>
-      <w:r>
-        <w:rPr>
-          <w:rFonts w:ascii="Aptos" w:eastAsia="Aptos" w:hAnsi="Aptos" w:cs="Aptos"/>
-          <w:color w:val="0D0D0D" w:themeColor="text1" w:themeTint="F2"/>
-          <w:kern w:val="0"/>
-          <w:sz w:val="20"/>
-          <w:szCs w:val="20"/>
-          <w:lang w:eastAsia="en-NZ"/>
-          <w14:ligatures w14:val="none"/>
-        </w:rPr>
-        <w:t>nCS</w:t>
-      </w:r>
-      <w:proofErr w:type="spellEnd"/>
-      <w:r>
-        <w:rPr>
-          <w:rFonts w:ascii="Aptos" w:eastAsia="Aptos" w:hAnsi="Aptos" w:cs="Aptos"/>
-          <w:color w:val="0D0D0D" w:themeColor="text1" w:themeTint="F2"/>
-          <w:kern w:val="0"/>
-          <w:sz w:val="20"/>
-          <w:szCs w:val="20"/>
-          <w:lang w:eastAsia="en-NZ"/>
-          <w14:ligatures w14:val="none"/>
-        </w:rPr>
-        <w:t>), R60/R61 10k (WP#/HOLD#); U14 (MB85RS256) + decoupling.</w:t>
+        <w:t>U13 (MT29F1G01) + C80/C81, R59 10k (nCS), R60/R61 10k (WP#/HOLD#); U14 (MB85RS256) + decoupling.</w:t>
       </w:r>
     </w:p>
     <w:p>
@@ -11238,33 +10208,7 @@
           <w:lang w:eastAsia="en-NZ"/>
           <w14:ligatures w14:val="none"/>
         </w:rPr>
-        <w:t xml:space="preserve">NAND </w:t>
-      </w:r>
-      <w:proofErr w:type="gramStart"/>
-      <w:r>
-        <w:rPr>
-          <w:rFonts w:ascii="Aptos" w:eastAsia="Aptos" w:hAnsi="Aptos" w:cs="Aptos"/>
-          <w:color w:val="0D0D0D" w:themeColor="text1" w:themeTint="F2"/>
-          <w:kern w:val="0"/>
-          <w:sz w:val="21"/>
-          <w:szCs w:val="21"/>
-          <w:lang w:eastAsia="en-NZ"/>
-          <w14:ligatures w14:val="none"/>
-        </w:rPr>
-        <w:t>read-ID</w:t>
-      </w:r>
-      <w:proofErr w:type="gramEnd"/>
-      <w:r>
-        <w:rPr>
-          <w:rFonts w:ascii="Aptos" w:eastAsia="Aptos" w:hAnsi="Aptos" w:cs="Aptos"/>
-          <w:color w:val="0D0D0D" w:themeColor="text1" w:themeTint="F2"/>
-          <w:kern w:val="0"/>
-          <w:sz w:val="21"/>
-          <w:szCs w:val="21"/>
-          <w:lang w:eastAsia="en-NZ"/>
-          <w14:ligatures w14:val="none"/>
-        </w:rPr>
-        <w:t xml:space="preserve"> = Micron MT29F1G01 (0x2C…); erase/program/read a block, verify.</w:t>
+        <w:t>NAND read-ID = Micron MT29F1G01 (0x2C…); erase/program/read a block, verify.</w:t>
       </w:r>
     </w:p>
     <w:p>
@@ -11294,33 +10238,7 @@
           <w:lang w:eastAsia="en-NZ"/>
           <w14:ligatures w14:val="none"/>
         </w:rPr>
-        <w:t xml:space="preserve">FRAM </w:t>
-      </w:r>
-      <w:proofErr w:type="gramStart"/>
-      <w:r>
-        <w:rPr>
-          <w:rFonts w:ascii="Aptos" w:eastAsia="Aptos" w:hAnsi="Aptos" w:cs="Aptos"/>
-          <w:color w:val="0D0D0D" w:themeColor="text1" w:themeTint="F2"/>
-          <w:kern w:val="0"/>
-          <w:sz w:val="21"/>
-          <w:szCs w:val="21"/>
-          <w:lang w:eastAsia="en-NZ"/>
-          <w14:ligatures w14:val="none"/>
-        </w:rPr>
-        <w:t>read-ID</w:t>
-      </w:r>
-      <w:proofErr w:type="gramEnd"/>
-      <w:r>
-        <w:rPr>
-          <w:rFonts w:ascii="Aptos" w:eastAsia="Aptos" w:hAnsi="Aptos" w:cs="Aptos"/>
-          <w:color w:val="0D0D0D" w:themeColor="text1" w:themeTint="F2"/>
-          <w:kern w:val="0"/>
-          <w:sz w:val="21"/>
-          <w:szCs w:val="21"/>
-          <w:lang w:eastAsia="en-NZ"/>
-          <w14:ligatures w14:val="none"/>
-        </w:rPr>
-        <w:t xml:space="preserve"> = expected signature; write pattern, read back (no erase).</w:t>
+        <w:t>FRAM read-ID = expected signature; write pattern, read back (no erase).</w:t>
       </w:r>
     </w:p>
     <w:p>
@@ -11340,7 +10258,6 @@
           <w14:ligatures w14:val="none"/>
         </w:rPr>
       </w:pPr>
-      <w:proofErr w:type="spellStart"/>
       <w:r>
         <w:rPr>
           <w:rFonts w:ascii="Aptos" w:eastAsia="Aptos" w:hAnsi="Aptos" w:cs="Aptos"/>
@@ -11351,20 +10268,7 @@
           <w:lang w:eastAsia="en-NZ"/>
           <w14:ligatures w14:val="none"/>
         </w:rPr>
-        <w:t>nCS</w:t>
-      </w:r>
-      <w:proofErr w:type="spellEnd"/>
-      <w:r>
-        <w:rPr>
-          <w:rFonts w:ascii="Aptos" w:eastAsia="Aptos" w:hAnsi="Aptos" w:cs="Aptos"/>
-          <w:color w:val="0D0D0D" w:themeColor="text1" w:themeTint="F2"/>
-          <w:kern w:val="0"/>
-          <w:sz w:val="21"/>
-          <w:szCs w:val="21"/>
-          <w:lang w:eastAsia="en-NZ"/>
-          <w14:ligatures w14:val="none"/>
-        </w:rPr>
-        <w:t xml:space="preserve"> idle high; SCK/IO edges clean.</w:t>
+        <w:t>nCS idle high; SCK/IO edges clean.</w:t>
       </w:r>
     </w:p>
     <w:p>
@@ -11742,137 +10646,7 @@
           <w:lang w:eastAsia="en-NZ"/>
           <w14:ligatures w14:val="none"/>
         </w:rPr>
-        <w:t>One at a time: U9+L4(R37/R</w:t>
-      </w:r>
-      <w:proofErr w:type="gramStart"/>
-      <w:r>
-        <w:rPr>
-          <w:rFonts w:ascii="Aptos" w:eastAsia="Aptos" w:hAnsi="Aptos" w:cs="Aptos"/>
-          <w:color w:val="0D0D0D" w:themeColor="text1" w:themeTint="F2"/>
-          <w:kern w:val="0"/>
-          <w:sz w:val="20"/>
-          <w:szCs w:val="20"/>
-          <w:lang w:eastAsia="en-NZ"/>
-          <w14:ligatures w14:val="none"/>
-        </w:rPr>
-        <w:t>38,D</w:t>
-      </w:r>
-      <w:proofErr w:type="gramEnd"/>
-      <w:r>
-        <w:rPr>
-          <w:rFonts w:ascii="Aptos" w:eastAsia="Aptos" w:hAnsi="Aptos" w:cs="Aptos"/>
-          <w:color w:val="0D0D0D" w:themeColor="text1" w:themeTint="F2"/>
-          <w:kern w:val="0"/>
-          <w:sz w:val="20"/>
-          <w:szCs w:val="20"/>
-          <w:lang w:eastAsia="en-NZ"/>
-          <w14:ligatures w14:val="none"/>
-        </w:rPr>
-        <w:t>11/R</w:t>
-      </w:r>
-      <w:proofErr w:type="gramStart"/>
-      <w:r>
-        <w:rPr>
-          <w:rFonts w:ascii="Aptos" w:eastAsia="Aptos" w:hAnsi="Aptos" w:cs="Aptos"/>
-          <w:color w:val="0D0D0D" w:themeColor="text1" w:themeTint="F2"/>
-          <w:kern w:val="0"/>
-          <w:sz w:val="20"/>
-          <w:szCs w:val="20"/>
-          <w:lang w:eastAsia="en-NZ"/>
-          <w14:ligatures w14:val="none"/>
-        </w:rPr>
-        <w:t>33)=</w:t>
-      </w:r>
-      <w:proofErr w:type="gramEnd"/>
-      <w:r>
-        <w:rPr>
-          <w:rFonts w:ascii="Aptos" w:eastAsia="Aptos" w:hAnsi="Aptos" w:cs="Aptos"/>
-          <w:color w:val="0D0D0D" w:themeColor="text1" w:themeTint="F2"/>
-          <w:kern w:val="0"/>
-          <w:sz w:val="20"/>
-          <w:szCs w:val="20"/>
-          <w:lang w:eastAsia="en-NZ"/>
-          <w14:ligatures w14:val="none"/>
-        </w:rPr>
-        <w:t>5V_PL; U10+L5(R39/R</w:t>
-      </w:r>
-      <w:proofErr w:type="gramStart"/>
-      <w:r>
-        <w:rPr>
-          <w:rFonts w:ascii="Aptos" w:eastAsia="Aptos" w:hAnsi="Aptos" w:cs="Aptos"/>
-          <w:color w:val="0D0D0D" w:themeColor="text1" w:themeTint="F2"/>
-          <w:kern w:val="0"/>
-          <w:sz w:val="20"/>
-          <w:szCs w:val="20"/>
-          <w:lang w:eastAsia="en-NZ"/>
-          <w14:ligatures w14:val="none"/>
-        </w:rPr>
-        <w:t>40,D</w:t>
-      </w:r>
-      <w:proofErr w:type="gramEnd"/>
-      <w:r>
-        <w:rPr>
-          <w:rFonts w:ascii="Aptos" w:eastAsia="Aptos" w:hAnsi="Aptos" w:cs="Aptos"/>
-          <w:color w:val="0D0D0D" w:themeColor="text1" w:themeTint="F2"/>
-          <w:kern w:val="0"/>
-          <w:sz w:val="20"/>
-          <w:szCs w:val="20"/>
-          <w:lang w:eastAsia="en-NZ"/>
-          <w14:ligatures w14:val="none"/>
-        </w:rPr>
-        <w:t>12/R</w:t>
-      </w:r>
-      <w:proofErr w:type="gramStart"/>
-      <w:r>
-        <w:rPr>
-          <w:rFonts w:ascii="Aptos" w:eastAsia="Aptos" w:hAnsi="Aptos" w:cs="Aptos"/>
-          <w:color w:val="0D0D0D" w:themeColor="text1" w:themeTint="F2"/>
-          <w:kern w:val="0"/>
-          <w:sz w:val="20"/>
-          <w:szCs w:val="20"/>
-          <w:lang w:eastAsia="en-NZ"/>
-          <w14:ligatures w14:val="none"/>
-        </w:rPr>
-        <w:t>34)=</w:t>
-      </w:r>
-      <w:proofErr w:type="gramEnd"/>
-      <w:r>
-        <w:rPr>
-          <w:rFonts w:ascii="Aptos" w:eastAsia="Aptos" w:hAnsi="Aptos" w:cs="Aptos"/>
-          <w:color w:val="0D0D0D" w:themeColor="text1" w:themeTint="F2"/>
-          <w:kern w:val="0"/>
-          <w:sz w:val="20"/>
-          <w:szCs w:val="20"/>
-          <w:lang w:eastAsia="en-NZ"/>
-          <w14:ligatures w14:val="none"/>
-        </w:rPr>
-        <w:t>3V3_PL; U12+L6(R53/R54/R</w:t>
-      </w:r>
-      <w:proofErr w:type="gramStart"/>
-      <w:r>
-        <w:rPr>
-          <w:rFonts w:ascii="Aptos" w:eastAsia="Aptos" w:hAnsi="Aptos" w:cs="Aptos"/>
-          <w:color w:val="0D0D0D" w:themeColor="text1" w:themeTint="F2"/>
-          <w:kern w:val="0"/>
-          <w:sz w:val="20"/>
-          <w:szCs w:val="20"/>
-          <w:lang w:eastAsia="en-NZ"/>
-          <w14:ligatures w14:val="none"/>
-        </w:rPr>
-        <w:t>56,caps</w:t>
-      </w:r>
-      <w:proofErr w:type="gramEnd"/>
-      <w:r>
-        <w:rPr>
-          <w:rFonts w:ascii="Aptos" w:eastAsia="Aptos" w:hAnsi="Aptos" w:cs="Aptos"/>
-          <w:color w:val="0D0D0D" w:themeColor="text1" w:themeTint="F2"/>
-          <w:kern w:val="0"/>
-          <w:sz w:val="20"/>
-          <w:szCs w:val="20"/>
-          <w:lang w:eastAsia="en-NZ"/>
-          <w14:ligatures w14:val="none"/>
-        </w:rPr>
-        <w:t>)=VARI. Preconditions: +12V_PL up, MCU running, enables LOW, J11/J12 OPEN.</w:t>
+        <w:t>One at a time: U9+L4(R37/R38,D11/R33)=5V_PL; U10+L5(R39/R40,D12/R34)=3V3_PL; U12+L6(R53/R54/R56,caps)=VARI. Preconditions: +12V_PL up, MCU running, enables LOW, J11/J12 OPEN.</w:t>
       </w:r>
     </w:p>
     <w:p>
@@ -12170,163 +10944,7 @@
           <w:lang w:eastAsia="en-NZ"/>
           <w14:ligatures w14:val="none"/>
         </w:rPr>
-        <w:t xml:space="preserve">MP28167 </w:t>
-      </w:r>
-      <w:proofErr w:type="spellStart"/>
-      <w:r>
-        <w:rPr>
-          <w:rFonts w:ascii="Aptos" w:eastAsia="Aptos" w:hAnsi="Aptos" w:cs="Aptos"/>
-          <w:color w:val="0D0D0D" w:themeColor="text1" w:themeTint="F2"/>
-          <w:kern w:val="0"/>
-          <w:sz w:val="21"/>
-          <w:szCs w:val="21"/>
-          <w:lang w:eastAsia="en-NZ"/>
-          <w14:ligatures w14:val="none"/>
-        </w:rPr>
-        <w:t>seq</w:t>
-      </w:r>
-      <w:proofErr w:type="spellEnd"/>
-      <w:r>
-        <w:rPr>
-          <w:rFonts w:ascii="Aptos" w:eastAsia="Aptos" w:hAnsi="Aptos" w:cs="Aptos"/>
-          <w:color w:val="0D0D0D" w:themeColor="text1" w:themeTint="F2"/>
-          <w:kern w:val="0"/>
-          <w:sz w:val="21"/>
-          <w:szCs w:val="21"/>
-          <w:lang w:eastAsia="en-NZ"/>
-          <w14:ligatures w14:val="none"/>
-        </w:rPr>
-        <w:t xml:space="preserve"> (per note): VREF_L(0x</w:t>
-      </w:r>
-      <w:proofErr w:type="gramStart"/>
-      <w:r>
-        <w:rPr>
-          <w:rFonts w:ascii="Aptos" w:eastAsia="Aptos" w:hAnsi="Aptos" w:cs="Aptos"/>
-          <w:color w:val="0D0D0D" w:themeColor="text1" w:themeTint="F2"/>
-          <w:kern w:val="0"/>
-          <w:sz w:val="21"/>
-          <w:szCs w:val="21"/>
-          <w:lang w:eastAsia="en-NZ"/>
-          <w14:ligatures w14:val="none"/>
-        </w:rPr>
-        <w:t>00)=</w:t>
-      </w:r>
-      <w:proofErr w:type="gramEnd"/>
-      <w:r>
-        <w:rPr>
-          <w:rFonts w:ascii="Aptos" w:eastAsia="Aptos" w:hAnsi="Aptos" w:cs="Aptos"/>
-          <w:color w:val="0D0D0D" w:themeColor="text1" w:themeTint="F2"/>
-          <w:kern w:val="0"/>
-          <w:sz w:val="21"/>
-          <w:szCs w:val="21"/>
-          <w:lang w:eastAsia="en-NZ"/>
-          <w14:ligatures w14:val="none"/>
-        </w:rPr>
-        <w:t>0x05, VREF_H(0x</w:t>
-      </w:r>
-      <w:proofErr w:type="gramStart"/>
-      <w:r>
-        <w:rPr>
-          <w:rFonts w:ascii="Aptos" w:eastAsia="Aptos" w:hAnsi="Aptos" w:cs="Aptos"/>
-          <w:color w:val="0D0D0D" w:themeColor="text1" w:themeTint="F2"/>
-          <w:kern w:val="0"/>
-          <w:sz w:val="21"/>
-          <w:szCs w:val="21"/>
-          <w:lang w:eastAsia="en-NZ"/>
-          <w14:ligatures w14:val="none"/>
-        </w:rPr>
-        <w:t>01)=</w:t>
-      </w:r>
-      <w:proofErr w:type="gramEnd"/>
-      <w:r>
-        <w:rPr>
-          <w:rFonts w:ascii="Aptos" w:eastAsia="Aptos" w:hAnsi="Aptos" w:cs="Aptos"/>
-          <w:color w:val="0D0D0D" w:themeColor="text1" w:themeTint="F2"/>
-          <w:kern w:val="0"/>
-          <w:sz w:val="21"/>
-          <w:szCs w:val="21"/>
-          <w:lang w:eastAsia="en-NZ"/>
-          <w14:ligatures w14:val="none"/>
-        </w:rPr>
-        <w:t>0xEF, GO(0x</w:t>
-      </w:r>
-      <w:proofErr w:type="gramStart"/>
-      <w:r>
-        <w:rPr>
-          <w:rFonts w:ascii="Aptos" w:eastAsia="Aptos" w:hAnsi="Aptos" w:cs="Aptos"/>
-          <w:color w:val="0D0D0D" w:themeColor="text1" w:themeTint="F2"/>
-          <w:kern w:val="0"/>
-          <w:sz w:val="21"/>
-          <w:szCs w:val="21"/>
-          <w:lang w:eastAsia="en-NZ"/>
-          <w14:ligatures w14:val="none"/>
-        </w:rPr>
-        <w:t>02)=</w:t>
-      </w:r>
-      <w:proofErr w:type="gramEnd"/>
-      <w:r>
-        <w:rPr>
-          <w:rFonts w:ascii="Aptos" w:eastAsia="Aptos" w:hAnsi="Aptos" w:cs="Aptos"/>
-          <w:color w:val="0D0D0D" w:themeColor="text1" w:themeTint="F2"/>
-          <w:kern w:val="0"/>
-          <w:sz w:val="21"/>
-          <w:szCs w:val="21"/>
-          <w:lang w:eastAsia="en-NZ"/>
-          <w14:ligatures w14:val="none"/>
-        </w:rPr>
-        <w:t>0x01→16.8 V; IOUT_LIM(0x</w:t>
-      </w:r>
-      <w:proofErr w:type="gramStart"/>
-      <w:r>
-        <w:rPr>
-          <w:rFonts w:ascii="Aptos" w:eastAsia="Aptos" w:hAnsi="Aptos" w:cs="Aptos"/>
-          <w:color w:val="0D0D0D" w:themeColor="text1" w:themeTint="F2"/>
-          <w:kern w:val="0"/>
-          <w:sz w:val="21"/>
-          <w:szCs w:val="21"/>
-          <w:lang w:eastAsia="en-NZ"/>
-          <w14:ligatures w14:val="none"/>
-        </w:rPr>
-        <w:t>03)=</w:t>
-      </w:r>
-      <w:proofErr w:type="gramEnd"/>
-      <w:r>
-        <w:rPr>
-          <w:rFonts w:ascii="Aptos" w:eastAsia="Aptos" w:hAnsi="Aptos" w:cs="Aptos"/>
-          <w:color w:val="0D0D0D" w:themeColor="text1" w:themeTint="F2"/>
-          <w:kern w:val="0"/>
-          <w:sz w:val="21"/>
-          <w:szCs w:val="21"/>
-          <w:lang w:eastAsia="en-NZ"/>
-          <w14:ligatures w14:val="none"/>
-        </w:rPr>
-        <w:t>0x32→2.5 A; CTL1(0x</w:t>
-      </w:r>
-      <w:proofErr w:type="gramStart"/>
-      <w:r>
-        <w:rPr>
-          <w:rFonts w:ascii="Aptos" w:eastAsia="Aptos" w:hAnsi="Aptos" w:cs="Aptos"/>
-          <w:color w:val="0D0D0D" w:themeColor="text1" w:themeTint="F2"/>
-          <w:kern w:val="0"/>
-          <w:sz w:val="21"/>
-          <w:szCs w:val="21"/>
-          <w:lang w:eastAsia="en-NZ"/>
-          <w14:ligatures w14:val="none"/>
-        </w:rPr>
-        <w:t>04)=</w:t>
-      </w:r>
-      <w:proofErr w:type="gramEnd"/>
-      <w:r>
-        <w:rPr>
-          <w:rFonts w:ascii="Aptos" w:eastAsia="Aptos" w:hAnsi="Aptos" w:cs="Aptos"/>
-          <w:color w:val="0D0D0D" w:themeColor="text1" w:themeTint="F2"/>
-          <w:kern w:val="0"/>
-          <w:sz w:val="21"/>
-          <w:szCs w:val="21"/>
-          <w:lang w:eastAsia="en-NZ"/>
-          <w14:ligatures w14:val="none"/>
-        </w:rPr>
-        <w:t>0xB0. Verify vs datasheet map.</w:t>
+        <w:t>MP28167 seq (per note): VREF_L(0x00)=0x05, VREF_H(0x01)=0xEF, GO(0x02)=0x01→16.8 V; IOUT_LIM(0x03)=0x32→2.5 A; CTL1(0x04)=0xB0. Verify vs datasheet map.</w:t>
       </w:r>
     </w:p>
     <w:p>
@@ -12468,33 +11086,7 @@
           <w:lang w:eastAsia="en-NZ"/>
           <w14:ligatures w14:val="none"/>
         </w:rPr>
-        <w:t xml:space="preserve">5V_PL/3V3_PL enable on command in </w:t>
-      </w:r>
-      <w:proofErr w:type="spellStart"/>
-      <w:r>
-        <w:rPr>
-          <w:rFonts w:ascii="Aptos" w:eastAsia="Aptos" w:hAnsi="Aptos" w:cs="Aptos"/>
-          <w:color w:val="0D0D0D" w:themeColor="text1" w:themeTint="F2"/>
-          <w:kern w:val="0"/>
-          <w:sz w:val="21"/>
-          <w:szCs w:val="21"/>
-          <w:lang w:eastAsia="en-NZ"/>
-          <w14:ligatures w14:val="none"/>
-        </w:rPr>
-        <w:t>tol</w:t>
-      </w:r>
-      <w:proofErr w:type="spellEnd"/>
-      <w:r>
-        <w:rPr>
-          <w:rFonts w:ascii="Aptos" w:eastAsia="Aptos" w:hAnsi="Aptos" w:cs="Aptos"/>
-          <w:color w:val="0D0D0D" w:themeColor="text1" w:themeTint="F2"/>
-          <w:kern w:val="0"/>
-          <w:sz w:val="21"/>
-          <w:szCs w:val="21"/>
-          <w:lang w:eastAsia="en-NZ"/>
-          <w14:ligatures w14:val="none"/>
-        </w:rPr>
-        <w:t>; VARI ACKs + holds a safe setpoint. Leave J11/J12 open.</w:t>
+        <w:t>5V_PL/3V3_PL enable on command in tol; VARI ACKs + holds a safe setpoint. Leave J11/J12 open.</w:t>
       </w:r>
     </w:p>
     <w:p>
@@ -12702,33 +11294,7 @@
           <w:lang w:eastAsia="en-NZ"/>
           <w14:ligatures w14:val="none"/>
         </w:rPr>
-        <w:t>U</w:t>
-      </w:r>
-      <w:proofErr w:type="gramStart"/>
-      <w:r>
-        <w:rPr>
-          <w:rFonts w:ascii="Aptos" w:eastAsia="Aptos" w:hAnsi="Aptos" w:cs="Aptos"/>
-          <w:color w:val="0D0D0D" w:themeColor="text1" w:themeTint="F2"/>
-          <w:kern w:val="0"/>
-          <w:sz w:val="20"/>
-          <w:szCs w:val="20"/>
-          <w:lang w:eastAsia="en-NZ"/>
-          <w14:ligatures w14:val="none"/>
-        </w:rPr>
-        <w:t>4,U</w:t>
-      </w:r>
-      <w:proofErr w:type="gramEnd"/>
-      <w:r>
-        <w:rPr>
-          <w:rFonts w:ascii="Aptos" w:eastAsia="Aptos" w:hAnsi="Aptos" w:cs="Aptos"/>
-          <w:color w:val="0D0D0D" w:themeColor="text1" w:themeTint="F2"/>
-          <w:kern w:val="0"/>
-          <w:sz w:val="20"/>
-          <w:szCs w:val="20"/>
-          <w:lang w:eastAsia="en-NZ"/>
-          <w14:ligatures w14:val="none"/>
-        </w:rPr>
-        <w:t>5 (MCP2562FD), FL1/FL2 (CMC), R18–R21 60.4R term, R43/R44 1k, D7/D8 (ESD), J5/J6.</w:t>
+        <w:t>U4,U5 (MCP2562FD), FL1/FL2 (CMC), R18–R21 60.4R term, R43/R44 1k, D7/D8 (ESD), J5/J6.</w:t>
       </w:r>
     </w:p>
     <w:p>
@@ -12848,33 +11414,7 @@
           <w:lang w:eastAsia="en-NZ"/>
           <w14:ligatures w14:val="none"/>
         </w:rPr>
-        <w:t>Payload: SPI2 SCK/MOSI/</w:t>
-      </w:r>
-      <w:proofErr w:type="spellStart"/>
-      <w:r>
-        <w:rPr>
-          <w:rFonts w:ascii="Aptos" w:eastAsia="Aptos" w:hAnsi="Aptos" w:cs="Aptos"/>
-          <w:color w:val="0D0D0D" w:themeColor="text1" w:themeTint="F2"/>
-          <w:kern w:val="0"/>
-          <w:sz w:val="21"/>
-          <w:szCs w:val="21"/>
-          <w:lang w:eastAsia="en-NZ"/>
-          <w14:ligatures w14:val="none"/>
-        </w:rPr>
-        <w:t>nCS</w:t>
-      </w:r>
-      <w:proofErr w:type="spellEnd"/>
-      <w:r>
-        <w:rPr>
-          <w:rFonts w:ascii="Aptos" w:eastAsia="Aptos" w:hAnsi="Aptos" w:cs="Aptos"/>
-          <w:color w:val="0D0D0D" w:themeColor="text1" w:themeTint="F2"/>
-          <w:kern w:val="0"/>
-          <w:sz w:val="21"/>
-          <w:szCs w:val="21"/>
-          <w:lang w:eastAsia="en-NZ"/>
-          <w14:ligatures w14:val="none"/>
-        </w:rPr>
-        <w:t xml:space="preserve"> clocked data; USART3 TX baud correct; I²C2 scan/ACK.</w:t>
+        <w:t>Payload: SPI2 SCK/MOSI/nCS clocked data; USART3 TX baud correct; I²C2 scan/ACK.</w:t>
       </w:r>
     </w:p>
     <w:p>
@@ -13016,33 +11556,7 @@
           <w:lang w:eastAsia="en-NZ"/>
           <w14:ligatures w14:val="none"/>
         </w:rPr>
-        <w:t xml:space="preserve">Both CAN channels TX/RX an </w:t>
-      </w:r>
-      <w:proofErr w:type="spellStart"/>
-      <w:r>
-        <w:rPr>
-          <w:rFonts w:ascii="Aptos" w:eastAsia="Aptos" w:hAnsi="Aptos" w:cs="Aptos"/>
-          <w:color w:val="0D0D0D" w:themeColor="text1" w:themeTint="F2"/>
-          <w:kern w:val="0"/>
-          <w:sz w:val="21"/>
-          <w:szCs w:val="21"/>
-          <w:lang w:eastAsia="en-NZ"/>
-          <w14:ligatures w14:val="none"/>
-        </w:rPr>
-        <w:t>ACK'd</w:t>
-      </w:r>
-      <w:proofErr w:type="spellEnd"/>
-      <w:r>
-        <w:rPr>
-          <w:rFonts w:ascii="Aptos" w:eastAsia="Aptos" w:hAnsi="Aptos" w:cs="Aptos"/>
-          <w:color w:val="0D0D0D" w:themeColor="text1" w:themeTint="F2"/>
-          <w:kern w:val="0"/>
-          <w:sz w:val="21"/>
-          <w:szCs w:val="21"/>
-          <w:lang w:eastAsia="en-NZ"/>
-          <w14:ligatures w14:val="none"/>
-        </w:rPr>
-        <w:t xml:space="preserve"> frame; payload buses signal correctly.</w:t>
+        <w:t>Both CAN channels TX/RX an ACK'd frame; payload buses signal correctly.</w:t>
       </w:r>
     </w:p>
     <w:p>
@@ -13311,59 +11825,7 @@
           <w:lang w:eastAsia="en-NZ"/>
           <w14:ligatures w14:val="none"/>
         </w:rPr>
-        <w:t xml:space="preserve">Idle: </w:t>
-      </w:r>
-      <w:proofErr w:type="spellStart"/>
-      <w:r>
-        <w:rPr>
-          <w:rFonts w:ascii="Aptos" w:eastAsia="Aptos" w:hAnsi="Aptos" w:cs="Aptos"/>
-          <w:color w:val="0A0A0A"/>
-          <w:kern w:val="0"/>
-          <w:sz w:val="21"/>
-          <w:szCs w:val="21"/>
-          <w:lang w:eastAsia="en-NZ"/>
-          <w14:ligatures w14:val="none"/>
-        </w:rPr>
-        <w:t>nCRESET</w:t>
-      </w:r>
-      <w:proofErr w:type="spellEnd"/>
-      <w:r>
-        <w:rPr>
-          <w:rFonts w:ascii="Aptos" w:eastAsia="Aptos" w:hAnsi="Aptos" w:cs="Aptos"/>
-          <w:color w:val="0A0A0A"/>
-          <w:kern w:val="0"/>
-          <w:sz w:val="21"/>
-          <w:szCs w:val="21"/>
-          <w:lang w:eastAsia="en-NZ"/>
-          <w14:ligatures w14:val="none"/>
-        </w:rPr>
-        <w:t>/</w:t>
-      </w:r>
-      <w:proofErr w:type="spellStart"/>
-      <w:r>
-        <w:rPr>
-          <w:rFonts w:ascii="Aptos" w:eastAsia="Aptos" w:hAnsi="Aptos" w:cs="Aptos"/>
-          <w:color w:val="0A0A0A"/>
-          <w:kern w:val="0"/>
-          <w:sz w:val="21"/>
-          <w:szCs w:val="21"/>
-          <w:lang w:eastAsia="en-NZ"/>
-          <w14:ligatures w14:val="none"/>
-        </w:rPr>
-        <w:t>nSS</w:t>
-      </w:r>
-      <w:proofErr w:type="spellEnd"/>
-      <w:r>
-        <w:rPr>
-          <w:rFonts w:ascii="Aptos" w:eastAsia="Aptos" w:hAnsi="Aptos" w:cs="Aptos"/>
-          <w:color w:val="0A0A0A"/>
-          <w:kern w:val="0"/>
-          <w:sz w:val="21"/>
-          <w:szCs w:val="21"/>
-          <w:lang w:eastAsia="en-NZ"/>
-          <w14:ligatures w14:val="none"/>
-        </w:rPr>
-        <w:t>/CDONE/FPGA_INT high (pull-ups); 33R series present.</w:t>
+        <w:t>Idle: nCRESET/nSS/CDONE/FPGA_INT high (pull-ups); 33R series present.</w:t>
       </w:r>
     </w:p>
     <w:p>
@@ -13393,33 +11855,7 @@
           <w:lang w:eastAsia="en-NZ"/>
           <w14:ligatures w14:val="none"/>
         </w:rPr>
-        <w:t xml:space="preserve">LA on J9: valid </w:t>
-      </w:r>
-      <w:proofErr w:type="spellStart"/>
-      <w:r>
-        <w:rPr>
-          <w:rFonts w:ascii="Aptos" w:eastAsia="Aptos" w:hAnsi="Aptos" w:cs="Aptos"/>
-          <w:color w:val="0A0A0A"/>
-          <w:kern w:val="0"/>
-          <w:sz w:val="21"/>
-          <w:szCs w:val="21"/>
-          <w:lang w:eastAsia="en-NZ"/>
-          <w14:ligatures w14:val="none"/>
-        </w:rPr>
-        <w:t>reset→clock→bitstream</w:t>
-      </w:r>
-      <w:proofErr w:type="spellEnd"/>
-      <w:r>
-        <w:rPr>
-          <w:rFonts w:ascii="Aptos" w:eastAsia="Aptos" w:hAnsi="Aptos" w:cs="Aptos"/>
-          <w:color w:val="0A0A0A"/>
-          <w:kern w:val="0"/>
-          <w:sz w:val="21"/>
-          <w:szCs w:val="21"/>
-          <w:lang w:eastAsia="en-NZ"/>
-          <w14:ligatures w14:val="none"/>
-        </w:rPr>
-        <w:t xml:space="preserve"> sequence; with FPGA attached, CDONE asserts high on success.</w:t>
+        <w:t>LA on J9: valid reset→clock→bitstream sequence; with FPGA attached, CDONE asserts high on success.</w:t>
       </w:r>
     </w:p>
     <w:p>
@@ -13474,33 +11910,7 @@
           <w:lang w:eastAsia="en-NZ"/>
           <w14:ligatures w14:val="none"/>
         </w:rPr>
-        <w:t xml:space="preserve">~0 added </w:t>
-      </w:r>
-      <w:proofErr w:type="gramStart"/>
-      <w:r>
-        <w:rPr>
-          <w:rFonts w:ascii="Aptos" w:eastAsia="Aptos" w:hAnsi="Aptos" w:cs="Aptos"/>
-          <w:color w:val="0A0A0A"/>
-          <w:kern w:val="0"/>
-          <w:sz w:val="21"/>
-          <w:szCs w:val="21"/>
-          <w:lang w:eastAsia="en-NZ"/>
-          <w14:ligatures w14:val="none"/>
-        </w:rPr>
-        <w:t>on-board</w:t>
-      </w:r>
-      <w:proofErr w:type="gramEnd"/>
-      <w:r>
-        <w:rPr>
-          <w:rFonts w:ascii="Aptos" w:eastAsia="Aptos" w:hAnsi="Aptos" w:cs="Aptos"/>
-          <w:color w:val="0A0A0A"/>
-          <w:kern w:val="0"/>
-          <w:sz w:val="21"/>
-          <w:szCs w:val="21"/>
-          <w:lang w:eastAsia="en-NZ"/>
-          <w14:ligatures w14:val="none"/>
-        </w:rPr>
-        <w:t xml:space="preserve"> (pull-ups µA). External FPGA powered separately — not in this budget.</w:t>
+        <w:t>~0 added on-board (pull-ups µA). External FPGA powered separately — not in this budget.</w:t>
       </w:r>
     </w:p>
     <w:p>
@@ -13587,33 +11997,7 @@
           <w:lang w:eastAsia="en-NZ"/>
           <w14:ligatures w14:val="none"/>
         </w:rPr>
-        <w:t xml:space="preserve">Clean, </w:t>
-      </w:r>
-      <w:proofErr w:type="gramStart"/>
-      <w:r>
-        <w:rPr>
-          <w:rFonts w:ascii="Aptos" w:eastAsia="Aptos" w:hAnsi="Aptos" w:cs="Aptos"/>
-          <w:color w:val="0A0A0A"/>
-          <w:kern w:val="0"/>
-          <w:sz w:val="21"/>
-          <w:szCs w:val="21"/>
-          <w:lang w:eastAsia="en-NZ"/>
-          <w14:ligatures w14:val="none"/>
-        </w:rPr>
-        <w:t>correctly-sequenced</w:t>
-      </w:r>
-      <w:proofErr w:type="gramEnd"/>
-      <w:r>
-        <w:rPr>
-          <w:rFonts w:ascii="Aptos" w:eastAsia="Aptos" w:hAnsi="Aptos" w:cs="Aptos"/>
-          <w:color w:val="0A0A0A"/>
-          <w:kern w:val="0"/>
-          <w:sz w:val="21"/>
-          <w:szCs w:val="21"/>
-          <w:lang w:eastAsia="en-NZ"/>
-          <w14:ligatures w14:val="none"/>
-        </w:rPr>
-        <w:t xml:space="preserve"> config waveform; CDONE asserts (if FPGA present).</w:t>
+        <w:t>Clean, correctly-sequenced config waveform; CDONE asserts (if FPGA present).</w:t>
       </w:r>
     </w:p>
     <w:p>
@@ -13881,33 +12265,7 @@
           <w:lang w:eastAsia="en-NZ"/>
           <w14:ligatures w14:val="none"/>
         </w:rPr>
-        <w:t>Sequence (scope multi-ch): +12V_IN → HK rails auto → +12V_PL (</w:t>
-      </w:r>
-      <w:proofErr w:type="spellStart"/>
-      <w:r>
-        <w:rPr>
-          <w:rFonts w:ascii="Aptos" w:eastAsia="Aptos" w:hAnsi="Aptos" w:cs="Aptos"/>
-          <w:color w:val="0D0D0D" w:themeColor="text1" w:themeTint="F2"/>
-          <w:kern w:val="0"/>
-          <w:sz w:val="21"/>
-          <w:szCs w:val="21"/>
-          <w:lang w:eastAsia="en-NZ"/>
-          <w14:ligatures w14:val="none"/>
-        </w:rPr>
-        <w:t>eFuse</w:t>
-      </w:r>
-      <w:proofErr w:type="spellEnd"/>
-      <w:r>
-        <w:rPr>
-          <w:rFonts w:ascii="Aptos" w:eastAsia="Aptos" w:hAnsi="Aptos" w:cs="Aptos"/>
-          <w:color w:val="0D0D0D" w:themeColor="text1" w:themeTint="F2"/>
-          <w:kern w:val="0"/>
-          <w:sz w:val="21"/>
-          <w:szCs w:val="21"/>
-          <w:lang w:eastAsia="en-NZ"/>
-          <w14:ligatures w14:val="none"/>
-        </w:rPr>
-        <w:t>) → MCU enables +3V3_PL/+5V_PL/+VARI in order → program VARI → payload op.</w:t>
+        <w:t>Sequence (scope multi-ch): +12V_IN → HK rails auto → +12V_PL (eFuse) → MCU enables +3V3_PL/+5V_PL/+VARI in order → program VARI → payload op.</w:t>
       </w:r>
     </w:p>
     <w:p>
@@ -13927,7 +12285,6 @@
           <w14:ligatures w14:val="none"/>
         </w:rPr>
       </w:pPr>
-      <w:proofErr w:type="spellStart"/>
       <w:r>
         <w:rPr>
           <w:rFonts w:ascii="Aptos" w:eastAsia="Aptos" w:hAnsi="Aptos" w:cs="Aptos"/>
@@ -13938,20 +12295,7 @@
           <w:lang w:eastAsia="en-NZ"/>
           <w14:ligatures w14:val="none"/>
         </w:rPr>
-        <w:t>eFuse</w:t>
-      </w:r>
-      <w:proofErr w:type="spellEnd"/>
-      <w:r>
-        <w:rPr>
-          <w:rFonts w:ascii="Aptos" w:eastAsia="Aptos" w:hAnsi="Aptos" w:cs="Aptos"/>
-          <w:color w:val="0D0D0D" w:themeColor="text1" w:themeTint="F2"/>
-          <w:kern w:val="0"/>
-          <w:sz w:val="21"/>
-          <w:szCs w:val="21"/>
-          <w:lang w:eastAsia="en-NZ"/>
-          <w14:ligatures w14:val="none"/>
-        </w:rPr>
-        <w:t xml:space="preserve"> fault path: force overcurrent → PL_FLT to MCU trips. Brown-out: ramp 12 V down → graceful UVLO.</w:t>
+        <w:t>eFuse fault path: force overcurrent → PL_FLT to MCU trips. Brown-out: ramp 12 V down → graceful UVLO.</w:t>
       </w:r>
     </w:p>
     <w:p>
@@ -14659,33 +13003,7 @@
                 <w:lang w:eastAsia="en-NZ"/>
                 <w14:ligatures w14:val="none"/>
               </w:rPr>
-              <w:t xml:space="preserve">Input </w:t>
-            </w:r>
-            <w:proofErr w:type="spellStart"/>
-            <w:r>
-              <w:rPr>
-                <w:rFonts w:ascii="Aptos" w:eastAsia="Aptos" w:hAnsi="Aptos" w:cs="Aptos"/>
-                <w:color w:val="0A0A0A"/>
-                <w:kern w:val="0"/>
-                <w:sz w:val="17"/>
-                <w:szCs w:val="17"/>
-                <w:lang w:eastAsia="en-NZ"/>
-                <w14:ligatures w14:val="none"/>
-              </w:rPr>
-              <w:t>prot</w:t>
-            </w:r>
-            <w:proofErr w:type="spellEnd"/>
-            <w:r>
-              <w:rPr>
-                <w:rFonts w:ascii="Aptos" w:eastAsia="Aptos" w:hAnsi="Aptos" w:cs="Aptos"/>
-                <w:color w:val="0A0A0A"/>
-                <w:kern w:val="0"/>
-                <w:sz w:val="17"/>
-                <w:szCs w:val="17"/>
-                <w:lang w:eastAsia="en-NZ"/>
-                <w14:ligatures w14:val="none"/>
-              </w:rPr>
-              <w:t xml:space="preserve"> → 12V_HK</w:t>
+              <w:t>Input prot → 12V_HK</w:t>
             </w:r>
           </w:p>
         </w:tc>
@@ -14831,7 +13149,6 @@
                 <w14:ligatures w14:val="none"/>
               </w:rPr>
             </w:pPr>
-            <w:proofErr w:type="spellStart"/>
             <w:r>
               <w:rPr>
                 <w:rFonts w:ascii="Aptos" w:eastAsia="Aptos" w:hAnsi="Aptos" w:cs="Aptos"/>
@@ -14842,20 +13159,7 @@
                 <w:lang w:eastAsia="en-NZ"/>
                 <w14:ligatures w14:val="none"/>
               </w:rPr>
-              <w:t>eFuse</w:t>
-            </w:r>
-            <w:proofErr w:type="spellEnd"/>
-            <w:r>
-              <w:rPr>
-                <w:rFonts w:ascii="Aptos" w:eastAsia="Aptos" w:hAnsi="Aptos" w:cs="Aptos"/>
-                <w:color w:val="0A0A0A"/>
-                <w:kern w:val="0"/>
-                <w:sz w:val="17"/>
-                <w:szCs w:val="17"/>
-                <w:lang w:eastAsia="en-NZ"/>
-                <w14:ligatures w14:val="none"/>
-              </w:rPr>
-              <w:t xml:space="preserve"> → 12V_PL</w:t>
+              <w:t>eFuse → 12V_PL</w:t>
             </w:r>
           </w:p>
         </w:tc>
@@ -16689,21 +14993,7 @@
               <w:rPr>
                 <w:lang w:eastAsia="en-NZ"/>
               </w:rPr>
-              <w:t>absent (</w:t>
-            </w:r>
-            <w:proofErr w:type="spellStart"/>
-            <w:r>
-              <w:rPr>
-                <w:lang w:eastAsia="en-NZ"/>
-              </w:rPr>
-              <w:t>unpop</w:t>
-            </w:r>
-            <w:proofErr w:type="spellEnd"/>
-            <w:r>
-              <w:rPr>
-                <w:lang w:eastAsia="en-NZ"/>
-              </w:rPr>
-              <w:t>), not blocking.</w:t>
+              <w:t>absent (unpop), not blocking.</w:t>
             </w:r>
           </w:p>
         </w:tc>
@@ -16783,21 +15073,7 @@
               <w:rPr>
                 <w:lang w:eastAsia="en-NZ"/>
               </w:rPr>
-              <w:t>absent (</w:t>
-            </w:r>
-            <w:proofErr w:type="spellStart"/>
-            <w:r>
-              <w:rPr>
-                <w:lang w:eastAsia="en-NZ"/>
-              </w:rPr>
-              <w:t>unpop</w:t>
-            </w:r>
-            <w:proofErr w:type="spellEnd"/>
-            <w:r>
-              <w:rPr>
-                <w:lang w:eastAsia="en-NZ"/>
-              </w:rPr>
-              <w:t xml:space="preserve">), </w:t>
+              <w:t xml:space="preserve">absent (unpop), </w:t>
             </w:r>
             <w:r>
               <w:rPr>
@@ -17081,21 +15357,7 @@
               <w:rPr>
                 <w:lang w:eastAsia="en-NZ"/>
               </w:rPr>
-              <w:t xml:space="preserve"> (</w:t>
-            </w:r>
-            <w:proofErr w:type="spellStart"/>
-            <w:r>
-              <w:rPr>
-                <w:lang w:eastAsia="en-NZ"/>
-              </w:rPr>
-              <w:t>unpop</w:t>
-            </w:r>
-            <w:proofErr w:type="spellEnd"/>
-            <w:r>
-              <w:rPr>
-                <w:lang w:eastAsia="en-NZ"/>
-              </w:rPr>
-              <w:t xml:space="preserve">). </w:t>
+              <w:t xml:space="preserve"> (unpop). </w:t>
             </w:r>
             <w:r>
               <w:rPr>
@@ -17315,21 +15577,7 @@
         <w:rPr>
           <w:lang w:eastAsia="en-NZ"/>
         </w:rPr>
-        <w:t xml:space="preserve">. Ben provided a USB adaptor that allows a PSU to control power into a USB cable. I will input 5V with hard current </w:t>
-      </w:r>
-      <w:proofErr w:type="gramStart"/>
-      <w:r>
-        <w:rPr>
-          <w:lang w:eastAsia="en-NZ"/>
-        </w:rPr>
-        <w:t>limit, and</w:t>
-      </w:r>
-      <w:proofErr w:type="gramEnd"/>
-      <w:r>
-        <w:rPr>
-          <w:lang w:eastAsia="en-NZ"/>
-        </w:rPr>
-        <w:t xml:space="preserve"> connect it to my PCB now. The LED should come on and the 3V3 LDO should regulate correctly. If this works, then the MCU can be flashed. </w:t>
+        <w:t xml:space="preserve">. Ben provided a USB adaptor that allows a PSU to control power into a USB cable. I will input 5V with hard current limit, and connect it to my PCB now. The LED should come on and the 3V3 LDO should regulate correctly. If this works, then the MCU can be flashed. </w:t>
       </w:r>
     </w:p>
     <w:p>
@@ -17608,86 +15856,12 @@
           <w:lang w:eastAsia="en-NZ"/>
         </w:rPr>
       </w:pPr>
-      <w:proofErr w:type="spellStart"/>
-      <w:r>
-        <w:rPr>
-          <w:lang w:eastAsia="en-NZ"/>
-        </w:rPr>
-        <w:t>Obv</w:t>
-      </w:r>
-      <w:proofErr w:type="spellEnd"/>
-      <w:r>
-        <w:rPr>
-          <w:lang w:eastAsia="en-NZ"/>
-        </w:rPr>
-        <w:t xml:space="preserve"> </w:t>
-      </w:r>
-      <w:proofErr w:type="spellStart"/>
-      <w:r>
-        <w:rPr>
-          <w:lang w:eastAsia="en-NZ"/>
-        </w:rPr>
-        <w:t>usb</w:t>
-      </w:r>
-      <w:proofErr w:type="spellEnd"/>
-      <w:r>
-        <w:rPr>
-          <w:lang w:eastAsia="en-NZ"/>
-        </w:rPr>
-        <w:t xml:space="preserve"> device not showing up on laptop </w:t>
-      </w:r>
-      <w:proofErr w:type="spellStart"/>
-      <w:r>
-        <w:rPr>
-          <w:lang w:eastAsia="en-NZ"/>
-        </w:rPr>
-        <w:t>bc</w:t>
-      </w:r>
-      <w:proofErr w:type="spellEnd"/>
-      <w:r>
-        <w:rPr>
-          <w:lang w:eastAsia="en-NZ"/>
-        </w:rPr>
-        <w:t xml:space="preserve"> </w:t>
-      </w:r>
-      <w:proofErr w:type="spellStart"/>
-      <w:r>
-        <w:rPr>
-          <w:lang w:eastAsia="en-NZ"/>
-        </w:rPr>
-        <w:t>dfu</w:t>
-      </w:r>
-      <w:proofErr w:type="spellEnd"/>
-      <w:r>
-        <w:rPr>
-          <w:lang w:eastAsia="en-NZ"/>
-        </w:rPr>
-        <w:t xml:space="preserve"> </w:t>
-      </w:r>
-      <w:proofErr w:type="spellStart"/>
-      <w:proofErr w:type="gramStart"/>
-      <w:r>
-        <w:rPr>
-          <w:lang w:eastAsia="en-NZ"/>
-        </w:rPr>
-        <w:t>cant</w:t>
-      </w:r>
-      <w:proofErr w:type="spellEnd"/>
-      <w:proofErr w:type="gramEnd"/>
-      <w:r>
-        <w:rPr>
-          <w:lang w:eastAsia="en-NZ"/>
-        </w:rPr>
-        <w:t xml:space="preserve"> start w external </w:t>
-      </w:r>
-      <w:proofErr w:type="spellStart"/>
-      <w:r>
-        <w:rPr>
-          <w:lang w:eastAsia="en-NZ"/>
-        </w:rPr>
-        <w:t>xtal</w:t>
-      </w:r>
-      <w:proofErr w:type="spellEnd"/>
+      <w:r>
+        <w:rPr>
+          <w:lang w:eastAsia="en-NZ"/>
+        </w:rPr>
+        <w:t>Obv usb device not showing up on laptop bc dfu cant start w external xtal</w:t>
+      </w:r>
     </w:p>
     <w:p>
       <w:pPr>
@@ -17766,169 +15940,67 @@
         <w:rPr>
           <w:lang w:eastAsia="en-NZ"/>
         </w:rPr>
-        <w:t xml:space="preserve">Only progress was updating </w:t>
-      </w:r>
-      <w:proofErr w:type="spellStart"/>
-      <w:r>
-        <w:rPr>
-          <w:lang w:eastAsia="en-NZ"/>
-        </w:rPr>
-        <w:t>stmcubeprog</w:t>
-      </w:r>
-      <w:proofErr w:type="spellEnd"/>
-      <w:r>
-        <w:rPr>
-          <w:lang w:eastAsia="en-NZ"/>
-        </w:rPr>
-        <w:t xml:space="preserve"> and then </w:t>
-      </w:r>
-      <w:proofErr w:type="spellStart"/>
-      <w:proofErr w:type="gramStart"/>
-      <w:r>
-        <w:rPr>
-          <w:lang w:eastAsia="en-NZ"/>
-        </w:rPr>
-        <w:t>its</w:t>
-      </w:r>
-      <w:proofErr w:type="spellEnd"/>
-      <w:proofErr w:type="gramEnd"/>
-      <w:r>
-        <w:rPr>
-          <w:lang w:eastAsia="en-NZ"/>
-        </w:rPr>
-        <w:t xml:space="preserve"> now able to see a target voltage of 3v3. Other note, the ‘missing’ components arrived so now I have all components I need for a fully populated board theoretically. </w:t>
-      </w:r>
-    </w:p>
-    <w:p>
-      <w:pPr>
-        <w:rPr>
-          <w:lang w:eastAsia="en-NZ"/>
-        </w:rPr>
-      </w:pPr>
-      <w:proofErr w:type="spellStart"/>
+        <w:t xml:space="preserve">Only progress was updating stmcubeprog and then its now able to see a target voltage of 3v3. Other note, the ‘missing’ components arrived so now I have all components I need for a fully populated board theoretically. </w:t>
+      </w:r>
+    </w:p>
+    <w:p>
+      <w:pPr>
+        <w:rPr>
+          <w:lang w:eastAsia="en-NZ"/>
+        </w:rPr>
+      </w:pPr>
       <w:r>
         <w:rPr>
           <w:lang w:eastAsia="en-NZ"/>
         </w:rPr>
         <w:lastRenderedPageBreak/>
-        <w:t>Usbc</w:t>
-      </w:r>
-      <w:proofErr w:type="spellEnd"/>
-      <w:r>
-        <w:rPr>
-          <w:lang w:eastAsia="en-NZ"/>
-        </w:rPr>
-        <w:t xml:space="preserve">: still not working. Tested the D+ and D- continuity, all is fine. My manual shorts are behaving exactly as they should. Tried pulling PA9 (68) high to 5v to see if that allowed it to enter a mode, that didn’t help. </w:t>
-      </w:r>
-    </w:p>
-    <w:p>
-      <w:pPr>
-        <w:rPr>
-          <w:lang w:eastAsia="en-NZ"/>
-        </w:rPr>
-      </w:pPr>
-      <w:r>
-        <w:rPr>
-          <w:lang w:eastAsia="en-NZ"/>
-        </w:rPr>
-        <w:t xml:space="preserve">SWD: Tried fixed, added 10k between SWDIO and 3v3, tried putting it in boot0 and not, tried playing w </w:t>
-      </w:r>
-      <w:proofErr w:type="spellStart"/>
-      <w:r>
-        <w:rPr>
-          <w:lang w:eastAsia="en-NZ"/>
-        </w:rPr>
-        <w:t>nrst</w:t>
-      </w:r>
-      <w:proofErr w:type="spellEnd"/>
-      <w:r>
-        <w:rPr>
-          <w:lang w:eastAsia="en-NZ"/>
-        </w:rPr>
-        <w:t xml:space="preserve"> as I pressed connect. </w:t>
-      </w:r>
-    </w:p>
-    <w:p>
-      <w:pPr>
-        <w:rPr>
-          <w:lang w:eastAsia="en-NZ"/>
-        </w:rPr>
-      </w:pPr>
-      <w:r>
-        <w:rPr>
-          <w:lang w:eastAsia="en-NZ"/>
-        </w:rPr>
-        <w:t xml:space="preserve">I scoped the IO and CLK pins while they were connected to the </w:t>
-      </w:r>
-      <w:proofErr w:type="spellStart"/>
-      <w:proofErr w:type="gramStart"/>
-      <w:r>
-        <w:rPr>
-          <w:lang w:eastAsia="en-NZ"/>
-        </w:rPr>
-        <w:t>pcb</w:t>
-      </w:r>
-      <w:proofErr w:type="spellEnd"/>
-      <w:r>
-        <w:rPr>
-          <w:lang w:eastAsia="en-NZ"/>
-        </w:rPr>
-        <w:t>, and</w:t>
-      </w:r>
-      <w:proofErr w:type="gramEnd"/>
-      <w:r>
-        <w:rPr>
-          <w:lang w:eastAsia="en-NZ"/>
-        </w:rPr>
-        <w:t xml:space="preserve"> saw perfect signals as I would expect. The clk was a normal looking square wave that was just one section of it. The IO was a normal 3v3 then a few sections of multiple pulses dragging the signal to 0. </w:t>
-      </w:r>
-    </w:p>
-    <w:p>
-      <w:pPr>
-        <w:rPr>
-          <w:lang w:eastAsia="en-NZ"/>
-        </w:rPr>
-      </w:pPr>
-    </w:p>
-    <w:p>
-      <w:pPr>
-        <w:rPr>
-          <w:lang w:eastAsia="en-NZ"/>
-        </w:rPr>
-      </w:pPr>
-      <w:r>
-        <w:rPr>
-          <w:lang w:eastAsia="en-NZ"/>
-        </w:rPr>
-        <w:t xml:space="preserve">Next step: something is wrong. I am going to make </w:t>
-      </w:r>
-      <w:proofErr w:type="gramStart"/>
-      <w:r>
-        <w:rPr>
-          <w:lang w:eastAsia="en-NZ"/>
-        </w:rPr>
-        <w:t>a</w:t>
-      </w:r>
-      <w:proofErr w:type="gramEnd"/>
-      <w:r>
-        <w:rPr>
-          <w:lang w:eastAsia="en-NZ"/>
-        </w:rPr>
-        <w:t xml:space="preserve"> MVP just to see if my boards </w:t>
-      </w:r>
-      <w:proofErr w:type="spellStart"/>
-      <w:r>
-        <w:rPr>
-          <w:lang w:eastAsia="en-NZ"/>
-        </w:rPr>
-        <w:t>mcu</w:t>
-      </w:r>
-      <w:proofErr w:type="spellEnd"/>
-      <w:r>
-        <w:rPr>
-          <w:lang w:eastAsia="en-NZ"/>
-        </w:rPr>
-        <w:t xml:space="preserve"> is ever able to enter boot mode or be flashed in any way. </w:t>
+        <w:t xml:space="preserve">Usbc: still not working. Tested the D+ and D- continuity, all is fine. My manual shorts are behaving exactly as they should. Tried pulling PA9 (68) high to 5v to see if that allowed it to enter a mode, that didn’t help. </w:t>
+      </w:r>
+    </w:p>
+    <w:p>
+      <w:pPr>
+        <w:rPr>
+          <w:lang w:eastAsia="en-NZ"/>
+        </w:rPr>
+      </w:pPr>
+      <w:r>
+        <w:rPr>
+          <w:lang w:eastAsia="en-NZ"/>
+        </w:rPr>
+        <w:t xml:space="preserve">SWD: Tried fixed, added 10k between SWDIO and 3v3, tried putting it in boot0 and not, tried playing w nrst as I pressed connect. </w:t>
+      </w:r>
+    </w:p>
+    <w:p>
+      <w:pPr>
+        <w:rPr>
+          <w:lang w:eastAsia="en-NZ"/>
+        </w:rPr>
+      </w:pPr>
+      <w:r>
+        <w:rPr>
+          <w:lang w:eastAsia="en-NZ"/>
+        </w:rPr>
+        <w:t xml:space="preserve">I scoped the IO and CLK pins while they were connected to the pcb, and saw perfect signals as I would expect. The clk was a normal looking square wave that was just one section of it. The IO was a normal 3v3 then a few sections of multiple pulses dragging the signal to 0. </w:t>
+      </w:r>
+    </w:p>
+    <w:p>
+      <w:pPr>
+        <w:rPr>
+          <w:lang w:eastAsia="en-NZ"/>
+        </w:rPr>
+      </w:pPr>
+    </w:p>
+    <w:p>
+      <w:pPr>
+        <w:rPr>
+          <w:lang w:eastAsia="en-NZ"/>
+        </w:rPr>
+      </w:pPr>
+      <w:r>
+        <w:rPr>
+          <w:lang w:eastAsia="en-NZ"/>
+        </w:rPr>
+        <w:t xml:space="preserve">Next step: something is wrong. I am going to make a MVP just to see if my boards mcu is ever able to enter boot mode or be flashed in any way. </w:t>
       </w:r>
     </w:p>
     <w:p>
@@ -17985,21 +16057,7 @@
         <w:rPr>
           <w:lang w:eastAsia="en-NZ"/>
         </w:rPr>
-        <w:t xml:space="preserve"> and its decoupling: C89–C95 (the VDD 100 </w:t>
-      </w:r>
-      <w:proofErr w:type="spellStart"/>
-      <w:r>
-        <w:rPr>
-          <w:lang w:eastAsia="en-NZ"/>
-        </w:rPr>
-        <w:t>nF's</w:t>
-      </w:r>
-      <w:proofErr w:type="spellEnd"/>
-      <w:r>
-        <w:rPr>
-          <w:lang w:eastAsia="en-NZ"/>
-        </w:rPr>
-        <w:t xml:space="preserve"> + bulk), plus C99/C98 on VDDA/VREF+.</w:t>
+        <w:t xml:space="preserve"> and its decoupling: C89–C95 (the VDD 100 nF's + bulk), plus C99/C98 on VDDA/VREF+.</w:t>
       </w:r>
     </w:p>
     <w:p>
@@ -18037,7 +16095,6 @@
           <w:lang w:eastAsia="en-NZ"/>
         </w:rPr>
       </w:pPr>
-      <w:proofErr w:type="spellStart"/>
       <w:r>
         <w:rPr>
           <w:b/>
@@ -18046,26 +16103,11 @@
         </w:rPr>
         <w:t>nRST</w:t>
       </w:r>
-      <w:proofErr w:type="spellEnd"/>
-      <w:r>
-        <w:rPr>
-          <w:lang w:eastAsia="en-NZ"/>
-        </w:rPr>
-        <w:t xml:space="preserve">: C63, and SW1 or just a pull-up — </w:t>
-      </w:r>
-      <w:proofErr w:type="spellStart"/>
-      <w:r>
-        <w:rPr>
-          <w:lang w:eastAsia="en-NZ"/>
-        </w:rPr>
-        <w:t>nRST</w:t>
-      </w:r>
-      <w:proofErr w:type="spellEnd"/>
-      <w:r>
-        <w:rPr>
-          <w:lang w:eastAsia="en-NZ"/>
-        </w:rPr>
-        <w:t xml:space="preserve"> must idle at 3.3 V.</w:t>
+      <w:r>
+        <w:rPr>
+          <w:lang w:eastAsia="en-NZ"/>
+        </w:rPr>
+        <w:t>: C63, and SW1 or just a pull-up — nRST must idle at 3.3 V.</w:t>
       </w:r>
     </w:p>
     <w:p>
@@ -18174,21 +16216,7 @@
         <w:rPr>
           <w:lang w:eastAsia="en-NZ"/>
         </w:rPr>
-        <w:t xml:space="preserve"> need the USB-C path, the LDO, the mux, or any of the power tree. SWD flashing needs nothing but VDD, GND, VCAP caps, </w:t>
-      </w:r>
-      <w:proofErr w:type="spellStart"/>
-      <w:r>
-        <w:rPr>
-          <w:lang w:eastAsia="en-NZ"/>
-        </w:rPr>
-        <w:t>nRST</w:t>
-      </w:r>
-      <w:proofErr w:type="spellEnd"/>
-      <w:r>
-        <w:rPr>
-          <w:lang w:eastAsia="en-NZ"/>
-        </w:rPr>
-        <w:t xml:space="preserve"> high, BOOT0 low, and the four SWD wires.</w:t>
+        <w:t xml:space="preserve"> need the USB-C path, the LDO, the mux, or any of the power tree. SWD flashing needs nothing but VDD, GND, VCAP caps, nRST high, BOOT0 low, and the four SWD wires.</w:t>
       </w:r>
     </w:p>
     <w:p>
@@ -18270,74 +16298,24 @@
         </w:rPr>
         <w:t xml:space="preserve">Louis checked w known good </w:t>
       </w:r>
-      <w:proofErr w:type="spellStart"/>
-      <w:r>
-        <w:rPr>
-          <w:lang w:eastAsia="en-NZ"/>
-        </w:rPr>
-        <w:t>mcu</w:t>
-      </w:r>
-      <w:proofErr w:type="spellEnd"/>
-      <w:r>
-        <w:rPr>
-          <w:lang w:eastAsia="en-NZ"/>
-        </w:rPr>
-        <w:t xml:space="preserve"> and the </w:t>
-      </w:r>
-      <w:proofErr w:type="spellStart"/>
-      <w:r>
-        <w:rPr>
-          <w:lang w:eastAsia="en-NZ"/>
-        </w:rPr>
-        <w:t>STLink</w:t>
-      </w:r>
-      <w:proofErr w:type="spellEnd"/>
-      <w:r>
-        <w:rPr>
-          <w:lang w:eastAsia="en-NZ"/>
-        </w:rPr>
-        <w:t xml:space="preserve"> we bought from </w:t>
-      </w:r>
-      <w:proofErr w:type="spellStart"/>
-      <w:r>
-        <w:rPr>
-          <w:lang w:eastAsia="en-NZ"/>
-        </w:rPr>
-        <w:t>digikey</w:t>
-      </w:r>
-      <w:proofErr w:type="spellEnd"/>
-      <w:r>
-        <w:rPr>
-          <w:lang w:eastAsia="en-NZ"/>
-        </w:rPr>
-        <w:t xml:space="preserve"> does not work. </w:t>
-      </w:r>
-    </w:p>
-    <w:p>
-      <w:pPr>
-        <w:rPr>
-          <w:lang w:eastAsia="en-NZ"/>
-        </w:rPr>
-      </w:pPr>
-      <w:r>
-        <w:rPr>
-          <w:lang w:eastAsia="en-NZ"/>
-        </w:rPr>
-        <w:t xml:space="preserve">IMO flashing through DFU should work. My RL </w:t>
-      </w:r>
-      <w:proofErr w:type="spellStart"/>
-      <w:r>
-        <w:rPr>
-          <w:lang w:eastAsia="en-NZ"/>
-        </w:rPr>
-        <w:t>pcb</w:t>
-      </w:r>
-      <w:proofErr w:type="spellEnd"/>
-      <w:r>
-        <w:rPr>
-          <w:lang w:eastAsia="en-NZ"/>
-        </w:rPr>
-        <w:t xml:space="preserve"> I designed works perfectly ONLY through DFU. I am going to add DFU capability to the MVP board. </w:t>
+      <w:r>
+        <w:rPr>
+          <w:lang w:eastAsia="en-NZ"/>
+        </w:rPr>
+        <w:t xml:space="preserve">mcu and the STLink we bought from digikey does not work. </w:t>
+      </w:r>
+    </w:p>
+    <w:p>
+      <w:pPr>
+        <w:rPr>
+          <w:lang w:eastAsia="en-NZ"/>
+        </w:rPr>
+      </w:pPr>
+      <w:r>
+        <w:rPr>
+          <w:lang w:eastAsia="en-NZ"/>
+        </w:rPr>
+        <w:t xml:space="preserve">IMO flashing through DFU should work. My RL pcb I designed works perfectly ONLY through DFU. I am going to add DFU capability to the MVP board. </w:t>
       </w:r>
     </w:p>
     <w:p>
@@ -18394,7 +16372,6 @@
           <w:lang w:eastAsia="en-NZ"/>
         </w:rPr>
       </w:pPr>
-      <w:proofErr w:type="gramStart"/>
       <w:r>
         <w:rPr>
           <w:b/>
@@ -18402,17 +16379,7 @@
           <w:strike/>
           <w:lang w:eastAsia="en-NZ"/>
         </w:rPr>
-        <w:t>Both VCAP</w:t>
-      </w:r>
-      <w:proofErr w:type="gramEnd"/>
-      <w:r>
-        <w:rPr>
-          <w:b/>
-          <w:bCs/>
-          <w:strike/>
-          <w:lang w:eastAsia="en-NZ"/>
-        </w:rPr>
-        <w:t xml:space="preserve"> caps</w:t>
+        <w:t>Both VCAP caps</w:t>
       </w:r>
       <w:r>
         <w:rPr>
@@ -18433,7 +16400,6 @@
           <w:lang w:eastAsia="en-NZ"/>
         </w:rPr>
       </w:pPr>
-      <w:proofErr w:type="spellStart"/>
       <w:r>
         <w:rPr>
           <w:b/>
@@ -18443,7 +16409,6 @@
         </w:rPr>
         <w:t>nRST</w:t>
       </w:r>
-      <w:proofErr w:type="spellEnd"/>
       <w:r>
         <w:rPr>
           <w:strike/>
@@ -18458,50 +16423,14 @@
           <w:strike/>
           <w:lang w:eastAsia="en-NZ"/>
         </w:rPr>
-        <w:t xml:space="preserve">plus a 10 </w:t>
-      </w:r>
-      <w:proofErr w:type="spellStart"/>
-      <w:r>
-        <w:rPr>
-          <w:b/>
-          <w:bCs/>
+        <w:t>plus a 10 kΩ pull-up to 3V3</w:t>
+      </w:r>
+      <w:r>
+        <w:rPr>
           <w:strike/>
           <w:lang w:eastAsia="en-NZ"/>
         </w:rPr>
-        <w:t>kΩ</w:t>
-      </w:r>
-      <w:proofErr w:type="spellEnd"/>
-      <w:r>
-        <w:rPr>
-          <w:b/>
-          <w:bCs/>
-          <w:strike/>
-          <w:lang w:eastAsia="en-NZ"/>
-        </w:rPr>
-        <w:t xml:space="preserve"> pull-up to 3V3</w:t>
-      </w:r>
-      <w:r>
-        <w:rPr>
-          <w:strike/>
-          <w:lang w:eastAsia="en-NZ"/>
-        </w:rPr>
-        <w:t xml:space="preserve"> — you just proved this was missing and pulling the chip into reset. Even for DFU, if </w:t>
-      </w:r>
-      <w:proofErr w:type="spellStart"/>
-      <w:r>
-        <w:rPr>
-          <w:strike/>
-          <w:lang w:eastAsia="en-NZ"/>
-        </w:rPr>
-        <w:t>nRST</w:t>
-      </w:r>
-      <w:proofErr w:type="spellEnd"/>
-      <w:r>
-        <w:rPr>
-          <w:strike/>
-          <w:lang w:eastAsia="en-NZ"/>
-        </w:rPr>
-        <w:t xml:space="preserve"> is held low the bootloader never runs. This is mandatory now.</w:t>
+        <w:t xml:space="preserve"> — you just proved this was missing and pulling the chip into reset. Even for DFU, if nRST is held low the bootloader never runs. This is mandatory now.</w:t>
       </w:r>
     </w:p>
     <w:p>
@@ -18598,21 +16527,7 @@
         <w:rPr>
           <w:lang w:eastAsia="en-NZ"/>
         </w:rPr>
-        <w:t xml:space="preserve">: R1/R4 (5.1 </w:t>
-      </w:r>
-      <w:proofErr w:type="spellStart"/>
-      <w:r>
-        <w:rPr>
-          <w:lang w:eastAsia="en-NZ"/>
-        </w:rPr>
-        <w:t>kΩ</w:t>
-      </w:r>
-      <w:proofErr w:type="spellEnd"/>
-      <w:r>
-        <w:rPr>
-          <w:lang w:eastAsia="en-NZ"/>
-        </w:rPr>
-        <w:t>) on the USB-C CC lines — without these a Type-C host won't even apply VBUS.</w:t>
+        <w:t>: R1/R4 (5.1 kΩ) on the USB-C CC lines — without these a Type-C host won't even apply VBUS.</w:t>
       </w:r>
     </w:p>
     <w:p>
@@ -18757,200 +16672,397 @@
         <w:rPr>
           <w:lang w:eastAsia="en-NZ"/>
         </w:rPr>
-        <w:t xml:space="preserve">Populated another </w:t>
-      </w:r>
+        <w:t xml:space="preserve">Populated another pcb just with ONLY the usb-c connections. But still nort working. Im going to cut open a usb-c cable and probe all to see if my connection is even good. Then probe EVERYTING, between all possible pins. </w:t>
+      </w:r>
+    </w:p>
+    <w:p>
+      <w:pPr>
+        <w:rPr>
+          <w:lang w:eastAsia="en-NZ"/>
+        </w:rPr>
+      </w:pPr>
+    </w:p>
+    <w:p>
+      <w:pPr>
+        <w:rPr>
+          <w:lang w:eastAsia="en-NZ"/>
+        </w:rPr>
+      </w:pPr>
+    </w:p>
+    <w:p>
+      <w:pPr>
+        <w:rPr>
+          <w:lang w:eastAsia="en-NZ"/>
+        </w:rPr>
+      </w:pPr>
+      <w:r>
+        <w:rPr>
+          <w:lang w:eastAsia="en-NZ"/>
+        </w:rPr>
+        <w:t>17-SEP-26. KP. UNI</w:t>
+      </w:r>
+    </w:p>
+    <w:p>
+      <w:pPr>
+        <w:rPr>
+          <w:lang w:eastAsia="en-NZ"/>
+        </w:rPr>
+      </w:pPr>
+      <w:r>
+        <w:rPr>
+          <w:lang w:eastAsia="en-NZ"/>
+        </w:rPr>
+        <w:t xml:space="preserve">MVP MCU resoldered as SWD actually didn’t have continuity. So that’s fixed now. </w:t>
+      </w:r>
+    </w:p>
+    <w:p>
+      <w:pPr>
+        <w:rPr>
+          <w:lang w:eastAsia="en-NZ"/>
+        </w:rPr>
+      </w:pPr>
+      <w:r>
+        <w:rPr>
+          <w:lang w:eastAsia="en-NZ"/>
+        </w:rPr>
+        <w:t xml:space="preserve">Testing on MVP </w:t>
+      </w:r>
+    </w:p>
+    <w:p>
+      <w:pPr>
+        <w:rPr>
+          <w:lang w:eastAsia="en-NZ"/>
+        </w:rPr>
+      </w:pPr>
+    </w:p>
+    <w:p>
+      <w:pPr>
+        <w:rPr>
+          <w:lang w:eastAsia="en-NZ"/>
+        </w:rPr>
+      </w:pPr>
+    </w:p>
+    <w:p>
+      <w:pPr>
+        <w:rPr>
+          <w:lang w:eastAsia="en-NZ"/>
+        </w:rPr>
+      </w:pPr>
+      <w:r>
+        <w:rPr>
+          <w:lang w:eastAsia="en-NZ"/>
+        </w:rPr>
+        <w:t>19-SEP-26. KP. RL</w:t>
+      </w:r>
+    </w:p>
+    <w:p>
+      <w:pPr>
+        <w:rPr>
+          <w:lang w:eastAsia="en-NZ"/>
+        </w:rPr>
+      </w:pPr>
+      <w:r>
+        <w:rPr>
+          <w:lang w:eastAsia="en-NZ"/>
+        </w:rPr>
+        <w:t xml:space="preserve">Mcu works so continuing checklist now. Have all components </w:t>
+      </w:r>
+    </w:p>
+    <w:p>
+      <w:pPr>
+        <w:rPr>
+          <w:lang w:eastAsia="en-NZ"/>
+        </w:rPr>
+      </w:pPr>
+      <w:r>
+        <w:rPr>
+          <w:lang w:eastAsia="en-NZ"/>
+        </w:rPr>
+        <w:t xml:space="preserve">Soldered the whole board. Power selector not selecting usb-c correctly… will debug now. </w:t>
+      </w:r>
+    </w:p>
+    <w:p>
+      <w:pPr>
+        <w:rPr>
+          <w:lang w:eastAsia="en-NZ"/>
+        </w:rPr>
+      </w:pPr>
+      <w:r>
+        <w:rPr>
+          <w:lang w:eastAsia="en-NZ"/>
+        </w:rPr>
+        <w:t>Power selector circuit is wrong. The PMOSs polarity is the wrong way. I attempted to solder them on an angle so 2 legs were direct at the pads then white-wired the 3</w:t>
+      </w:r>
+      <w:r>
+        <w:rPr>
+          <w:vertAlign w:val="superscript"/>
+          <w:lang w:eastAsia="en-NZ"/>
+        </w:rPr>
+        <w:t>rd</w:t>
+      </w:r>
+      <w:r>
+        <w:rPr>
+          <w:lang w:eastAsia="en-NZ"/>
+        </w:rPr>
+        <w:t xml:space="preserve"> leg to the correct pad, but this didn’t work (got 0V @ +3V3_MCU, and the +12V LED was dimly on, and I think the +1V2 LED was on. So that clearly wasn’t correct. I think that I might have accidentally shorted something wrong when I added the white wires, not too sure. </w:t>
+      </w:r>
+    </w:p>
+    <w:p>
+      <w:pPr>
+        <w:rPr>
+          <w:lang w:eastAsia="en-NZ"/>
+        </w:rPr>
+      </w:pPr>
+      <w:r>
+        <w:rPr>
+          <w:lang w:eastAsia="en-NZ"/>
+        </w:rPr>
+        <w:t xml:space="preserve">For now I just removed the 2x PMOS, and shorted the +3V3_USB to +3V3_MCU, and I managed to flash the basic Test LED firmware through DFU successfully. </w:t>
+      </w:r>
+    </w:p>
+    <w:p>
+      <w:pPr>
+        <w:rPr>
+          <w:lang w:eastAsia="en-NZ"/>
+        </w:rPr>
+      </w:pPr>
+    </w:p>
+    <w:p>
+      <w:pPr>
+        <w:rPr>
+          <w:lang w:eastAsia="en-NZ"/>
+        </w:rPr>
+      </w:pPr>
+      <w:r>
+        <w:rPr>
+          <w:lang w:eastAsia="en-NZ"/>
+        </w:rPr>
+        <w:t xml:space="preserve">The eFuse is also not working rn. </w:t>
+      </w:r>
+    </w:p>
+    <w:p>
+      <w:pPr>
+        <w:rPr>
+          <w:lang w:eastAsia="en-NZ"/>
+        </w:rPr>
+      </w:pPr>
+      <w:r>
+        <w:rPr>
+          <w:lang w:eastAsia="en-NZ"/>
+        </w:rPr>
+        <w:t>Debug steps:</w:t>
+      </w:r>
+    </w:p>
+    <w:p>
+      <w:pPr>
+        <w:pStyle w:val="ListParagraph"/>
+        <w:numPr>
+          <w:ilvl w:val="0"/>
+          <w:numId w:val="3"/>
+        </w:numPr>
+        <w:rPr>
+          <w:lang w:eastAsia="en-NZ"/>
+        </w:rPr>
+      </w:pPr>
+      <w:r>
+        <w:rPr>
+          <w:lang w:eastAsia="en-NZ"/>
+        </w:rPr>
+        <w:t>Ensure polarity correct</w:t>
+      </w:r>
+    </w:p>
+    <w:p>
+      <w:pPr>
+        <w:pStyle w:val="ListParagraph"/>
+        <w:numPr>
+          <w:ilvl w:val="0"/>
+          <w:numId w:val="3"/>
+        </w:numPr>
+        <w:rPr>
+          <w:lang w:eastAsia="en-NZ"/>
+        </w:rPr>
+      </w:pPr>
+      <w:r>
+        <w:rPr>
+          <w:lang w:eastAsia="en-NZ"/>
+        </w:rPr>
+        <w:t>Measure EN_UVLO (pin 2) to GND</w:t>
+      </w:r>
+      <w:r>
+        <w:rPr>
+          <w:lang w:eastAsia="en-NZ"/>
+        </w:rPr>
+        <w:t xml:space="preserve">. Expect 1V2. </w:t>
+      </w:r>
+    </w:p>
+    <w:p>
+      <w:pPr>
+        <w:pStyle w:val="ListParagraph"/>
+        <w:numPr>
+          <w:ilvl w:val="0"/>
+          <w:numId w:val="3"/>
+        </w:numPr>
+        <w:rPr>
+          <w:lang w:eastAsia="en-NZ"/>
+        </w:rPr>
+      </w:pPr>
+      <w:r>
+        <w:rPr>
+          <w:lang w:eastAsia="en-NZ"/>
+        </w:rPr>
+        <w:t>Confirm IN actually reaches the chip. Probe pins 3 and 4 directly on the IC lead</w:t>
+      </w:r>
+      <w:r>
+        <w:rPr>
+          <w:lang w:eastAsia="en-NZ"/>
+        </w:rPr>
+        <w:t>.</w:t>
+      </w:r>
+    </w:p>
+    <w:p>
+      <w:pPr>
+        <w:pStyle w:val="ListParagraph"/>
+        <w:numPr>
+          <w:ilvl w:val="0"/>
+          <w:numId w:val="3"/>
+        </w:numPr>
+        <w:rPr>
+          <w:lang w:eastAsia="en-NZ"/>
+        </w:rPr>
+      </w:pPr>
+      <w:r>
+        <w:rPr>
+          <w:lang w:eastAsia="en-NZ"/>
+        </w:rPr>
+        <w:t>Read FLT_N (pin 6).</w:t>
+      </w:r>
+      <w:r>
+        <w:rPr>
+          <w:lang w:eastAsia="en-NZ"/>
+        </w:rPr>
+        <w:t xml:space="preserve"> Should be 3V3 (no fault).</w:t>
+      </w:r>
+    </w:p>
+    <w:p>
+      <w:pPr>
+        <w:rPr>
+          <w:lang w:eastAsia="en-NZ"/>
+        </w:rPr>
+      </w:pPr>
+    </w:p>
+    <w:p>
+      <w:pPr>
+        <w:rPr>
+          <w:lang w:eastAsia="en-NZ"/>
+        </w:rPr>
+      </w:pPr>
       <w:proofErr w:type="spellStart"/>
       <w:r>
         <w:rPr>
           <w:lang w:eastAsia="en-NZ"/>
         </w:rPr>
-        <w:t>pcb</w:t>
+        <w:lastRenderedPageBreak/>
+        <w:t>Its</w:t>
       </w:r>
       <w:proofErr w:type="spellEnd"/>
       <w:r>
         <w:rPr>
           <w:lang w:eastAsia="en-NZ"/>
         </w:rPr>
-        <w:t xml:space="preserve"> just with ONLY the </w:t>
+        <w:t xml:space="preserve"> working. All good. I think the issue was that my diode was the wrong way lol. Fixed now. </w:t>
+      </w:r>
+    </w:p>
+    <w:p>
+      <w:pPr>
+        <w:rPr>
+          <w:lang w:eastAsia="en-NZ"/>
+        </w:rPr>
+      </w:pPr>
+      <w:r>
+        <w:rPr>
+          <w:lang w:eastAsia="en-NZ"/>
+        </w:rPr>
+        <w:t xml:space="preserve">Got </w:t>
       </w:r>
       <w:proofErr w:type="spellStart"/>
       <w:r>
         <w:rPr>
           <w:lang w:eastAsia="en-NZ"/>
         </w:rPr>
-        <w:t>usb</w:t>
+        <w:t>claude</w:t>
       </w:r>
       <w:proofErr w:type="spellEnd"/>
       <w:r>
         <w:rPr>
           <w:lang w:eastAsia="en-NZ"/>
         </w:rPr>
-        <w:t xml:space="preserve">-c connections. But still </w:t>
+        <w:t xml:space="preserve"> to write me a basic .elf to enable the 3v3 and 5v PL. this worked, both rails were up!</w:t>
+      </w:r>
+    </w:p>
+    <w:p>
+      <w:pPr>
+        <w:rPr>
+          <w:lang w:eastAsia="en-NZ"/>
+        </w:rPr>
+      </w:pPr>
+    </w:p>
+    <w:p>
+      <w:pPr>
+        <w:rPr>
+          <w:b/>
+          <w:bCs/>
+          <w:lang w:eastAsia="en-NZ"/>
+        </w:rPr>
+      </w:pPr>
+      <w:r>
+        <w:rPr>
+          <w:b/>
+          <w:bCs/>
+          <w:lang w:eastAsia="en-NZ"/>
+        </w:rPr>
+        <w:t>20-SEP-26. KP. UNI</w:t>
+      </w:r>
+    </w:p>
+    <w:p>
+      <w:pPr>
+        <w:rPr>
+          <w:lang w:eastAsia="en-NZ"/>
+        </w:rPr>
+      </w:pPr>
+      <w:r>
+        <w:rPr>
+          <w:lang w:eastAsia="en-NZ"/>
+        </w:rPr>
+        <w:t xml:space="preserve">Tried turning </w:t>
       </w:r>
       <w:proofErr w:type="spellStart"/>
       <w:r>
         <w:rPr>
           <w:lang w:eastAsia="en-NZ"/>
         </w:rPr>
-        <w:t>nort</w:t>
+        <w:t>vari</w:t>
       </w:r>
       <w:proofErr w:type="spellEnd"/>
       <w:r>
         <w:rPr>
           <w:lang w:eastAsia="en-NZ"/>
         </w:rPr>
-        <w:t xml:space="preserve"> working. </w:t>
+        <w:t xml:space="preserve"> on, didn’t work. I added more solder to the pads with an iron (very hard to access, would have been easier with a heat gun), then also changed out the 22uF (which are only rated to 10V) with 10uF (rated to 25V). This allows safe testing of above 10V. We tested up to 9V (the </w:t>
       </w:r>
       <w:proofErr w:type="spellStart"/>
       <w:r>
         <w:rPr>
           <w:lang w:eastAsia="en-NZ"/>
         </w:rPr>
-        <w:t>Im</w:t>
+        <w:t>prev</w:t>
       </w:r>
       <w:proofErr w:type="spellEnd"/>
       <w:r>
         <w:rPr>
           <w:lang w:eastAsia="en-NZ"/>
         </w:rPr>
-        <w:t xml:space="preserve"> going to cut open a </w:t>
-      </w:r>
-      <w:proofErr w:type="spellStart"/>
-      <w:r>
-        <w:rPr>
-          <w:lang w:eastAsia="en-NZ"/>
-        </w:rPr>
-        <w:t>usb</w:t>
-      </w:r>
-      <w:proofErr w:type="spellEnd"/>
-      <w:r>
-        <w:rPr>
-          <w:lang w:eastAsia="en-NZ"/>
-        </w:rPr>
-        <w:t xml:space="preserve">-c cable and probe all to see if my connection is even good. Then probe EVERYTING, between all possible pins. </w:t>
-      </w:r>
-    </w:p>
-    <w:p>
-      <w:pPr>
-        <w:rPr>
-          <w:lang w:eastAsia="en-NZ"/>
-        </w:rPr>
-      </w:pPr>
-    </w:p>
-    <w:p>
-      <w:pPr>
-        <w:rPr>
-          <w:lang w:eastAsia="en-NZ"/>
-        </w:rPr>
-      </w:pPr>
-    </w:p>
-    <w:p>
-      <w:pPr>
-        <w:rPr>
-          <w:lang w:eastAsia="en-NZ"/>
-        </w:rPr>
-      </w:pPr>
-      <w:r>
-        <w:rPr>
-          <w:lang w:eastAsia="en-NZ"/>
-        </w:rPr>
-        <w:t>17-SEP-26. KP. UNI</w:t>
-      </w:r>
-    </w:p>
-    <w:p>
-      <w:pPr>
-        <w:rPr>
-          <w:lang w:eastAsia="en-NZ"/>
-        </w:rPr>
-      </w:pPr>
-      <w:r>
-        <w:rPr>
-          <w:lang w:eastAsia="en-NZ"/>
-        </w:rPr>
-        <w:t xml:space="preserve">MVP MCU resoldered as SWD </w:t>
-      </w:r>
-      <w:proofErr w:type="gramStart"/>
-      <w:r>
-        <w:rPr>
-          <w:lang w:eastAsia="en-NZ"/>
-        </w:rPr>
-        <w:t>actually didn’t</w:t>
-      </w:r>
-      <w:proofErr w:type="gramEnd"/>
-      <w:r>
-        <w:rPr>
-          <w:lang w:eastAsia="en-NZ"/>
-        </w:rPr>
-        <w:t xml:space="preserve"> have continuity. So that’s fixed now. </w:t>
-      </w:r>
-    </w:p>
-    <w:p>
-      <w:pPr>
-        <w:rPr>
-          <w:lang w:eastAsia="en-NZ"/>
-        </w:rPr>
-      </w:pPr>
-      <w:r>
-        <w:rPr>
-          <w:lang w:eastAsia="en-NZ"/>
-        </w:rPr>
-        <w:t xml:space="preserve">Testing on MVP </w:t>
-      </w:r>
-    </w:p>
-    <w:p>
-      <w:pPr>
-        <w:rPr>
-          <w:lang w:eastAsia="en-NZ"/>
-        </w:rPr>
-      </w:pPr>
-    </w:p>
-    <w:p>
-      <w:pPr>
-        <w:rPr>
-          <w:lang w:eastAsia="en-NZ"/>
-        </w:rPr>
-      </w:pPr>
-    </w:p>
-    <w:p>
-      <w:pPr>
-        <w:rPr>
-          <w:lang w:eastAsia="en-NZ"/>
-        </w:rPr>
-      </w:pPr>
-      <w:r>
-        <w:rPr>
-          <w:lang w:eastAsia="en-NZ"/>
-        </w:rPr>
-        <w:t>19-SEP-26. KP. RL</w:t>
-      </w:r>
-    </w:p>
-    <w:p>
-      <w:pPr>
-        <w:rPr>
-          <w:lang w:eastAsia="en-NZ"/>
-        </w:rPr>
-      </w:pPr>
-      <w:proofErr w:type="spellStart"/>
-      <w:r>
-        <w:rPr>
-          <w:lang w:eastAsia="en-NZ"/>
-        </w:rPr>
-        <w:t>Mcu</w:t>
-      </w:r>
-      <w:proofErr w:type="spellEnd"/>
-      <w:r>
-        <w:rPr>
-          <w:lang w:eastAsia="en-NZ"/>
-        </w:rPr>
-        <w:t xml:space="preserve"> works so continuing checklist now. Have all components </w:t>
-      </w:r>
-    </w:p>
-    <w:p>
-      <w:pPr>
-        <w:rPr>
-          <w:lang w:eastAsia="en-NZ"/>
-        </w:rPr>
-      </w:pPr>
+        <w:t xml:space="preserve"> SW limit), and it worked perfectly, and was precise. </w:t>
+      </w:r>
     </w:p>
     <w:sectPr>
       <w:pgSz w:w="11906" w:h="16838"/>

</xml_diff>